<commit_message>
Replace the Japanese report with the version exported from Word
Co-Authored-By: Claude Opus 5.5 <noreply@anthropic.com>
Claude-Session: https://claude.ai/code/session_01QAvsxqboMKk7XNpEjcFqWK
</commit_message>
<xml_diff>
--- a/docs/report/KumaWatch_Patrol_final_report.docx
+++ b/docs/report/KumaWatch_Patrol_final_report.docx
@@ -8,7 +8,7 @@
       </w:pPr>
       <w:r>
         <w:rPr>
-          <w:rFonts w:ascii="Arial" w:eastAsia="游ゴシック" w:hAnsi="Arial"/>
+          <w:rFonts w:ascii="Arial" w:eastAsia="Yu Gothic" w:hAnsi="Arial"/>
           <w:color w:val="5B6570"/>
           <w:sz w:val="16"/>
           <w:szCs w:val="16"/>
@@ -17,7 +17,7 @@
       </w:r>
       <w:r>
         <w:rPr>
-          <w:rFonts w:ascii="Arial" w:eastAsia="游ゴシック" w:hAnsi="Arial"/>
+          <w:rFonts w:ascii="Arial" w:eastAsia="Yu Gothic" w:hAnsi="Arial"/>
           <w:color w:val="5B6570"/>
           <w:sz w:val="16"/>
           <w:szCs w:val="16"/>
@@ -26,7 +26,7 @@
       </w:r>
       <w:r>
         <w:rPr>
-          <w:rFonts w:ascii="Arial" w:eastAsia="游ゴシック" w:hAnsi="Arial"/>
+          <w:rFonts w:ascii="Arial" w:eastAsia="Yu Gothic" w:hAnsi="Arial"/>
           <w:color w:val="5B6570"/>
           <w:sz w:val="16"/>
           <w:szCs w:val="16"/>
@@ -35,7 +35,7 @@
       </w:r>
       <w:r>
         <w:rPr>
-          <w:rFonts w:ascii="Arial" w:eastAsia="游ゴシック" w:hAnsi="Arial"/>
+          <w:rFonts w:ascii="Arial" w:eastAsia="Yu Gothic" w:hAnsi="Arial"/>
           <w:color w:val="5B6570"/>
           <w:sz w:val="16"/>
           <w:szCs w:val="16"/>
@@ -44,7 +44,7 @@
       </w:r>
       <w:r>
         <w:rPr>
-          <w:rFonts w:ascii="Arial" w:eastAsia="游ゴシック" w:hAnsi="Arial"/>
+          <w:rFonts w:ascii="Arial" w:eastAsia="Yu Gothic" w:hAnsi="Arial"/>
           <w:color w:val="5B6570"/>
           <w:sz w:val="16"/>
           <w:szCs w:val="16"/>
@@ -53,7 +53,7 @@
       </w:r>
       <w:r>
         <w:rPr>
-          <w:rFonts w:ascii="Arial" w:eastAsia="游ゴシック" w:hAnsi="Arial"/>
+          <w:rFonts w:ascii="Arial" w:eastAsia="Yu Gothic" w:hAnsi="Arial"/>
           <w:color w:val="5B6570"/>
           <w:sz w:val="16"/>
           <w:szCs w:val="16"/>
@@ -93,7 +93,7 @@
       </w:pPr>
       <w:r>
         <w:rPr>
-          <w:rFonts w:ascii="Arial" w:eastAsia="游ゴシック" w:hAnsi="Arial"/>
+          <w:rFonts w:ascii="Arial" w:eastAsia="Yu Gothic" w:hAnsi="Arial"/>
           <w:color w:val="5B6570"/>
           <w:sz w:val="20"/>
           <w:szCs w:val="20"/>
@@ -103,7 +103,7 @@
     </w:p>
     <w:tbl>
       <w:tblPr>
-        <w:tblW w:w="9978" w:type="dxa"/>
+        <w:tblW w:w="4989" w:type="dxa"/>
         <w:tblBorders>
           <w:top w:val="single" w:sz="4" w:space="0" w:color="auto"/>
           <w:left w:val="single" w:sz="4" w:space="0" w:color="auto"/>
@@ -120,8 +120,6 @@
         <w:tblLook w:val="0000" w:firstRow="0" w:lastRow="0" w:firstColumn="0" w:lastColumn="0" w:noHBand="0" w:noVBand="0"/>
       </w:tblPr>
       <w:tblGrid>
-        <w:gridCol w:w="1300"/>
-        <w:gridCol w:w="3689"/>
         <w:gridCol w:w="1300"/>
         <w:gridCol w:w="3689"/>
       </w:tblGrid>
@@ -146,7 +144,7 @@
           <w:p>
             <w:r>
               <w:rPr>
-                <w:rFonts w:ascii="Arial" w:eastAsia="游ゴシック" w:hAnsi="Arial"/>
+                <w:rFonts w:ascii="Arial" w:eastAsia="Yu Gothic" w:hAnsi="Arial"/>
                 <w:b/>
                 <w:bCs/>
                 <w:color w:val="5B6570"/>
@@ -183,7 +181,7 @@
             </w:pPr>
             <w:r>
               <w:rPr>
-                <w:rFonts w:ascii="Arial" w:eastAsia="游ゴシック" w:hAnsi="Arial" w:hint="eastAsia"/>
+                <w:rFonts w:ascii="Arial" w:eastAsia="Yu Gothic" w:hAnsi="Arial" w:hint="eastAsia"/>
                 <w:b/>
                 <w:bCs/>
                 <w:color w:val="000000" w:themeColor="text1"/>
@@ -192,258 +190,6 @@
               </w:rPr>
               <w:t>Todalaba</w:t>
             </w:r>
-          </w:p>
-        </w:tc>
-        <w:tc>
-          <w:tcPr>
-            <w:tcW w:w="1300" w:type="dxa"/>
-            <w:tcBorders>
-              <w:top w:val="single" w:sz="4" w:space="0" w:color="CFD6DD"/>
-              <w:left w:val="single" w:sz="4" w:space="0" w:color="CFD6DD"/>
-              <w:bottom w:val="single" w:sz="4" w:space="0" w:color="CFD6DD"/>
-              <w:right w:val="single" w:sz="4" w:space="0" w:color="CFD6DD"/>
-            </w:tcBorders>
-            <w:shd w:val="clear" w:color="auto" w:fill="F3F6F8"/>
-            <w:tcMar>
-              <w:top w:w="60" w:type="dxa"/>
-              <w:left w:w="90" w:type="dxa"/>
-              <w:bottom w:w="60" w:type="dxa"/>
-              <w:right w:w="90" w:type="dxa"/>
-            </w:tcMar>
-          </w:tcPr>
-          <w:p>
-            <w:r>
-              <w:rPr>
-                <w:rFonts w:ascii="Arial" w:eastAsia="游ゴシック" w:hAnsi="Arial"/>
-                <w:b/>
-                <w:bCs/>
-                <w:color w:val="5B6570"/>
-                <w:sz w:val="17"/>
-                <w:szCs w:val="17"/>
-              </w:rPr>
-              <w:t>提出日</w:t>
-            </w:r>
-          </w:p>
-        </w:tc>
-        <w:tc>
-          <w:tcPr>
-            <w:tcW w:w="3689" w:type="dxa"/>
-            <w:tcBorders>
-              <w:top w:val="single" w:sz="4" w:space="0" w:color="CFD6DD"/>
-              <w:left w:val="single" w:sz="4" w:space="0" w:color="CFD6DD"/>
-              <w:bottom w:val="single" w:sz="4" w:space="0" w:color="CFD6DD"/>
-              <w:right w:val="single" w:sz="4" w:space="0" w:color="CFD6DD"/>
-            </w:tcBorders>
-            <w:tcMar>
-              <w:top w:w="60" w:type="dxa"/>
-              <w:left w:w="120" w:type="dxa"/>
-              <w:bottom w:w="60" w:type="dxa"/>
-              <w:right w:w="90" w:type="dxa"/>
-            </w:tcMar>
-          </w:tcPr>
-          <w:p>
-            <w:r>
-              <w:rPr>
-                <w:rFonts w:ascii="Arial" w:eastAsia="游ゴシック" w:hAnsi="Arial"/>
-                <w:color w:val="1D232A"/>
-                <w:sz w:val="18"/>
-                <w:szCs w:val="18"/>
-              </w:rPr>
-              <w:t>2026</w:t>
-            </w:r>
-            <w:r>
-              <w:rPr>
-                <w:rFonts w:ascii="Arial" w:eastAsia="游ゴシック" w:hAnsi="Arial"/>
-                <w:color w:val="1D232A"/>
-                <w:sz w:val="18"/>
-                <w:szCs w:val="18"/>
-              </w:rPr>
-              <w:t>年</w:t>
-            </w:r>
-            <w:r>
-              <w:rPr>
-                <w:rFonts w:ascii="Arial" w:eastAsia="游ゴシック" w:hAnsi="Arial"/>
-                <w:color w:val="1D232A"/>
-                <w:sz w:val="18"/>
-                <w:szCs w:val="18"/>
-              </w:rPr>
-              <w:t>11</w:t>
-            </w:r>
-            <w:r>
-              <w:rPr>
-                <w:rFonts w:ascii="Arial" w:eastAsia="游ゴシック" w:hAnsi="Arial"/>
-                <w:color w:val="1D232A"/>
-                <w:sz w:val="18"/>
-                <w:szCs w:val="18"/>
-              </w:rPr>
-              <w:t>月</w:t>
-            </w:r>
-          </w:p>
-        </w:tc>
-      </w:tr>
-      <w:tr>
-        <w:tc>
-          <w:tcPr>
-            <w:tcW w:w="1300" w:type="dxa"/>
-            <w:tcBorders>
-              <w:top w:val="single" w:sz="4" w:space="0" w:color="CFD6DD"/>
-              <w:left w:val="single" w:sz="4" w:space="0" w:color="CFD6DD"/>
-              <w:bottom w:val="single" w:sz="4" w:space="0" w:color="CFD6DD"/>
-              <w:right w:val="single" w:sz="4" w:space="0" w:color="CFD6DD"/>
-            </w:tcBorders>
-            <w:shd w:val="clear" w:color="auto" w:fill="F3F6F8"/>
-            <w:tcMar>
-              <w:top w:w="60" w:type="dxa"/>
-              <w:left w:w="90" w:type="dxa"/>
-              <w:bottom w:w="60" w:type="dxa"/>
-              <w:right w:w="90" w:type="dxa"/>
-            </w:tcMar>
-          </w:tcPr>
-          <w:p>
-            <w:r>
-              <w:rPr>
-                <w:rFonts w:ascii="Arial" w:eastAsia="游ゴシック" w:hAnsi="Arial"/>
-                <w:b/>
-                <w:bCs/>
-                <w:color w:val="5B6570"/>
-                <w:sz w:val="17"/>
-                <w:szCs w:val="17"/>
-              </w:rPr>
-              <w:t>動画</w:t>
-            </w:r>
-            <w:r>
-              <w:rPr>
-                <w:rFonts w:ascii="Arial" w:eastAsia="游ゴシック" w:hAnsi="Arial"/>
-                <w:b/>
-                <w:bCs/>
-                <w:color w:val="5B6570"/>
-                <w:sz w:val="17"/>
-                <w:szCs w:val="17"/>
-              </w:rPr>
-              <w:t xml:space="preserve"> URL</w:t>
-            </w:r>
-          </w:p>
-        </w:tc>
-        <w:tc>
-          <w:tcPr>
-            <w:tcW w:w="3689" w:type="dxa"/>
-            <w:tcBorders>
-              <w:top w:val="single" w:sz="4" w:space="0" w:color="CFD6DD"/>
-              <w:left w:val="single" w:sz="4" w:space="0" w:color="CFD6DD"/>
-              <w:bottom w:val="single" w:sz="4" w:space="0" w:color="CFD6DD"/>
-              <w:right w:val="single" w:sz="4" w:space="0" w:color="CFD6DD"/>
-            </w:tcBorders>
-            <w:tcMar>
-              <w:top w:w="60" w:type="dxa"/>
-              <w:left w:w="120" w:type="dxa"/>
-              <w:bottom w:w="60" w:type="dxa"/>
-              <w:right w:w="90" w:type="dxa"/>
-            </w:tcMar>
-          </w:tcPr>
-          <w:p>
-            <w:pPr>
-              <w:rPr>
-                <w:color w:val="000000" w:themeColor="text1"/>
-                <w:sz w:val="16"/>
-                <w:szCs w:val="16"/>
-              </w:rPr>
-            </w:pPr>
-            <w:r>
-              <w:rPr>
-                <w:rFonts w:ascii="Arial" w:eastAsia="游ゴシック" w:hAnsi="Arial"/>
-                <w:color w:val="000000" w:themeColor="text1"/>
-                <w:sz w:val="16"/>
-                <w:szCs w:val="16"/>
-              </w:rPr>
-              <w:t>https://www.youtube.com/watch?v=k5Kr4eU_tf8</w:t>
-            </w:r>
-          </w:p>
-        </w:tc>
-        <w:tc>
-          <w:tcPr>
-            <w:tcW w:w="1300" w:type="dxa"/>
-            <w:tcBorders>
-              <w:top w:val="single" w:sz="4" w:space="0" w:color="CFD6DD"/>
-              <w:left w:val="single" w:sz="4" w:space="0" w:color="CFD6DD"/>
-              <w:bottom w:val="single" w:sz="4" w:space="0" w:color="CFD6DD"/>
-              <w:right w:val="single" w:sz="4" w:space="0" w:color="CFD6DD"/>
-            </w:tcBorders>
-            <w:shd w:val="clear" w:color="auto" w:fill="F3F6F8"/>
-            <w:tcMar>
-              <w:top w:w="60" w:type="dxa"/>
-              <w:left w:w="90" w:type="dxa"/>
-              <w:bottom w:w="60" w:type="dxa"/>
-              <w:right w:w="90" w:type="dxa"/>
-            </w:tcMar>
-          </w:tcPr>
-          <w:p>
-            <w:r>
-              <w:rPr>
-                <w:rFonts w:ascii="Arial" w:eastAsia="游ゴシック" w:hAnsi="Arial"/>
-                <w:b/>
-                <w:bCs/>
-                <w:color w:val="5B6570"/>
-                <w:sz w:val="17"/>
-                <w:szCs w:val="17"/>
-              </w:rPr>
-              <w:t>コード</w:t>
-            </w:r>
-          </w:p>
-        </w:tc>
-        <w:tc>
-          <w:tcPr>
-            <w:tcW w:w="3689" w:type="dxa"/>
-            <w:tcBorders>
-              <w:top w:val="single" w:sz="4" w:space="0" w:color="CFD6DD"/>
-              <w:left w:val="single" w:sz="4" w:space="0" w:color="CFD6DD"/>
-              <w:bottom w:val="single" w:sz="4" w:space="0" w:color="CFD6DD"/>
-              <w:right w:val="single" w:sz="4" w:space="0" w:color="CFD6DD"/>
-            </w:tcBorders>
-            <w:tcMar>
-              <w:top w:w="60" w:type="dxa"/>
-              <w:left w:w="120" w:type="dxa"/>
-              <w:bottom w:w="60" w:type="dxa"/>
-              <w:right w:w="90" w:type="dxa"/>
-            </w:tcMar>
-          </w:tcPr>
-          <w:p>
-            <w:r>
-              <w:rPr>
-                <w:rFonts w:ascii="Arial" w:eastAsia="游ゴシック" w:hAnsi="Arial"/>
-                <w:color w:val="1D232A"/>
-                <w:sz w:val="18"/>
-                <w:szCs w:val="18"/>
-              </w:rPr>
-              <w:t>github.com/Global-jogasaki/kumawatch-patrol</w:t>
-            </w:r>
-            <w:proofErr w:type="spellStart"/>
-            <w:r>
-              <w:rPr>
-                <w:rFonts w:ascii="Arial" w:eastAsia="游ゴシック" w:hAnsi="Arial"/>
-                <w:color w:val="1D232A"/>
-                <w:sz w:val="18"/>
-                <w:szCs w:val="18"/>
-              </w:rPr>
-            </w:r>
-            <w:proofErr w:type="spellEnd"/>
-            <w:r>
-              <w:rPr>
-                <w:rFonts w:ascii="Arial" w:eastAsia="游ゴシック" w:hAnsi="Arial"/>
-                <w:color w:val="1D232A"/>
-                <w:sz w:val="18"/>
-                <w:szCs w:val="18"/>
-              </w:rPr>
-            </w:r>
-            <w:proofErr w:type="spellStart"/>
-            <w:r>
-              <w:rPr>
-                <w:rFonts w:ascii="Arial" w:eastAsia="游ゴシック" w:hAnsi="Arial"/>
-                <w:color w:val="1D232A"/>
-                <w:sz w:val="18"/>
-                <w:szCs w:val="18"/>
-              </w:rPr>
-            </w:r>
-            <w:proofErr w:type="spellEnd"/>
           </w:p>
         </w:tc>
       </w:tr>
@@ -460,7 +206,13 @@
         <w:rPr>
           <w:color w:val="1F5F8B"/>
         </w:rPr>
-        <w:t>1　背景と目的</w:t>
+        <w:t>1</w:t>
+      </w:r>
+      <w:r>
+        <w:rPr>
+          <w:color w:val="1F5F8B"/>
+        </w:rPr>
+        <w:t xml:space="preserve">　背景と目的</w:t>
       </w:r>
     </w:p>
     <w:p>
@@ -476,11 +228,11 @@
       </w:r>
       <w:proofErr w:type="spellStart"/>
       <w:r>
-        <w:t>KumaWatch [7]</w:t>
+        <w:t>KumaWatch</w:t>
       </w:r>
       <w:proofErr w:type="spellEnd"/>
       <w:r>
-        <w:t xml:space="preserve"> </w:t>
+        <w:t xml:space="preserve"> [7] </w:t>
       </w:r>
       <w:r>
         <w:t>では、山形県・秋田県の公開出没データを</w:t>
@@ -606,7 +358,13 @@
         <w:rPr>
           <w:color w:val="1F5F8B"/>
         </w:rPr>
-        <w:t>2　提案システム</w:t>
+        <w:t>2</w:t>
+      </w:r>
+      <w:r>
+        <w:rPr>
+          <w:color w:val="1F5F8B"/>
+        </w:rPr>
+        <w:t xml:space="preserve">　提案システム</w:t>
       </w:r>
     </w:p>
     <w:p>
@@ -614,10 +372,146 @@
         <w:spacing w:after="100"/>
         <w:jc w:val="both"/>
       </w:pPr>
-      <w:proofErr w:type="spellStart"/>
-      <w:proofErr w:type="spellEnd"/>
-      <w:r>
-        <w:t>提案システム KumaWatch Patrol は、ROS 2 Humble [4]・Navigation2 [5]・Gazebo Classic 11 [6] 上の移動ロボット（TurtleBot3 / Happy Mini）で、次の流れを自動で実行する（図1）。① AI（TTM）が 5 候補地点の熊出没リスクを予測する。② リスク・重要度・移動距離から巡回する 3 地点と順番を決める。③ Nav2 で自律巡回する。④ AI（YOLOv8）がカメラ画像から熊を検知する。⑤ 停止して記録し、熊から離れた安全地点へ退避してから巡回を続ける。⑥ 詰所に戻り、結果を端末・RViz・ファイルに出力する。AI を使うのは①と④で、②の地点選択は AI の予測を入力とする規則（効用最大化）である。町と地点は架空で、熊・シカ・建物は基本図形で作った。リスクは公開データに基づく TTM の予測値、熊判定の学習画像はシミュレータで作った合成画像である。</w:t>
+      <w:r>
+        <w:t>提案システム</w:t>
+      </w:r>
+      <w:r>
+        <w:t xml:space="preserve"> KumaWatch Patrol </w:t>
+      </w:r>
+      <w:r>
+        <w:t>は、</w:t>
+      </w:r>
+      <w:r>
+        <w:t>ROS 2 Humble [4]</w:t>
+      </w:r>
+      <w:r>
+        <w:t>・</w:t>
+      </w:r>
+      <w:r>
+        <w:t>Navigation2 [5]</w:t>
+      </w:r>
+      <w:r>
+        <w:t>・</w:t>
+      </w:r>
+      <w:r>
+        <w:t xml:space="preserve">Gazebo Classic 11 [6] </w:t>
+      </w:r>
+      <w:r>
+        <w:t>上の移動ロボット（</w:t>
+      </w:r>
+      <w:r>
+        <w:t>TurtleBot3 / Happy Mini</w:t>
+      </w:r>
+      <w:r>
+        <w:t>）で、次の流れを自動で実行する（図</w:t>
+      </w:r>
+      <w:r>
+        <w:t>1</w:t>
+      </w:r>
+      <w:r>
+        <w:t>）。</w:t>
+      </w:r>
+      <w:r>
+        <w:t>① AI</w:t>
+      </w:r>
+      <w:r>
+        <w:t>（</w:t>
+      </w:r>
+      <w:r>
+        <w:t>TTM</w:t>
+      </w:r>
+      <w:r>
+        <w:t>）が</w:t>
+      </w:r>
+      <w:r>
+        <w:t xml:space="preserve"> 5 </w:t>
+      </w:r>
+      <w:r>
+        <w:t>候補地点の熊出没リスクを予測する。</w:t>
+      </w:r>
+      <w:r>
+        <w:t xml:space="preserve">② </w:t>
+      </w:r>
+      <w:r>
+        <w:t>リスク・重要度・移動距離から巡回する</w:t>
+      </w:r>
+      <w:r>
+        <w:t xml:space="preserve"> 3 </w:t>
+      </w:r>
+      <w:r>
+        <w:t>地点と順番を決める。</w:t>
+      </w:r>
+      <w:r>
+        <w:t xml:space="preserve">③ Nav2 </w:t>
+      </w:r>
+      <w:r>
+        <w:t>で自律巡回する。</w:t>
+      </w:r>
+      <w:r>
+        <w:t>④ AI</w:t>
+      </w:r>
+      <w:r>
+        <w:t>（</w:t>
+      </w:r>
+      <w:r>
+        <w:t>YOLOv8</w:t>
+      </w:r>
+      <w:r>
+        <w:t>）がカメラ画像から熊を検知する。</w:t>
+      </w:r>
+      <w:r>
+        <w:t xml:space="preserve">⑤ </w:t>
+      </w:r>
+      <w:r>
+        <w:t>停止して記録し、熊から離れた安全地点へ退避してから巡回を続ける。</w:t>
+      </w:r>
+      <w:r>
+        <w:t xml:space="preserve">⑥ </w:t>
+      </w:r>
+      <w:r>
+        <w:t>詰所に戻り、結果を端末・</w:t>
+      </w:r>
+      <w:r>
+        <w:t>RViz</w:t>
+      </w:r>
+      <w:r>
+        <w:t>・ファイルに出力する。</w:t>
+      </w:r>
+      <w:r>
+        <w:t xml:space="preserve">AI </w:t>
+      </w:r>
+      <w:r>
+        <w:t>を使うのは</w:t>
+      </w:r>
+      <w:r>
+        <w:t>①</w:t>
+      </w:r>
+      <w:r>
+        <w:t>と</w:t>
+      </w:r>
+      <w:r>
+        <w:t>④</w:t>
+      </w:r>
+      <w:r>
+        <w:t>で、</w:t>
+      </w:r>
+      <w:r>
+        <w:t>②</w:t>
+      </w:r>
+      <w:r>
+        <w:t>の地点選択は</w:t>
+      </w:r>
+      <w:r>
+        <w:t xml:space="preserve"> AI </w:t>
+      </w:r>
+      <w:r>
+        <w:t>の予測を入力とする規則（効用最大化）である。町と地点は架空で、熊・シカ・建物は基本図形で作った。リスクは公開データに基づく</w:t>
+      </w:r>
+      <w:r>
+        <w:t xml:space="preserve"> TTM </w:t>
+      </w:r>
+      <w:r>
+        <w:t>の予測値、熊判定の学習画像はシミュレータで作った合成画像である。</w:t>
       </w:r>
     </w:p>
     <w:p>
@@ -648,7 +542,7 @@
                     </pic:cNvPicPr>
                   </pic:nvPicPr>
                   <pic:blipFill>
-                    <a:blip r:embed="rId7"/>
+                    <a:blip r:embed="rId8"/>
                     <a:srcRect/>
                     <a:stretch>
                       <a:fillRect/>
@@ -676,7 +570,7 @@
       </w:pPr>
       <w:r>
         <w:rPr>
-          <w:rFonts w:ascii="Arial" w:eastAsia="游ゴシック" w:hAnsi="Arial"/>
+          <w:rFonts w:ascii="Arial" w:eastAsia="Yu Gothic" w:hAnsi="Arial"/>
           <w:b/>
           <w:bCs/>
           <w:sz w:val="16"/>
@@ -686,7 +580,7 @@
       </w:r>
       <w:r>
         <w:rPr>
-          <w:rFonts w:ascii="Arial" w:eastAsia="游ゴシック" w:hAnsi="Arial"/>
+          <w:rFonts w:ascii="Arial" w:eastAsia="Yu Gothic" w:hAnsi="Arial"/>
           <w:b/>
           <w:bCs/>
           <w:sz w:val="16"/>
@@ -696,7 +590,7 @@
       </w:r>
       <w:r>
         <w:rPr>
-          <w:rFonts w:ascii="Arial" w:eastAsia="游ゴシック" w:hAnsi="Arial"/>
+          <w:rFonts w:ascii="Arial" w:eastAsia="Yu Gothic" w:hAnsi="Arial"/>
           <w:b/>
           <w:bCs/>
           <w:sz w:val="16"/>
@@ -706,7 +600,7 @@
       </w:r>
       <w:r>
         <w:rPr>
-          <w:rFonts w:ascii="Arial" w:eastAsia="游ゴシック" w:hAnsi="Arial"/>
+          <w:rFonts w:ascii="Arial" w:eastAsia="Yu Gothic" w:hAnsi="Arial"/>
           <w:color w:val="5B6570"/>
           <w:sz w:val="16"/>
           <w:szCs w:val="16"/>
@@ -715,7 +609,7 @@
       </w:r>
       <w:r>
         <w:rPr>
-          <w:rFonts w:ascii="Arial" w:eastAsia="游ゴシック" w:hAnsi="Arial"/>
+          <w:rFonts w:ascii="Arial" w:eastAsia="Yu Gothic" w:hAnsi="Arial"/>
           <w:color w:val="5B6570"/>
           <w:sz w:val="16"/>
           <w:szCs w:val="16"/>
@@ -724,7 +618,7 @@
       </w:r>
       <w:r>
         <w:rPr>
-          <w:rFonts w:ascii="Arial" w:eastAsia="游ゴシック" w:hAnsi="Arial"/>
+          <w:rFonts w:ascii="Arial" w:eastAsia="Yu Gothic" w:hAnsi="Arial"/>
           <w:color w:val="5B6570"/>
           <w:sz w:val="16"/>
           <w:szCs w:val="16"/>
@@ -733,7 +627,7 @@
       </w:r>
       <w:r>
         <w:rPr>
-          <w:rFonts w:ascii="Arial" w:eastAsia="游ゴシック" w:hAnsi="Arial"/>
+          <w:rFonts w:ascii="Arial" w:eastAsia="Yu Gothic" w:hAnsi="Arial"/>
           <w:color w:val="5B6570"/>
           <w:sz w:val="16"/>
           <w:szCs w:val="16"/>
@@ -742,7 +636,7 @@
       </w:r>
       <w:r>
         <w:rPr>
-          <w:rFonts w:ascii="Arial" w:eastAsia="游ゴシック" w:hAnsi="Arial"/>
+          <w:rFonts w:ascii="Arial" w:eastAsia="Yu Gothic" w:hAnsi="Arial"/>
           <w:color w:val="5B6570"/>
           <w:sz w:val="16"/>
           <w:szCs w:val="16"/>
@@ -751,7 +645,7 @@
       </w:r>
       <w:r>
         <w:rPr>
-          <w:rFonts w:ascii="Arial" w:eastAsia="游ゴシック" w:hAnsi="Arial"/>
+          <w:rFonts w:ascii="Arial" w:eastAsia="Yu Gothic" w:hAnsi="Arial"/>
           <w:color w:val="5B6570"/>
           <w:sz w:val="16"/>
           <w:szCs w:val="16"/>
@@ -760,7 +654,7 @@
       </w:r>
       <w:r>
         <w:rPr>
-          <w:rFonts w:ascii="Arial" w:eastAsia="游ゴシック" w:hAnsi="Arial"/>
+          <w:rFonts w:ascii="Arial" w:eastAsia="Yu Gothic" w:hAnsi="Arial"/>
           <w:color w:val="5B6570"/>
           <w:sz w:val="16"/>
           <w:szCs w:val="16"/>
@@ -769,7 +663,7 @@
       </w:r>
       <w:r>
         <w:rPr>
-          <w:rFonts w:ascii="Arial" w:eastAsia="游ゴシック" w:hAnsi="Arial"/>
+          <w:rFonts w:ascii="Arial" w:eastAsia="Yu Gothic" w:hAnsi="Arial"/>
           <w:color w:val="5B6570"/>
           <w:sz w:val="16"/>
           <w:szCs w:val="16"/>
@@ -779,7 +673,7 @@
       <w:proofErr w:type="spellStart"/>
       <w:r>
         <w:rPr>
-          <w:rFonts w:ascii="Arial" w:eastAsia="游ゴシック" w:hAnsi="Arial"/>
+          <w:rFonts w:ascii="Arial" w:eastAsia="Yu Gothic" w:hAnsi="Arial"/>
           <w:color w:val="5B6570"/>
           <w:sz w:val="16"/>
           <w:szCs w:val="16"/>
@@ -789,7 +683,7 @@
       <w:proofErr w:type="spellEnd"/>
       <w:r>
         <w:rPr>
-          <w:rFonts w:ascii="Arial" w:eastAsia="游ゴシック" w:hAnsi="Arial"/>
+          <w:rFonts w:ascii="Arial" w:eastAsia="Yu Gothic" w:hAnsi="Arial"/>
           <w:color w:val="5B6570"/>
           <w:sz w:val="16"/>
           <w:szCs w:val="16"/>
@@ -798,7 +692,7 @@
       </w:r>
       <w:r>
         <w:rPr>
-          <w:rFonts w:ascii="Arial" w:eastAsia="游ゴシック" w:hAnsi="Arial"/>
+          <w:rFonts w:ascii="Arial" w:eastAsia="Yu Gothic" w:hAnsi="Arial"/>
           <w:color w:val="5B6570"/>
           <w:sz w:val="16"/>
           <w:szCs w:val="16"/>
@@ -812,6 +706,7 @@
         <w:jc w:val="both"/>
       </w:pPr>
       <w:r>
+        <w:lastRenderedPageBreak/>
         <w:t>リスクだけでなく、社会的重要度と移動コストを考えた効用で地点を選ぶ。</w:t>
       </w:r>
     </w:p>
@@ -1111,20 +1006,61 @@
         <w:spacing w:after="100"/>
         <w:jc w:val="both"/>
       </w:pPr>
-      <w:proofErr w:type="spellStart"/>
-      <w:proofErr w:type="spellEnd"/>
-      <w:proofErr w:type="spellStart"/>
-      <w:proofErr w:type="spellEnd"/>
-      <w:r>
-        <w:rPr>
-          <w:rFonts w:ascii="Consolas" w:eastAsia="游ゴシック" w:hAnsi="Consolas"/>
+      <w:r>
+        <w:rPr>
+          <w:rFonts w:ascii="Consolas" w:eastAsia="Yu Gothic" w:hAnsi="Consolas"/>
           <w:sz w:val="17"/>
           <w:szCs w:val="17"/>
         </w:rPr>
         <w:t>mission_planner</w:t>
       </w:r>
       <w:r>
-        <w:t xml:space="preserve"> は Nav2 の NavigateToPose アクションで各地点へ移動し、到着後に一定時間周囲を確認する。熊の検知を受け取ると、ゴールをキャンセルしてゼロ速度で停止し、熊の位置・時刻・距離・信頼度を記録する。熊を追跡せず、熊と反対の方向へ 3 m 離れた地点を安全地点として計算し、Nav2 で退避してから巡回を再開する。退避先への経路が得られない場合、本試作では退避を打ち切って巡回を継続する。これは安全制御上の課題である（5・6・8 章）。</w:t>
+        <w:t xml:space="preserve"> </w:t>
+      </w:r>
+      <w:r>
+        <w:t>は</w:t>
+      </w:r>
+      <w:r>
+        <w:t xml:space="preserve"> Nav2 </w:t>
+      </w:r>
+      <w:r>
+        <w:t>の</w:t>
+      </w:r>
+      <w:r>
+        <w:t xml:space="preserve"> NavigateToPose </w:t>
+      </w:r>
+      <w:r>
+        <w:t>アクションで各地点へ移動し、到着後に一定時間周囲を確認する。熊の検知を受け取ると、ゴールをキャンセルしてゼロ速度で停止し、熊の位置・時刻・距離・信頼度を記録する。熊を追跡せず、熊と反対の方向へ</w:t>
+      </w:r>
+      <w:r>
+        <w:t xml:space="preserve"> 3 m </w:t>
+      </w:r>
+      <w:r>
+        <w:t>離れた地点を安全地点として計算し、</w:t>
+      </w:r>
+      <w:r>
+        <w:t xml:space="preserve">Nav2 </w:t>
+      </w:r>
+      <w:r>
+        <w:t>で退避してから巡回を再開する。退避先への経路が得られない場合、本試作では退避を打ち切って巡回を継続する。これは安全制御上の課題である（</w:t>
+      </w:r>
+      <w:r>
+        <w:t>5</w:t>
+      </w:r>
+      <w:r>
+        <w:t>・</w:t>
+      </w:r>
+      <w:r>
+        <w:t>6</w:t>
+      </w:r>
+      <w:r>
+        <w:t>・</w:t>
+      </w:r>
+      <w:r>
+        <w:t xml:space="preserve">8 </w:t>
+      </w:r>
+      <w:r>
+        <w:t>章）。</w:t>
       </w:r>
     </w:p>
     <w:p>
@@ -1139,7 +1075,25 @@
         <w:rPr>
           <w:color w:val="1F5F8B"/>
         </w:rPr>
-        <w:t>3　AI の利用方法</w:t>
+        <w:t>3</w:t>
+      </w:r>
+      <w:r>
+        <w:rPr>
+          <w:color w:val="1F5F8B"/>
+        </w:rPr>
+        <w:t xml:space="preserve">　</w:t>
+      </w:r>
+      <w:r>
+        <w:rPr>
+          <w:color w:val="1F5F8B"/>
+        </w:rPr>
+        <w:t xml:space="preserve">AI </w:t>
+      </w:r>
+      <w:r>
+        <w:rPr>
+          <w:color w:val="1F5F8B"/>
+        </w:rPr>
+        <w:t>の利用方法</w:t>
       </w:r>
     </w:p>
     <w:p>
@@ -1147,10 +1101,29 @@
         <w:pStyle w:val="2"/>
         <w:keepNext/>
       </w:pPr>
-      <w:proofErr w:type="spellStart"/>
-      <w:proofErr w:type="spellEnd"/>
-      <w:r>
-        <w:t>3.1　AI 1：熊出没リスクの予測（KumaWatch の TTM）</w:t>
+      <w:r>
+        <w:t>3.1</w:t>
+      </w:r>
+      <w:r>
+        <w:t xml:space="preserve">　</w:t>
+      </w:r>
+      <w:r>
+        <w:t>AI 1</w:t>
+      </w:r>
+      <w:r>
+        <w:t>：熊出没リスクの予測（</w:t>
+      </w:r>
+      <w:r>
+        <w:t xml:space="preserve">KumaWatch </w:t>
+      </w:r>
+      <w:r>
+        <w:t>の</w:t>
+      </w:r>
+      <w:r>
+        <w:t xml:space="preserve"> TTM</w:t>
+      </w:r>
+      <w:r>
+        <w:t>）</w:t>
       </w:r>
     </w:p>
     <w:p>
@@ -1190,7 +1163,7 @@
           <w:bCs/>
           <w:color w:val="B3541E"/>
         </w:rPr>
-        <w:t>TinyTimeMixer [1]</w:t>
+        <w:t>TinyTimeMixer</w:t>
       </w:r>
       <w:proofErr w:type="spellEnd"/>
       <w:r>
@@ -1199,7 +1172,7 @@
           <w:bCs/>
           <w:color w:val="B3541E"/>
         </w:rPr>
-        <w:t>（</w:t>
+        <w:t xml:space="preserve"> [1]</w:t>
       </w:r>
       <w:r>
         <w:rPr>
@@ -1207,7 +1180,7 @@
           <w:bCs/>
           <w:color w:val="B3541E"/>
         </w:rPr>
-        <w:t>TTM 1536-96-R2</w:t>
+        <w:t>（</w:t>
       </w:r>
       <w:r>
         <w:rPr>
@@ -1215,6 +1188,14 @@
           <w:bCs/>
           <w:color w:val="B3541E"/>
         </w:rPr>
+        <w:t>TTM 1536-96-R2</w:t>
+      </w:r>
+      <w:r>
+        <w:rPr>
+          <w:b/>
+          <w:bCs/>
+          <w:color w:val="B3541E"/>
+        </w:rPr>
         <w:t>）</w:t>
       </w:r>
       <w:r>
@@ -1256,7 +1237,10 @@
         <w:t>地点のリスクには実在セルの予測値を割り当てた（表</w:t>
       </w:r>
       <w:r>
-        <w:t>2</w:t>
+        <w:rPr>
+          <w:rFonts w:hint="eastAsia"/>
+        </w:rPr>
+        <w:t>1</w:t>
       </w:r>
       <w:r>
         <w:t>）。割り当ては次の規則による：</w:t>
@@ -1405,7 +1389,7 @@
             </w:pPr>
             <w:r>
               <w:rPr>
-                <w:rFonts w:ascii="Arial" w:eastAsia="游ゴシック" w:hAnsi="Arial"/>
+                <w:rFonts w:ascii="Arial" w:eastAsia="Yu Gothic" w:hAnsi="Arial"/>
                 <w:b/>
                 <w:bCs/>
                 <w:sz w:val="16"/>
@@ -1437,7 +1421,7 @@
             </w:pPr>
             <w:r>
               <w:rPr>
-                <w:rFonts w:ascii="Arial" w:eastAsia="游ゴシック" w:hAnsi="Arial"/>
+                <w:rFonts w:ascii="Arial" w:eastAsia="Yu Gothic" w:hAnsi="Arial"/>
                 <w:b/>
                 <w:bCs/>
                 <w:sz w:val="16"/>
@@ -1469,7 +1453,7 @@
             </w:pPr>
             <w:r>
               <w:rPr>
-                <w:rFonts w:ascii="Arial" w:eastAsia="游ゴシック" w:hAnsi="Arial"/>
+                <w:rFonts w:ascii="Arial" w:eastAsia="Yu Gothic" w:hAnsi="Arial"/>
                 <w:b/>
                 <w:bCs/>
                 <w:sz w:val="16"/>
@@ -1502,7 +1486,7 @@
             </w:pPr>
             <w:r>
               <w:rPr>
-                <w:rFonts w:ascii="Arial" w:eastAsia="游ゴシック" w:hAnsi="Arial"/>
+                <w:rFonts w:ascii="Arial" w:eastAsia="Yu Gothic" w:hAnsi="Arial"/>
                 <w:b/>
                 <w:bCs/>
                 <w:sz w:val="16"/>
@@ -1512,7 +1496,7 @@
             </w:r>
             <w:r>
               <w:rPr>
-                <w:rFonts w:ascii="Arial" w:eastAsia="游ゴシック" w:hAnsi="Arial"/>
+                <w:rFonts w:ascii="Arial" w:eastAsia="Yu Gothic" w:hAnsi="Arial"/>
                 <w:b/>
                 <w:bCs/>
                 <w:sz w:val="16"/>
@@ -1545,7 +1529,7 @@
             </w:pPr>
             <w:r>
               <w:rPr>
-                <w:rFonts w:ascii="Arial" w:eastAsia="游ゴシック" w:hAnsi="Arial"/>
+                <w:rFonts w:ascii="Arial" w:eastAsia="Yu Gothic" w:hAnsi="Arial"/>
                 <w:b/>
                 <w:bCs/>
                 <w:sz w:val="16"/>
@@ -1577,7 +1561,7 @@
             </w:pPr>
             <w:r>
               <w:rPr>
-                <w:rFonts w:ascii="Arial" w:eastAsia="游ゴシック" w:hAnsi="Arial"/>
+                <w:rFonts w:ascii="Arial" w:eastAsia="Yu Gothic" w:hAnsi="Arial"/>
                 <w:b/>
                 <w:bCs/>
                 <w:sz w:val="16"/>
@@ -1609,7 +1593,7 @@
             </w:pPr>
             <w:r>
               <w:rPr>
-                <w:rFonts w:ascii="Arial" w:eastAsia="游ゴシック" w:hAnsi="Arial"/>
+                <w:rFonts w:ascii="Arial" w:eastAsia="Yu Gothic" w:hAnsi="Arial"/>
                 <w:b/>
                 <w:bCs/>
                 <w:sz w:val="16"/>
@@ -1619,7 +1603,7 @@
             </w:r>
             <w:r>
               <w:rPr>
-                <w:rFonts w:ascii="Arial" w:eastAsia="游ゴシック" w:hAnsi="Arial"/>
+                <w:rFonts w:ascii="Arial" w:eastAsia="Yu Gothic" w:hAnsi="Arial"/>
                 <w:b/>
                 <w:bCs/>
                 <w:sz w:val="16"/>
@@ -1657,7 +1641,7 @@
             </w:pPr>
             <w:r>
               <w:rPr>
-                <w:rFonts w:ascii="Arial" w:eastAsia="游ゴシック" w:hAnsi="Arial"/>
+                <w:rFonts w:ascii="Arial" w:eastAsia="Yu Gothic" w:hAnsi="Arial"/>
                 <w:sz w:val="16"/>
                 <w:szCs w:val="16"/>
               </w:rPr>
@@ -1688,7 +1672,7 @@
             </w:pPr>
             <w:r>
               <w:rPr>
-                <w:rFonts w:ascii="Arial" w:eastAsia="游ゴシック" w:hAnsi="Arial"/>
+                <w:rFonts w:ascii="Arial" w:eastAsia="Yu Gothic" w:hAnsi="Arial"/>
                 <w:sz w:val="16"/>
                 <w:szCs w:val="16"/>
               </w:rPr>
@@ -1719,7 +1703,7 @@
             </w:pPr>
             <w:r>
               <w:rPr>
-                <w:rFonts w:ascii="Arial" w:eastAsia="游ゴシック" w:hAnsi="Arial"/>
+                <w:rFonts w:ascii="Arial" w:eastAsia="Yu Gothic" w:hAnsi="Arial"/>
                 <w:sz w:val="16"/>
                 <w:szCs w:val="16"/>
               </w:rPr>
@@ -1751,7 +1735,7 @@
             </w:pPr>
             <w:r>
               <w:rPr>
-                <w:rFonts w:ascii="Arial" w:eastAsia="游ゴシック" w:hAnsi="Arial"/>
+                <w:rFonts w:ascii="Arial" w:eastAsia="Yu Gothic" w:hAnsi="Arial"/>
                 <w:sz w:val="16"/>
                 <w:szCs w:val="16"/>
               </w:rPr>
@@ -1783,7 +1767,7 @@
             </w:pPr>
             <w:r>
               <w:rPr>
-                <w:rFonts w:ascii="Arial" w:eastAsia="游ゴシック" w:hAnsi="Arial"/>
+                <w:rFonts w:ascii="Arial" w:eastAsia="Yu Gothic" w:hAnsi="Arial"/>
                 <w:sz w:val="16"/>
                 <w:szCs w:val="16"/>
               </w:rPr>
@@ -1814,7 +1798,7 @@
             </w:pPr>
             <w:r>
               <w:rPr>
-                <w:rFonts w:ascii="Arial" w:eastAsia="游ゴシック" w:hAnsi="Arial"/>
+                <w:rFonts w:ascii="Arial" w:eastAsia="Yu Gothic" w:hAnsi="Arial"/>
                 <w:sz w:val="16"/>
                 <w:szCs w:val="16"/>
               </w:rPr>
@@ -1845,7 +1829,7 @@
             </w:pPr>
             <w:r>
               <w:rPr>
-                <w:rFonts w:ascii="Arial" w:eastAsia="游ゴシック" w:hAnsi="Arial"/>
+                <w:rFonts w:ascii="Arial" w:eastAsia="Yu Gothic" w:hAnsi="Arial"/>
                 <w:sz w:val="16"/>
                 <w:szCs w:val="16"/>
               </w:rPr>
@@ -1880,7 +1864,7 @@
             </w:pPr>
             <w:r>
               <w:rPr>
-                <w:rFonts w:ascii="Arial" w:eastAsia="游ゴシック" w:hAnsi="Arial"/>
+                <w:rFonts w:ascii="Arial" w:eastAsia="Yu Gothic" w:hAnsi="Arial"/>
                 <w:sz w:val="16"/>
                 <w:szCs w:val="16"/>
               </w:rPr>
@@ -1910,7 +1894,7 @@
             </w:pPr>
             <w:r>
               <w:rPr>
-                <w:rFonts w:ascii="Arial" w:eastAsia="游ゴシック" w:hAnsi="Arial"/>
+                <w:rFonts w:ascii="Arial" w:eastAsia="Yu Gothic" w:hAnsi="Arial"/>
                 <w:sz w:val="16"/>
                 <w:szCs w:val="16"/>
               </w:rPr>
@@ -1940,7 +1924,7 @@
             </w:pPr>
             <w:r>
               <w:rPr>
-                <w:rFonts w:ascii="Arial" w:eastAsia="游ゴシック" w:hAnsi="Arial"/>
+                <w:rFonts w:ascii="Arial" w:eastAsia="Yu Gothic" w:hAnsi="Arial"/>
                 <w:sz w:val="16"/>
                 <w:szCs w:val="16"/>
               </w:rPr>
@@ -1971,7 +1955,7 @@
             </w:pPr>
             <w:r>
               <w:rPr>
-                <w:rFonts w:ascii="Arial" w:eastAsia="游ゴシック" w:hAnsi="Arial"/>
+                <w:rFonts w:ascii="Arial" w:eastAsia="Yu Gothic" w:hAnsi="Arial"/>
                 <w:sz w:val="16"/>
                 <w:szCs w:val="16"/>
               </w:rPr>
@@ -2002,7 +1986,7 @@
             </w:pPr>
             <w:r>
               <w:rPr>
-                <w:rFonts w:ascii="Arial" w:eastAsia="游ゴシック" w:hAnsi="Arial"/>
+                <w:rFonts w:ascii="Arial" w:eastAsia="Yu Gothic" w:hAnsi="Arial"/>
                 <w:sz w:val="16"/>
                 <w:szCs w:val="16"/>
               </w:rPr>
@@ -2032,7 +2016,7 @@
             </w:pPr>
             <w:r>
               <w:rPr>
-                <w:rFonts w:ascii="Arial" w:eastAsia="游ゴシック" w:hAnsi="Arial"/>
+                <w:rFonts w:ascii="Arial" w:eastAsia="Yu Gothic" w:hAnsi="Arial"/>
                 <w:sz w:val="16"/>
                 <w:szCs w:val="16"/>
               </w:rPr>
@@ -2062,7 +2046,7 @@
             </w:pPr>
             <w:r>
               <w:rPr>
-                <w:rFonts w:ascii="Arial" w:eastAsia="游ゴシック" w:hAnsi="Arial"/>
+                <w:rFonts w:ascii="Arial" w:eastAsia="Yu Gothic" w:hAnsi="Arial"/>
                 <w:sz w:val="16"/>
                 <w:szCs w:val="16"/>
               </w:rPr>
@@ -2098,7 +2082,7 @@
             </w:pPr>
             <w:r>
               <w:rPr>
-                <w:rFonts w:ascii="Arial" w:eastAsia="游ゴシック" w:hAnsi="Arial"/>
+                <w:rFonts w:ascii="Arial" w:eastAsia="Yu Gothic" w:hAnsi="Arial"/>
                 <w:sz w:val="16"/>
                 <w:szCs w:val="16"/>
               </w:rPr>
@@ -2129,7 +2113,7 @@
             </w:pPr>
             <w:r>
               <w:rPr>
-                <w:rFonts w:ascii="Arial" w:eastAsia="游ゴシック" w:hAnsi="Arial"/>
+                <w:rFonts w:ascii="Arial" w:eastAsia="Yu Gothic" w:hAnsi="Arial"/>
                 <w:sz w:val="16"/>
                 <w:szCs w:val="16"/>
               </w:rPr>
@@ -2160,7 +2144,7 @@
             </w:pPr>
             <w:r>
               <w:rPr>
-                <w:rFonts w:ascii="Arial" w:eastAsia="游ゴシック" w:hAnsi="Arial"/>
+                <w:rFonts w:ascii="Arial" w:eastAsia="Yu Gothic" w:hAnsi="Arial"/>
                 <w:sz w:val="16"/>
                 <w:szCs w:val="16"/>
               </w:rPr>
@@ -2192,7 +2176,7 @@
             </w:pPr>
             <w:r>
               <w:rPr>
-                <w:rFonts w:ascii="Arial" w:eastAsia="游ゴシック" w:hAnsi="Arial"/>
+                <w:rFonts w:ascii="Arial" w:eastAsia="Yu Gothic" w:hAnsi="Arial"/>
                 <w:sz w:val="16"/>
                 <w:szCs w:val="16"/>
               </w:rPr>
@@ -2224,7 +2208,7 @@
             </w:pPr>
             <w:r>
               <w:rPr>
-                <w:rFonts w:ascii="Arial" w:eastAsia="游ゴシック" w:hAnsi="Arial"/>
+                <w:rFonts w:ascii="Arial" w:eastAsia="Yu Gothic" w:hAnsi="Arial"/>
                 <w:sz w:val="16"/>
                 <w:szCs w:val="16"/>
               </w:rPr>
@@ -2255,7 +2239,7 @@
             </w:pPr>
             <w:r>
               <w:rPr>
-                <w:rFonts w:ascii="Arial" w:eastAsia="游ゴシック" w:hAnsi="Arial"/>
+                <w:rFonts w:ascii="Arial" w:eastAsia="Yu Gothic" w:hAnsi="Arial"/>
                 <w:sz w:val="16"/>
                 <w:szCs w:val="16"/>
               </w:rPr>
@@ -2286,7 +2270,7 @@
             </w:pPr>
             <w:r>
               <w:rPr>
-                <w:rFonts w:ascii="Arial" w:eastAsia="游ゴシック" w:hAnsi="Arial"/>
+                <w:rFonts w:ascii="Arial" w:eastAsia="Yu Gothic" w:hAnsi="Arial"/>
                 <w:sz w:val="16"/>
                 <w:szCs w:val="16"/>
               </w:rPr>
@@ -2321,7 +2305,7 @@
             </w:pPr>
             <w:r>
               <w:rPr>
-                <w:rFonts w:ascii="Arial" w:eastAsia="游ゴシック" w:hAnsi="Arial"/>
+                <w:rFonts w:ascii="Arial" w:eastAsia="Yu Gothic" w:hAnsi="Arial"/>
                 <w:sz w:val="16"/>
                 <w:szCs w:val="16"/>
               </w:rPr>
@@ -2351,7 +2335,7 @@
             </w:pPr>
             <w:r>
               <w:rPr>
-                <w:rFonts w:ascii="Arial" w:eastAsia="游ゴシック" w:hAnsi="Arial"/>
+                <w:rFonts w:ascii="Arial" w:eastAsia="Yu Gothic" w:hAnsi="Arial"/>
                 <w:sz w:val="16"/>
                 <w:szCs w:val="16"/>
               </w:rPr>
@@ -2381,7 +2365,7 @@
             </w:pPr>
             <w:r>
               <w:rPr>
-                <w:rFonts w:ascii="Arial" w:eastAsia="游ゴシック" w:hAnsi="Arial"/>
+                <w:rFonts w:ascii="Arial" w:eastAsia="Yu Gothic" w:hAnsi="Arial"/>
                 <w:sz w:val="16"/>
                 <w:szCs w:val="16"/>
               </w:rPr>
@@ -2412,7 +2396,7 @@
             </w:pPr>
             <w:r>
               <w:rPr>
-                <w:rFonts w:ascii="Arial" w:eastAsia="游ゴシック" w:hAnsi="Arial"/>
+                <w:rFonts w:ascii="Arial" w:eastAsia="Yu Gothic" w:hAnsi="Arial"/>
                 <w:sz w:val="16"/>
                 <w:szCs w:val="16"/>
               </w:rPr>
@@ -2443,7 +2427,7 @@
             </w:pPr>
             <w:r>
               <w:rPr>
-                <w:rFonts w:ascii="Arial" w:eastAsia="游ゴシック" w:hAnsi="Arial"/>
+                <w:rFonts w:ascii="Arial" w:eastAsia="Yu Gothic" w:hAnsi="Arial"/>
                 <w:sz w:val="16"/>
                 <w:szCs w:val="16"/>
               </w:rPr>
@@ -2473,7 +2457,7 @@
             </w:pPr>
             <w:r>
               <w:rPr>
-                <w:rFonts w:ascii="Arial" w:eastAsia="游ゴシック" w:hAnsi="Arial"/>
+                <w:rFonts w:ascii="Arial" w:eastAsia="Yu Gothic" w:hAnsi="Arial"/>
                 <w:sz w:val="16"/>
                 <w:szCs w:val="16"/>
               </w:rPr>
@@ -2503,7 +2487,7 @@
             </w:pPr>
             <w:r>
               <w:rPr>
-                <w:rFonts w:ascii="Arial" w:eastAsia="游ゴシック" w:hAnsi="Arial"/>
+                <w:rFonts w:ascii="Arial" w:eastAsia="Yu Gothic" w:hAnsi="Arial"/>
                 <w:sz w:val="16"/>
                 <w:szCs w:val="16"/>
               </w:rPr>
@@ -2538,7 +2522,7 @@
             </w:pPr>
             <w:r>
               <w:rPr>
-                <w:rFonts w:ascii="Arial" w:eastAsia="游ゴシック" w:hAnsi="Arial"/>
+                <w:rFonts w:ascii="Arial" w:eastAsia="Yu Gothic" w:hAnsi="Arial"/>
                 <w:sz w:val="16"/>
                 <w:szCs w:val="16"/>
               </w:rPr>
@@ -2568,7 +2552,7 @@
             </w:pPr>
             <w:r>
               <w:rPr>
-                <w:rFonts w:ascii="Arial" w:eastAsia="游ゴシック" w:hAnsi="Arial"/>
+                <w:rFonts w:ascii="Arial" w:eastAsia="Yu Gothic" w:hAnsi="Arial"/>
                 <w:sz w:val="16"/>
                 <w:szCs w:val="16"/>
               </w:rPr>
@@ -2598,7 +2582,7 @@
             </w:pPr>
             <w:r>
               <w:rPr>
-                <w:rFonts w:ascii="Arial" w:eastAsia="游ゴシック" w:hAnsi="Arial"/>
+                <w:rFonts w:ascii="Arial" w:eastAsia="Yu Gothic" w:hAnsi="Arial"/>
                 <w:sz w:val="16"/>
                 <w:szCs w:val="16"/>
               </w:rPr>
@@ -2629,7 +2613,7 @@
             </w:pPr>
             <w:r>
               <w:rPr>
-                <w:rFonts w:ascii="Arial" w:eastAsia="游ゴシック" w:hAnsi="Arial"/>
+                <w:rFonts w:ascii="Arial" w:eastAsia="Yu Gothic" w:hAnsi="Arial"/>
                 <w:sz w:val="16"/>
                 <w:szCs w:val="16"/>
               </w:rPr>
@@ -2660,7 +2644,7 @@
             </w:pPr>
             <w:r>
               <w:rPr>
-                <w:rFonts w:ascii="Arial" w:eastAsia="游ゴシック" w:hAnsi="Arial"/>
+                <w:rFonts w:ascii="Arial" w:eastAsia="Yu Gothic" w:hAnsi="Arial"/>
                 <w:sz w:val="16"/>
                 <w:szCs w:val="16"/>
               </w:rPr>
@@ -2690,7 +2674,7 @@
             </w:pPr>
             <w:r>
               <w:rPr>
-                <w:rFonts w:ascii="Arial" w:eastAsia="游ゴシック" w:hAnsi="Arial"/>
+                <w:rFonts w:ascii="Arial" w:eastAsia="Yu Gothic" w:hAnsi="Arial"/>
                 <w:sz w:val="16"/>
                 <w:szCs w:val="16"/>
               </w:rPr>
@@ -2720,7 +2704,7 @@
             </w:pPr>
             <w:r>
               <w:rPr>
-                <w:rFonts w:ascii="Arial" w:eastAsia="游ゴシック" w:hAnsi="Arial"/>
+                <w:rFonts w:ascii="Arial" w:eastAsia="Yu Gothic" w:hAnsi="Arial"/>
                 <w:sz w:val="16"/>
                 <w:szCs w:val="16"/>
               </w:rPr>
@@ -2736,7 +2720,7 @@
       </w:pPr>
       <w:r>
         <w:rPr>
-          <w:rFonts w:ascii="Arial" w:eastAsia="游ゴシック" w:hAnsi="Arial"/>
+          <w:rFonts w:ascii="Arial" w:eastAsia="Yu Gothic" w:hAnsi="Arial"/>
           <w:b/>
           <w:bCs/>
           <w:sz w:val="16"/>
@@ -2746,17 +2730,17 @@
       </w:r>
       <w:r>
         <w:rPr>
-          <w:rFonts w:ascii="Arial" w:eastAsia="游ゴシック" w:hAnsi="Arial"/>
+          <w:rFonts w:ascii="Arial" w:eastAsia="Yu Gothic" w:hAnsi="Arial" w:hint="eastAsia"/>
           <w:b/>
           <w:bCs/>
           <w:sz w:val="16"/>
           <w:szCs w:val="16"/>
         </w:rPr>
-        <w:t>2</w:t>
-      </w:r>
-      <w:r>
-        <w:rPr>
-          <w:rFonts w:ascii="Arial" w:eastAsia="游ゴシック" w:hAnsi="Arial"/>
+        <w:t>1</w:t>
+      </w:r>
+      <w:r>
+        <w:rPr>
+          <w:rFonts w:ascii="Arial" w:eastAsia="Yu Gothic" w:hAnsi="Arial"/>
           <w:b/>
           <w:bCs/>
           <w:sz w:val="16"/>
@@ -2766,7 +2750,7 @@
       </w:r>
       <w:r>
         <w:rPr>
-          <w:rFonts w:ascii="Arial" w:eastAsia="游ゴシック" w:hAnsi="Arial"/>
+          <w:rFonts w:ascii="Arial" w:eastAsia="Yu Gothic" w:hAnsi="Arial"/>
           <w:color w:val="5B6570"/>
           <w:sz w:val="16"/>
           <w:szCs w:val="16"/>
@@ -2775,7 +2759,7 @@
       </w:r>
       <w:r>
         <w:rPr>
-          <w:rFonts w:ascii="Arial" w:eastAsia="游ゴシック" w:hAnsi="Arial"/>
+          <w:rFonts w:ascii="Arial" w:eastAsia="Yu Gothic" w:hAnsi="Arial"/>
           <w:color w:val="5B6570"/>
           <w:sz w:val="16"/>
           <w:szCs w:val="16"/>
@@ -2784,7 +2768,7 @@
       </w:r>
       <w:r>
         <w:rPr>
-          <w:rFonts w:ascii="Arial" w:eastAsia="游ゴシック" w:hAnsi="Arial"/>
+          <w:rFonts w:ascii="Arial" w:eastAsia="Yu Gothic" w:hAnsi="Arial"/>
           <w:color w:val="5B6570"/>
           <w:sz w:val="16"/>
           <w:szCs w:val="16"/>
@@ -2793,7 +2777,7 @@
       </w:r>
       <w:r>
         <w:rPr>
-          <w:rFonts w:ascii="Arial" w:eastAsia="游ゴシック" w:hAnsi="Arial"/>
+          <w:rFonts w:ascii="Arial" w:eastAsia="Yu Gothic" w:hAnsi="Arial"/>
           <w:color w:val="5B6570"/>
           <w:sz w:val="16"/>
           <w:szCs w:val="16"/>
@@ -2802,7 +2786,7 @@
       </w:r>
       <w:r>
         <w:rPr>
-          <w:rFonts w:ascii="Arial" w:eastAsia="游ゴシック" w:hAnsi="Arial"/>
+          <w:rFonts w:ascii="Arial" w:eastAsia="Yu Gothic" w:hAnsi="Arial"/>
           <w:color w:val="5B6570"/>
           <w:sz w:val="16"/>
           <w:szCs w:val="16"/>
@@ -2811,7 +2795,7 @@
       </w:r>
       <w:r>
         <w:rPr>
-          <w:rFonts w:ascii="Arial" w:eastAsia="游ゴシック" w:hAnsi="Arial"/>
+          <w:rFonts w:ascii="Arial" w:eastAsia="Yu Gothic" w:hAnsi="Arial"/>
           <w:color w:val="5B6570"/>
           <w:sz w:val="16"/>
           <w:szCs w:val="16"/>
@@ -2820,7 +2804,7 @@
       </w:r>
       <w:r>
         <w:rPr>
-          <w:rFonts w:ascii="Arial" w:eastAsia="游ゴシック" w:hAnsi="Arial"/>
+          <w:rFonts w:ascii="Arial" w:eastAsia="Yu Gothic" w:hAnsi="Arial"/>
           <w:color w:val="5B6570"/>
           <w:sz w:val="16"/>
           <w:szCs w:val="16"/>
@@ -2829,7 +2813,7 @@
       </w:r>
       <w:r>
         <w:rPr>
-          <w:rFonts w:ascii="Arial" w:eastAsia="游ゴシック" w:hAnsi="Arial"/>
+          <w:rFonts w:ascii="Arial" w:eastAsia="Yu Gothic" w:hAnsi="Arial"/>
           <w:color w:val="5B6570"/>
           <w:sz w:val="16"/>
           <w:szCs w:val="16"/>
@@ -2838,7 +2822,7 @@
       </w:r>
       <w:r>
         <w:rPr>
-          <w:rFonts w:ascii="Arial" w:eastAsia="游ゴシック" w:hAnsi="Arial"/>
+          <w:rFonts w:ascii="Arial" w:eastAsia="Yu Gothic" w:hAnsi="Arial"/>
           <w:color w:val="5B6570"/>
           <w:sz w:val="16"/>
           <w:szCs w:val="16"/>
@@ -2847,7 +2831,7 @@
       </w:r>
       <w:r>
         <w:rPr>
-          <w:rFonts w:ascii="Arial" w:eastAsia="游ゴシック" w:hAnsi="Arial"/>
+          <w:rFonts w:ascii="Arial" w:eastAsia="Yu Gothic" w:hAnsi="Arial"/>
           <w:color w:val="5B6570"/>
           <w:sz w:val="16"/>
           <w:szCs w:val="16"/>
@@ -2856,7 +2840,7 @@
       </w:r>
       <w:r>
         <w:rPr>
-          <w:rFonts w:ascii="Arial" w:eastAsia="游ゴシック" w:hAnsi="Arial"/>
+          <w:rFonts w:ascii="Arial" w:eastAsia="Yu Gothic" w:hAnsi="Arial"/>
           <w:color w:val="5B6570"/>
           <w:sz w:val="16"/>
           <w:szCs w:val="16"/>
@@ -2865,7 +2849,7 @@
       </w:r>
       <w:r>
         <w:rPr>
-          <w:rFonts w:ascii="Arial" w:eastAsia="游ゴシック" w:hAnsi="Arial"/>
+          <w:rFonts w:ascii="Arial" w:eastAsia="Yu Gothic" w:hAnsi="Arial"/>
           <w:color w:val="5B6570"/>
           <w:sz w:val="16"/>
           <w:szCs w:val="16"/>
@@ -2878,10 +2862,23 @@
         <w:pStyle w:val="2"/>
         <w:keepNext/>
       </w:pPr>
-      <w:proofErr w:type="spellStart"/>
-      <w:proofErr w:type="spellEnd"/>
-      <w:r>
-        <w:t>3.2　AI 2：カメラ画像からの熊判定（YOLOv8）</w:t>
+      <w:r>
+        <w:t>3.2</w:t>
+      </w:r>
+      <w:r>
+        <w:t xml:space="preserve">　</w:t>
+      </w:r>
+      <w:r>
+        <w:t>AI 2</w:t>
+      </w:r>
+      <w:r>
+        <w:t>：カメラ画像からの熊判定（</w:t>
+      </w:r>
+      <w:r>
+        <w:t>YOLOv8</w:t>
+      </w:r>
+      <w:r>
+        <w:t>）</w:t>
       </w:r>
     </w:p>
     <w:p>
@@ -2977,6 +2974,7 @@
         <w:rPr>
           <w:noProof/>
         </w:rPr>
+        <w:lastRenderedPageBreak/>
         <w:drawing>
           <wp:inline distT="0" distB="0" distL="0" distR="0" wp14:anchorId="4C074C60" wp14:editId="4F09EBBF">
             <wp:extent cx="3520440" cy="1301305"/>
@@ -2995,7 +2993,7 @@
                     </pic:cNvPicPr>
                   </pic:nvPicPr>
                   <pic:blipFill>
-                    <a:blip r:embed="rId8"/>
+                    <a:blip r:embed="rId9"/>
                     <a:srcRect/>
                     <a:stretch>
                       <a:fillRect/>
@@ -3023,7 +3021,7 @@
       </w:pPr>
       <w:r>
         <w:rPr>
-          <w:rFonts w:ascii="Arial" w:eastAsia="游ゴシック" w:hAnsi="Arial"/>
+          <w:rFonts w:ascii="Arial" w:eastAsia="Yu Gothic" w:hAnsi="Arial"/>
           <w:b/>
           <w:bCs/>
           <w:sz w:val="16"/>
@@ -3033,7 +3031,7 @@
       </w:r>
       <w:r>
         <w:rPr>
-          <w:rFonts w:ascii="Arial" w:eastAsia="游ゴシック" w:hAnsi="Arial"/>
+          <w:rFonts w:ascii="Arial" w:eastAsia="Yu Gothic" w:hAnsi="Arial"/>
           <w:b/>
           <w:bCs/>
           <w:sz w:val="16"/>
@@ -3043,7 +3041,7 @@
       </w:r>
       <w:r>
         <w:rPr>
-          <w:rFonts w:ascii="Arial" w:eastAsia="游ゴシック" w:hAnsi="Arial"/>
+          <w:rFonts w:ascii="Arial" w:eastAsia="Yu Gothic" w:hAnsi="Arial"/>
           <w:b/>
           <w:bCs/>
           <w:sz w:val="16"/>
@@ -3053,7 +3051,7 @@
       </w:r>
       <w:r>
         <w:rPr>
-          <w:rFonts w:ascii="Arial" w:eastAsia="游ゴシック" w:hAnsi="Arial"/>
+          <w:rFonts w:ascii="Arial" w:eastAsia="Yu Gothic" w:hAnsi="Arial"/>
           <w:color w:val="5B6570"/>
           <w:sz w:val="16"/>
           <w:szCs w:val="16"/>
@@ -3062,7 +3060,7 @@
       </w:r>
       <w:r>
         <w:rPr>
-          <w:rFonts w:ascii="Arial" w:eastAsia="游ゴシック" w:hAnsi="Arial"/>
+          <w:rFonts w:ascii="Arial" w:eastAsia="Yu Gothic" w:hAnsi="Arial"/>
           <w:color w:val="5B6570"/>
           <w:sz w:val="16"/>
           <w:szCs w:val="16"/>
@@ -3071,7 +3069,7 @@
       </w:r>
       <w:r>
         <w:rPr>
-          <w:rFonts w:ascii="Arial" w:eastAsia="游ゴシック" w:hAnsi="Arial"/>
+          <w:rFonts w:ascii="Arial" w:eastAsia="Yu Gothic" w:hAnsi="Arial"/>
           <w:color w:val="5B6570"/>
           <w:sz w:val="16"/>
           <w:szCs w:val="16"/>
@@ -3080,7 +3078,7 @@
       </w:r>
       <w:r>
         <w:rPr>
-          <w:rFonts w:ascii="Arial" w:eastAsia="游ゴシック" w:hAnsi="Arial"/>
+          <w:rFonts w:ascii="Arial" w:eastAsia="Yu Gothic" w:hAnsi="Arial"/>
           <w:color w:val="5B6570"/>
           <w:sz w:val="16"/>
           <w:szCs w:val="16"/>
@@ -3089,7 +3087,7 @@
       </w:r>
       <w:r>
         <w:rPr>
-          <w:rFonts w:ascii="Arial" w:eastAsia="游ゴシック" w:hAnsi="Arial"/>
+          <w:rFonts w:ascii="Arial" w:eastAsia="Yu Gothic" w:hAnsi="Arial"/>
           <w:color w:val="5B6570"/>
           <w:sz w:val="16"/>
           <w:szCs w:val="16"/>
@@ -3098,7 +3096,7 @@
       </w:r>
       <w:r>
         <w:rPr>
-          <w:rFonts w:ascii="Arial" w:eastAsia="游ゴシック" w:hAnsi="Arial"/>
+          <w:rFonts w:ascii="Arial" w:eastAsia="Yu Gothic" w:hAnsi="Arial"/>
           <w:color w:val="5B6570"/>
           <w:sz w:val="16"/>
           <w:szCs w:val="16"/>
@@ -3107,7 +3105,7 @@
       </w:r>
       <w:r>
         <w:rPr>
-          <w:rFonts w:ascii="Arial" w:eastAsia="游ゴシック" w:hAnsi="Arial"/>
+          <w:rFonts w:ascii="Arial" w:eastAsia="Yu Gothic" w:hAnsi="Arial"/>
           <w:color w:val="5B6570"/>
           <w:sz w:val="16"/>
           <w:szCs w:val="16"/>
@@ -3116,7 +3114,7 @@
       </w:r>
       <w:r>
         <w:rPr>
-          <w:rFonts w:ascii="Arial" w:eastAsia="游ゴシック" w:hAnsi="Arial"/>
+          <w:rFonts w:ascii="Arial" w:eastAsia="Yu Gothic" w:hAnsi="Arial"/>
           <w:color w:val="5B6570"/>
           <w:sz w:val="16"/>
           <w:szCs w:val="16"/>
@@ -3125,7 +3123,7 @@
       </w:r>
       <w:r>
         <w:rPr>
-          <w:rFonts w:ascii="Arial" w:eastAsia="游ゴシック" w:hAnsi="Arial"/>
+          <w:rFonts w:ascii="Arial" w:eastAsia="Yu Gothic" w:hAnsi="Arial"/>
           <w:color w:val="5B6570"/>
           <w:sz w:val="16"/>
           <w:szCs w:val="16"/>
@@ -3134,7 +3132,7 @@
       </w:r>
       <w:r>
         <w:rPr>
-          <w:rFonts w:ascii="Arial" w:eastAsia="游ゴシック" w:hAnsi="Arial"/>
+          <w:rFonts w:ascii="Arial" w:eastAsia="Yu Gothic" w:hAnsi="Arial"/>
           <w:color w:val="5B6570"/>
           <w:sz w:val="16"/>
           <w:szCs w:val="16"/>
@@ -3143,7 +3141,7 @@
       </w:r>
       <w:r>
         <w:rPr>
-          <w:rFonts w:ascii="Arial" w:eastAsia="游ゴシック" w:hAnsi="Arial"/>
+          <w:rFonts w:ascii="Arial" w:eastAsia="Yu Gothic" w:hAnsi="Arial"/>
           <w:color w:val="5B6570"/>
           <w:sz w:val="16"/>
           <w:szCs w:val="16"/>
@@ -3152,7 +3150,7 @@
       </w:r>
       <w:r>
         <w:rPr>
-          <w:rFonts w:ascii="Arial" w:eastAsia="游ゴシック" w:hAnsi="Arial"/>
+          <w:rFonts w:ascii="Arial" w:eastAsia="Yu Gothic" w:hAnsi="Arial"/>
           <w:color w:val="5B6570"/>
           <w:sz w:val="16"/>
           <w:szCs w:val="16"/>
@@ -3161,7 +3159,7 @@
       </w:r>
       <w:r>
         <w:rPr>
-          <w:rFonts w:ascii="Arial" w:eastAsia="游ゴシック" w:hAnsi="Arial"/>
+          <w:rFonts w:ascii="Arial" w:eastAsia="Yu Gothic" w:hAnsi="Arial"/>
           <w:color w:val="5B6570"/>
           <w:sz w:val="16"/>
           <w:szCs w:val="16"/>
@@ -3170,7 +3168,7 @@
       </w:r>
       <w:r>
         <w:rPr>
-          <w:rFonts w:ascii="Arial" w:eastAsia="游ゴシック" w:hAnsi="Arial"/>
+          <w:rFonts w:ascii="Arial" w:eastAsia="Yu Gothic" w:hAnsi="Arial"/>
           <w:color w:val="5B6570"/>
           <w:sz w:val="16"/>
           <w:szCs w:val="16"/>
@@ -3179,7 +3177,7 @@
       </w:r>
       <w:r>
         <w:rPr>
-          <w:rFonts w:ascii="Arial" w:eastAsia="游ゴシック" w:hAnsi="Arial"/>
+          <w:rFonts w:ascii="Arial" w:eastAsia="Yu Gothic" w:hAnsi="Arial"/>
           <w:color w:val="5B6570"/>
           <w:sz w:val="16"/>
           <w:szCs w:val="16"/>
@@ -3195,7 +3193,7 @@
       <w:proofErr w:type="spellStart"/>
       <w:r>
         <w:rPr>
-          <w:rFonts w:ascii="Consolas" w:eastAsia="游ゴシック" w:hAnsi="Consolas"/>
+          <w:rFonts w:ascii="Consolas" w:eastAsia="Yu Gothic" w:hAnsi="Consolas"/>
           <w:sz w:val="17"/>
           <w:szCs w:val="17"/>
         </w:rPr>
@@ -3283,7 +3281,7 @@
             </w:pPr>
             <w:r>
               <w:rPr>
-                <w:rFonts w:ascii="Arial" w:eastAsia="游ゴシック" w:hAnsi="Arial"/>
+                <w:rFonts w:ascii="Arial" w:eastAsia="Yu Gothic" w:hAnsi="Arial"/>
                 <w:b/>
                 <w:bCs/>
                 <w:sz w:val="16"/>
@@ -3293,7 +3291,7 @@
             </w:r>
             <w:r>
               <w:rPr>
-                <w:rFonts w:ascii="Arial" w:eastAsia="游ゴシック" w:hAnsi="Arial"/>
+                <w:rFonts w:ascii="Arial" w:eastAsia="Yu Gothic" w:hAnsi="Arial"/>
                 <w:b/>
                 <w:bCs/>
                 <w:sz w:val="16"/>
@@ -3303,7 +3301,7 @@
             </w:r>
             <w:r>
               <w:rPr>
-                <w:rFonts w:ascii="Arial" w:eastAsia="游ゴシック" w:hAnsi="Arial"/>
+                <w:rFonts w:ascii="Arial" w:eastAsia="Yu Gothic" w:hAnsi="Arial"/>
                 <w:b/>
                 <w:bCs/>
                 <w:sz w:val="16"/>
@@ -3313,7 +3311,7 @@
             </w:r>
             <w:r>
               <w:rPr>
-                <w:rFonts w:ascii="Arial" w:eastAsia="游ゴシック" w:hAnsi="Arial"/>
+                <w:rFonts w:ascii="Arial" w:eastAsia="Yu Gothic" w:hAnsi="Arial"/>
                 <w:b/>
                 <w:bCs/>
                 <w:sz w:val="16"/>
@@ -3345,7 +3343,7 @@
             </w:pPr>
             <w:r>
               <w:rPr>
-                <w:rFonts w:ascii="Arial" w:eastAsia="游ゴシック" w:hAnsi="Arial"/>
+                <w:rFonts w:ascii="Arial" w:eastAsia="Yu Gothic" w:hAnsi="Arial"/>
                 <w:b/>
                 <w:bCs/>
                 <w:sz w:val="16"/>
@@ -3355,7 +3353,7 @@
             </w:r>
             <w:r>
               <w:rPr>
-                <w:rFonts w:ascii="Arial" w:eastAsia="游ゴシック" w:hAnsi="Arial"/>
+                <w:rFonts w:ascii="Arial" w:eastAsia="Yu Gothic" w:hAnsi="Arial"/>
                 <w:b/>
                 <w:bCs/>
                 <w:sz w:val="16"/>
@@ -3365,7 +3363,7 @@
             </w:r>
             <w:r>
               <w:rPr>
-                <w:rFonts w:ascii="Arial" w:eastAsia="游ゴシック" w:hAnsi="Arial"/>
+                <w:rFonts w:ascii="Arial" w:eastAsia="Yu Gothic" w:hAnsi="Arial"/>
                 <w:b/>
                 <w:bCs/>
                 <w:sz w:val="16"/>
@@ -3375,7 +3373,7 @@
             </w:r>
             <w:r>
               <w:rPr>
-                <w:rFonts w:ascii="Arial" w:eastAsia="游ゴシック" w:hAnsi="Arial"/>
+                <w:rFonts w:ascii="Arial" w:eastAsia="Yu Gothic" w:hAnsi="Arial"/>
                 <w:b/>
                 <w:bCs/>
                 <w:sz w:val="16"/>
@@ -3407,7 +3405,7 @@
             </w:pPr>
             <w:r>
               <w:rPr>
-                <w:rFonts w:ascii="Arial" w:eastAsia="游ゴシック" w:hAnsi="Arial"/>
+                <w:rFonts w:ascii="Arial" w:eastAsia="Yu Gothic" w:hAnsi="Arial"/>
                 <w:b/>
                 <w:bCs/>
                 <w:sz w:val="16"/>
@@ -3439,7 +3437,7 @@
             </w:pPr>
             <w:r>
               <w:rPr>
-                <w:rFonts w:ascii="Arial" w:eastAsia="游ゴシック" w:hAnsi="Arial"/>
+                <w:rFonts w:ascii="Arial" w:eastAsia="Yu Gothic" w:hAnsi="Arial"/>
                 <w:b/>
                 <w:bCs/>
                 <w:sz w:val="16"/>
@@ -3476,7 +3474,7 @@
             </w:pPr>
             <w:r>
               <w:rPr>
-                <w:rFonts w:ascii="Arial" w:eastAsia="游ゴシック" w:hAnsi="Arial"/>
+                <w:rFonts w:ascii="Arial" w:eastAsia="Yu Gothic" w:hAnsi="Arial"/>
                 <w:sz w:val="16"/>
                 <w:szCs w:val="16"/>
               </w:rPr>
@@ -3506,7 +3504,7 @@
             </w:pPr>
             <w:r>
               <w:rPr>
-                <w:rFonts w:ascii="Arial" w:eastAsia="游ゴシック" w:hAnsi="Arial"/>
+                <w:rFonts w:ascii="Arial" w:eastAsia="Yu Gothic" w:hAnsi="Arial"/>
                 <w:sz w:val="16"/>
                 <w:szCs w:val="16"/>
               </w:rPr>
@@ -3536,7 +3534,7 @@
             </w:pPr>
             <w:r>
               <w:rPr>
-                <w:rFonts w:ascii="Arial" w:eastAsia="游ゴシック" w:hAnsi="Arial"/>
+                <w:rFonts w:ascii="Arial" w:eastAsia="Yu Gothic" w:hAnsi="Arial"/>
                 <w:sz w:val="16"/>
                 <w:szCs w:val="16"/>
               </w:rPr>
@@ -3566,7 +3564,7 @@
             </w:pPr>
             <w:r>
               <w:rPr>
-                <w:rFonts w:ascii="Arial" w:eastAsia="游ゴシック" w:hAnsi="Arial"/>
+                <w:rFonts w:ascii="Arial" w:eastAsia="Yu Gothic" w:hAnsi="Arial"/>
                 <w:sz w:val="16"/>
                 <w:szCs w:val="16"/>
               </w:rPr>
@@ -3582,22 +3580,105 @@
       </w:pPr>
       <w:r>
         <w:rPr>
-          <w:rFonts w:ascii="Arial" w:eastAsia="游ゴシック" w:hAnsi="Arial"/>
+          <w:rFonts w:ascii="Arial" w:eastAsia="Yu Gothic" w:hAnsi="Arial"/>
           <w:b/>
           <w:bCs/>
           <w:sz w:val="16"/>
           <w:szCs w:val="16"/>
         </w:rPr>
-        <w:t xml:space="preserve">表3　</w:t>
-      </w:r>
-      <w:r>
-        <w:rPr>
-          <w:rFonts w:ascii="Arial" w:eastAsia="游ゴシック" w:hAnsi="Arial"/>
-          <w:color w:val="5B6570"/>
-          <w:sz w:val="16"/>
-          <w:szCs w:val="16"/>
-        </w:rPr>
-        <w:t>YOLOv8 の熊判定の精度（Gazebo 画像の検証データ 105 枚と、巡回中の 11 視点）。</w:t>
+        <w:t>表</w:t>
+      </w:r>
+      <w:r>
+        <w:rPr>
+          <w:rFonts w:ascii="Arial" w:eastAsia="Yu Gothic" w:hAnsi="Arial" w:hint="eastAsia"/>
+          <w:b/>
+          <w:bCs/>
+          <w:sz w:val="16"/>
+          <w:szCs w:val="16"/>
+        </w:rPr>
+        <w:t>2</w:t>
+      </w:r>
+      <w:r>
+        <w:rPr>
+          <w:rFonts w:ascii="Arial" w:eastAsia="Yu Gothic" w:hAnsi="Arial"/>
+          <w:b/>
+          <w:bCs/>
+          <w:sz w:val="16"/>
+          <w:szCs w:val="16"/>
+        </w:rPr>
+        <w:t xml:space="preserve">　</w:t>
+      </w:r>
+      <w:r>
+        <w:rPr>
+          <w:rFonts w:ascii="Arial" w:eastAsia="Yu Gothic" w:hAnsi="Arial"/>
+          <w:color w:val="5B6570"/>
+          <w:sz w:val="16"/>
+          <w:szCs w:val="16"/>
+        </w:rPr>
+        <w:t xml:space="preserve">YOLOv8 </w:t>
+      </w:r>
+      <w:r>
+        <w:rPr>
+          <w:rFonts w:ascii="Arial" w:eastAsia="Yu Gothic" w:hAnsi="Arial"/>
+          <w:color w:val="5B6570"/>
+          <w:sz w:val="16"/>
+          <w:szCs w:val="16"/>
+        </w:rPr>
+        <w:t>の熊判定の精度（</w:t>
+      </w:r>
+      <w:r>
+        <w:rPr>
+          <w:rFonts w:ascii="Arial" w:eastAsia="Yu Gothic" w:hAnsi="Arial"/>
+          <w:color w:val="5B6570"/>
+          <w:sz w:val="16"/>
+          <w:szCs w:val="16"/>
+        </w:rPr>
+        <w:t xml:space="preserve">Gazebo </w:t>
+      </w:r>
+      <w:r>
+        <w:rPr>
+          <w:rFonts w:ascii="Arial" w:eastAsia="Yu Gothic" w:hAnsi="Arial"/>
+          <w:color w:val="5B6570"/>
+          <w:sz w:val="16"/>
+          <w:szCs w:val="16"/>
+        </w:rPr>
+        <w:t>画像の検証データ</w:t>
+      </w:r>
+      <w:r>
+        <w:rPr>
+          <w:rFonts w:ascii="Arial" w:eastAsia="Yu Gothic" w:hAnsi="Arial"/>
+          <w:color w:val="5B6570"/>
+          <w:sz w:val="16"/>
+          <w:szCs w:val="16"/>
+        </w:rPr>
+        <w:t xml:space="preserve"> 105 </w:t>
+      </w:r>
+      <w:r>
+        <w:rPr>
+          <w:rFonts w:ascii="Arial" w:eastAsia="Yu Gothic" w:hAnsi="Arial"/>
+          <w:color w:val="5B6570"/>
+          <w:sz w:val="16"/>
+          <w:szCs w:val="16"/>
+        </w:rPr>
+        <w:t>枚と、巡回中の</w:t>
+      </w:r>
+      <w:r>
+        <w:rPr>
+          <w:rFonts w:ascii="Arial" w:eastAsia="Yu Gothic" w:hAnsi="Arial"/>
+          <w:color w:val="5B6570"/>
+          <w:sz w:val="16"/>
+          <w:szCs w:val="16"/>
+        </w:rPr>
+        <w:t xml:space="preserve"> 11 </w:t>
+      </w:r>
+      <w:r>
+        <w:rPr>
+          <w:rFonts w:ascii="Arial" w:eastAsia="Yu Gothic" w:hAnsi="Arial"/>
+          <w:color w:val="5B6570"/>
+          <w:sz w:val="16"/>
+          <w:szCs w:val="16"/>
+        </w:rPr>
+        <w:t>視点）。</w:t>
       </w:r>
     </w:p>
     <w:p>
@@ -3681,7 +3762,25 @@
         <w:rPr>
           <w:color w:val="1F5F8B"/>
         </w:rPr>
-        <w:t>4　ROS 2 ノード構成</w:t>
+        <w:t>4</w:t>
+      </w:r>
+      <w:r>
+        <w:rPr>
+          <w:color w:val="1F5F8B"/>
+        </w:rPr>
+        <w:t xml:space="preserve">　</w:t>
+      </w:r>
+      <w:r>
+        <w:rPr>
+          <w:color w:val="1F5F8B"/>
+        </w:rPr>
+        <w:t xml:space="preserve">ROS 2 </w:t>
+      </w:r>
+      <w:r>
+        <w:rPr>
+          <w:color w:val="1F5F8B"/>
+        </w:rPr>
+        <w:t>ノード構成</w:t>
       </w:r>
     </w:p>
     <w:p>
@@ -3705,7 +3804,10 @@
         <w:t>パッケージで構成した（表</w:t>
       </w:r>
       <w:r>
-        <w:t>1</w:t>
+        <w:rPr>
+          <w:rFonts w:hint="eastAsia"/>
+        </w:rPr>
+        <w:t>3</w:t>
       </w:r>
       <w:r>
         <w:t>）。ワールドと</w:t>
@@ -3719,7 +3821,7 @@
       <w:proofErr w:type="spellStart"/>
       <w:r>
         <w:rPr>
-          <w:rFonts w:ascii="Consolas" w:eastAsia="游ゴシック" w:hAnsi="Consolas"/>
+          <w:rFonts w:ascii="Consolas" w:eastAsia="Yu Gothic" w:hAnsi="Consolas"/>
           <w:sz w:val="17"/>
           <w:szCs w:val="17"/>
         </w:rPr>
@@ -3790,13 +3892,12 @@
             </w:pPr>
             <w:r>
               <w:rPr>
-                <w:rFonts w:ascii="Arial" w:eastAsia="游ゴシック" w:hAnsi="Arial"/>
+                <w:rFonts w:ascii="Arial" w:eastAsia="Yu Gothic" w:hAnsi="Arial"/>
                 <w:b/>
                 <w:bCs/>
                 <w:sz w:val="16"/>
                 <w:szCs w:val="16"/>
               </w:rPr>
-              <w:lastRenderedPageBreak/>
               <w:t>ノード</w:t>
             </w:r>
           </w:p>
@@ -3823,7 +3924,7 @@
             </w:pPr>
             <w:r>
               <w:rPr>
-                <w:rFonts w:ascii="Arial" w:eastAsia="游ゴシック" w:hAnsi="Arial"/>
+                <w:rFonts w:ascii="Arial" w:eastAsia="Yu Gothic" w:hAnsi="Arial"/>
                 <w:b/>
                 <w:bCs/>
                 <w:sz w:val="16"/>
@@ -3861,7 +3962,7 @@
             <w:proofErr w:type="spellStart"/>
             <w:r>
               <w:rPr>
-                <w:rFonts w:ascii="Arial" w:eastAsia="游ゴシック" w:hAnsi="Arial"/>
+                <w:rFonts w:ascii="Arial" w:eastAsia="Yu Gothic" w:hAnsi="Arial"/>
                 <w:sz w:val="16"/>
                 <w:szCs w:val="16"/>
               </w:rPr>
@@ -3892,7 +3993,7 @@
             </w:pPr>
             <w:r>
               <w:rPr>
-                <w:rFonts w:ascii="Arial" w:eastAsia="游ゴシック" w:hAnsi="Arial"/>
+                <w:rFonts w:ascii="Arial" w:eastAsia="Yu Gothic" w:hAnsi="Arial"/>
                 <w:sz w:val="16"/>
                 <w:szCs w:val="16"/>
               </w:rPr>
@@ -3900,7 +4001,7 @@
             </w:r>
             <w:r>
               <w:rPr>
-                <w:rFonts w:ascii="Arial" w:eastAsia="游ゴシック" w:hAnsi="Arial"/>
+                <w:rFonts w:ascii="Arial" w:eastAsia="Yu Gothic" w:hAnsi="Arial"/>
                 <w:sz w:val="16"/>
                 <w:szCs w:val="16"/>
               </w:rPr>
@@ -3908,7 +4009,7 @@
             </w:r>
             <w:r>
               <w:rPr>
-                <w:rFonts w:ascii="Arial" w:eastAsia="游ゴシック" w:hAnsi="Arial"/>
+                <w:rFonts w:ascii="Arial" w:eastAsia="Yu Gothic" w:hAnsi="Arial"/>
                 <w:sz w:val="16"/>
                 <w:szCs w:val="16"/>
               </w:rPr>
@@ -3916,7 +4017,7 @@
             </w:r>
             <w:r>
               <w:rPr>
-                <w:rFonts w:ascii="Arial" w:eastAsia="游ゴシック" w:hAnsi="Arial"/>
+                <w:rFonts w:ascii="Arial" w:eastAsia="Yu Gothic" w:hAnsi="Arial"/>
                 <w:sz w:val="16"/>
                 <w:szCs w:val="16"/>
               </w:rPr>
@@ -3924,7 +4025,7 @@
             </w:r>
             <w:r>
               <w:rPr>
-                <w:rFonts w:ascii="Arial" w:eastAsia="游ゴシック" w:hAnsi="Arial"/>
+                <w:rFonts w:ascii="Arial" w:eastAsia="Yu Gothic" w:hAnsi="Arial"/>
                 <w:sz w:val="16"/>
                 <w:szCs w:val="16"/>
               </w:rPr>
@@ -3932,7 +4033,7 @@
             </w:r>
             <w:r>
               <w:rPr>
-                <w:rFonts w:ascii="Arial" w:eastAsia="游ゴシック" w:hAnsi="Arial"/>
+                <w:rFonts w:ascii="Arial" w:eastAsia="Yu Gothic" w:hAnsi="Arial"/>
                 <w:sz w:val="16"/>
                 <w:szCs w:val="16"/>
               </w:rPr>
@@ -3968,7 +4069,7 @@
             <w:proofErr w:type="spellStart"/>
             <w:r>
               <w:rPr>
-                <w:rFonts w:ascii="Arial" w:eastAsia="游ゴシック" w:hAnsi="Arial"/>
+                <w:rFonts w:ascii="Arial" w:eastAsia="Yu Gothic" w:hAnsi="Arial"/>
                 <w:sz w:val="16"/>
                 <w:szCs w:val="16"/>
               </w:rPr>
@@ -3999,11 +4100,27 @@
             </w:pPr>
             <w:r>
               <w:rPr>
-                <w:rFonts w:ascii="Arial" w:eastAsia="游ゴシック" w:hAnsi="Arial"/>
-                <w:sz w:val="16"/>
-                <w:szCs w:val="16"/>
-              </w:rPr>
-              <w:t>地点選択・巡回順の決定、Nav2 への移動指示、熊検知時の停止・記録・安全地点への退避、結果表示（状態機械）</w:t>
+                <w:rFonts w:ascii="Arial" w:eastAsia="Yu Gothic" w:hAnsi="Arial"/>
+                <w:sz w:val="16"/>
+                <w:szCs w:val="16"/>
+              </w:rPr>
+              <w:t>地点選択・巡回順の決定、</w:t>
+            </w:r>
+            <w:r>
+              <w:rPr>
+                <w:rFonts w:ascii="Arial" w:eastAsia="Yu Gothic" w:hAnsi="Arial"/>
+                <w:sz w:val="16"/>
+                <w:szCs w:val="16"/>
+              </w:rPr>
+              <w:t xml:space="preserve">Nav2 </w:t>
+            </w:r>
+            <w:r>
+              <w:rPr>
+                <w:rFonts w:ascii="Arial" w:eastAsia="Yu Gothic" w:hAnsi="Arial"/>
+                <w:sz w:val="16"/>
+                <w:szCs w:val="16"/>
+              </w:rPr>
+              <w:t>への移動指示、熊検知時の停止・記録・安全地点への退避、結果表示（状態機械）</w:t>
             </w:r>
           </w:p>
         </w:tc>
@@ -4035,7 +4152,7 @@
             <w:proofErr w:type="spellStart"/>
             <w:r>
               <w:rPr>
-                <w:rFonts w:ascii="Arial" w:eastAsia="游ゴシック" w:hAnsi="Arial"/>
+                <w:rFonts w:ascii="Arial" w:eastAsia="Yu Gothic" w:hAnsi="Arial"/>
                 <w:sz w:val="16"/>
                 <w:szCs w:val="16"/>
               </w:rPr>
@@ -4066,7 +4183,7 @@
             </w:pPr>
             <w:r>
               <w:rPr>
-                <w:rFonts w:ascii="Arial" w:eastAsia="游ゴシック" w:hAnsi="Arial"/>
+                <w:rFonts w:ascii="Arial" w:eastAsia="Yu Gothic" w:hAnsi="Arial"/>
                 <w:sz w:val="16"/>
                 <w:szCs w:val="16"/>
               </w:rPr>
@@ -4074,7 +4191,7 @@
             </w:r>
             <w:r>
               <w:rPr>
-                <w:rFonts w:ascii="Arial" w:eastAsia="游ゴシック" w:hAnsi="Arial"/>
+                <w:rFonts w:ascii="Arial" w:eastAsia="Yu Gothic" w:hAnsi="Arial"/>
                 <w:sz w:val="16"/>
                 <w:szCs w:val="16"/>
               </w:rPr>
@@ -4082,7 +4199,7 @@
             </w:r>
             <w:r>
               <w:rPr>
-                <w:rFonts w:ascii="Arial" w:eastAsia="游ゴシック" w:hAnsi="Arial"/>
+                <w:rFonts w:ascii="Arial" w:eastAsia="Yu Gothic" w:hAnsi="Arial"/>
                 <w:sz w:val="16"/>
                 <w:szCs w:val="16"/>
               </w:rPr>
@@ -4090,7 +4207,7 @@
             </w:r>
             <w:r>
               <w:rPr>
-                <w:rFonts w:ascii="Arial" w:eastAsia="游ゴシック" w:hAnsi="Arial"/>
+                <w:rFonts w:ascii="Arial" w:eastAsia="Yu Gothic" w:hAnsi="Arial"/>
                 <w:sz w:val="16"/>
                 <w:szCs w:val="16"/>
               </w:rPr>
@@ -4098,7 +4215,7 @@
             </w:r>
             <w:r>
               <w:rPr>
-                <w:rFonts w:ascii="Arial" w:eastAsia="游ゴシック" w:hAnsi="Arial"/>
+                <w:rFonts w:ascii="Arial" w:eastAsia="Yu Gothic" w:hAnsi="Arial"/>
                 <w:sz w:val="16"/>
                 <w:szCs w:val="16"/>
               </w:rPr>
@@ -4134,7 +4251,7 @@
             <w:proofErr w:type="spellStart"/>
             <w:r>
               <w:rPr>
-                <w:rFonts w:ascii="Arial" w:eastAsia="游ゴシック" w:hAnsi="Arial"/>
+                <w:rFonts w:ascii="Arial" w:eastAsia="Yu Gothic" w:hAnsi="Arial"/>
                 <w:sz w:val="16"/>
                 <w:szCs w:val="16"/>
               </w:rPr>
@@ -4165,7 +4282,7 @@
             </w:pPr>
             <w:r>
               <w:rPr>
-                <w:rFonts w:ascii="Arial" w:eastAsia="游ゴシック" w:hAnsi="Arial"/>
+                <w:rFonts w:ascii="Arial" w:eastAsia="Yu Gothic" w:hAnsi="Arial"/>
                 <w:sz w:val="16"/>
                 <w:szCs w:val="16"/>
               </w:rPr>
@@ -4201,7 +4318,7 @@
             <w:proofErr w:type="spellStart"/>
             <w:r>
               <w:rPr>
-                <w:rFonts w:ascii="Arial" w:eastAsia="游ゴシック" w:hAnsi="Arial"/>
+                <w:rFonts w:ascii="Arial" w:eastAsia="Yu Gothic" w:hAnsi="Arial"/>
                 <w:sz w:val="16"/>
                 <w:szCs w:val="16"/>
               </w:rPr>
@@ -4232,7 +4349,7 @@
             </w:pPr>
             <w:r>
               <w:rPr>
-                <w:rFonts w:ascii="Arial" w:eastAsia="游ゴシック" w:hAnsi="Arial"/>
+                <w:rFonts w:ascii="Arial" w:eastAsia="Yu Gothic" w:hAnsi="Arial"/>
                 <w:sz w:val="16"/>
                 <w:szCs w:val="16"/>
               </w:rPr>
@@ -4248,7 +4365,7 @@
       </w:pPr>
       <w:r>
         <w:rPr>
-          <w:rFonts w:ascii="Arial" w:eastAsia="游ゴシック" w:hAnsi="Arial"/>
+          <w:rFonts w:ascii="Arial" w:eastAsia="Yu Gothic" w:hAnsi="Arial"/>
           <w:b/>
           <w:bCs/>
           <w:sz w:val="16"/>
@@ -4258,17 +4375,17 @@
       </w:r>
       <w:r>
         <w:rPr>
-          <w:rFonts w:ascii="Arial" w:eastAsia="游ゴシック" w:hAnsi="Arial"/>
+          <w:rFonts w:ascii="Arial" w:eastAsia="Yu Gothic" w:hAnsi="Arial" w:hint="eastAsia"/>
           <w:b/>
           <w:bCs/>
           <w:sz w:val="16"/>
           <w:szCs w:val="16"/>
         </w:rPr>
-        <w:t>1</w:t>
-      </w:r>
-      <w:r>
-        <w:rPr>
-          <w:rFonts w:ascii="Arial" w:eastAsia="游ゴシック" w:hAnsi="Arial"/>
+        <w:t>3</w:t>
+      </w:r>
+      <w:r>
+        <w:rPr>
+          <w:rFonts w:ascii="Arial" w:eastAsia="Yu Gothic" w:hAnsi="Arial"/>
           <w:b/>
           <w:bCs/>
           <w:sz w:val="16"/>
@@ -4278,7 +4395,7 @@
       </w:r>
       <w:r>
         <w:rPr>
-          <w:rFonts w:ascii="Arial" w:eastAsia="游ゴシック" w:hAnsi="Arial"/>
+          <w:rFonts w:ascii="Arial" w:eastAsia="Yu Gothic" w:hAnsi="Arial"/>
           <w:color w:val="5B6570"/>
           <w:sz w:val="16"/>
           <w:szCs w:val="16"/>
@@ -4287,7 +4404,7 @@
       </w:r>
       <w:r>
         <w:rPr>
-          <w:rFonts w:ascii="Arial" w:eastAsia="游ゴシック" w:hAnsi="Arial"/>
+          <w:rFonts w:ascii="Arial" w:eastAsia="Yu Gothic" w:hAnsi="Arial"/>
           <w:color w:val="5B6570"/>
           <w:sz w:val="16"/>
           <w:szCs w:val="16"/>
@@ -4296,7 +4413,7 @@
       </w:r>
       <w:r>
         <w:rPr>
-          <w:rFonts w:ascii="Arial" w:eastAsia="游ゴシック" w:hAnsi="Arial"/>
+          <w:rFonts w:ascii="Arial" w:eastAsia="Yu Gothic" w:hAnsi="Arial"/>
           <w:color w:val="5B6570"/>
           <w:sz w:val="16"/>
           <w:szCs w:val="16"/>
@@ -4305,7 +4422,7 @@
       </w:r>
       <w:r>
         <w:rPr>
-          <w:rFonts w:ascii="Arial" w:eastAsia="游ゴシック" w:hAnsi="Arial"/>
+          <w:rFonts w:ascii="Arial" w:eastAsia="Yu Gothic" w:hAnsi="Arial"/>
           <w:color w:val="5B6570"/>
           <w:sz w:val="16"/>
           <w:szCs w:val="16"/>
@@ -4314,7 +4431,7 @@
       </w:r>
       <w:r>
         <w:rPr>
-          <w:rFonts w:ascii="Arial" w:eastAsia="游ゴシック" w:hAnsi="Arial"/>
+          <w:rFonts w:ascii="Arial" w:eastAsia="Yu Gothic" w:hAnsi="Arial"/>
           <w:color w:val="5B6570"/>
           <w:sz w:val="16"/>
           <w:szCs w:val="16"/>
@@ -4323,7 +4440,7 @@
       </w:r>
       <w:r>
         <w:rPr>
-          <w:rFonts w:ascii="Arial" w:eastAsia="游ゴシック" w:hAnsi="Arial"/>
+          <w:rFonts w:ascii="Arial" w:eastAsia="Yu Gothic" w:hAnsi="Arial"/>
           <w:color w:val="5B6570"/>
           <w:sz w:val="16"/>
           <w:szCs w:val="16"/>
@@ -4332,7 +4449,7 @@
       </w:r>
       <w:r>
         <w:rPr>
-          <w:rFonts w:ascii="Arial" w:eastAsia="游ゴシック" w:hAnsi="Arial"/>
+          <w:rFonts w:ascii="Arial" w:eastAsia="Yu Gothic" w:hAnsi="Arial"/>
           <w:color w:val="5B6570"/>
           <w:sz w:val="16"/>
           <w:szCs w:val="16"/>
@@ -4352,7 +4469,25 @@
         <w:rPr>
           <w:color w:val="1F5F8B"/>
         </w:rPr>
-        <w:t>5　Gazebo での実行結果</w:t>
+        <w:t>5</w:t>
+      </w:r>
+      <w:r>
+        <w:rPr>
+          <w:color w:val="1F5F8B"/>
+        </w:rPr>
+        <w:t xml:space="preserve">　</w:t>
+      </w:r>
+      <w:r>
+        <w:rPr>
+          <w:color w:val="1F5F8B"/>
+        </w:rPr>
+        <w:t xml:space="preserve">Gazebo </w:t>
+      </w:r>
+      <w:r>
+        <w:rPr>
+          <w:color w:val="1F5F8B"/>
+        </w:rPr>
+        <w:t>での実行結果</w:t>
       </w:r>
     </w:p>
     <w:p>
@@ -4360,10 +4495,156 @@
         <w:spacing w:after="100"/>
         <w:jc w:val="both"/>
       </w:pPr>
-      <w:proofErr w:type="spellStart"/>
-      <w:proofErr w:type="spellEnd"/>
-      <w:r>
-        <w:t>講義の演習環境（Docker イメージ airobotbook/ros2-desktop-ai-robot-book-humble、Happy Mini、GPU なし）で、Gazebo・Navigation2・YOLOv8 をすべて動かして AI ルートを 1 回走らせた（図3、提出動画）。ロボットは詰所から P2 へ向かい、YOLOv8 がカメラ画像から熊を検知した（信頼度 0.75、距離 4.0 m）。停止して位置・時刻・信頼度を記録し、安全地点への退避を試みた。次に P4 へ向かう途中で 2 頭目を検知し（信頼度 0.82、距離 3.9 m）、停止・記録のあと安全地点へ退避した。その後 P3 に到着して熊がいないことを確認し、詰所に帰還した。3 地点すべてを確認し、熊は 2 頭、移動距離は 31.4 m、所要時間は 173 秒（シミュレーション時間）だった。なお Happy Mini のカメラ画像には車体の一部（黄色い帯とロゴの裏側）が映り込んでいたが、熊は検知できた。</w:t>
+      <w:r>
+        <w:t>講義の演習環境（</w:t>
+      </w:r>
+      <w:r>
+        <w:t xml:space="preserve">Docker </w:t>
+      </w:r>
+      <w:r>
+        <w:t>イメージ</w:t>
+      </w:r>
+      <w:r>
+        <w:t xml:space="preserve"> airobotbook/ros2-desktop-ai-robot-book-humble</w:t>
+      </w:r>
+      <w:r>
+        <w:t>、</w:t>
+      </w:r>
+      <w:r>
+        <w:t>Happy Mini</w:t>
+      </w:r>
+      <w:r>
+        <w:t>、</w:t>
+      </w:r>
+      <w:r>
+        <w:t xml:space="preserve">GPU </w:t>
+      </w:r>
+      <w:r>
+        <w:t>なし）で、</w:t>
+      </w:r>
+      <w:r>
+        <w:t>Gazebo</w:t>
+      </w:r>
+      <w:r>
+        <w:t>・</w:t>
+      </w:r>
+      <w:r>
+        <w:t>Navigation2</w:t>
+      </w:r>
+      <w:r>
+        <w:t>・</w:t>
+      </w:r>
+      <w:r>
+        <w:t xml:space="preserve">YOLOv8 </w:t>
+      </w:r>
+      <w:r>
+        <w:t>をすべて動かして</w:t>
+      </w:r>
+      <w:r>
+        <w:t xml:space="preserve"> AI </w:t>
+      </w:r>
+      <w:r>
+        <w:t>ルートを</w:t>
+      </w:r>
+      <w:r>
+        <w:t xml:space="preserve"> 1 </w:t>
+      </w:r>
+      <w:r>
+        <w:t>回走らせた（図</w:t>
+      </w:r>
+      <w:r>
+        <w:t>3</w:t>
+      </w:r>
+      <w:r>
+        <w:t>、提出動画）。ロボットは詰所から</w:t>
+      </w:r>
+      <w:r>
+        <w:t xml:space="preserve"> P2 </w:t>
+      </w:r>
+      <w:r>
+        <w:t>へ向かい、</w:t>
+      </w:r>
+      <w:r>
+        <w:t xml:space="preserve">YOLOv8 </w:t>
+      </w:r>
+      <w:r>
+        <w:t>がカメラ画像から熊を検知した（信頼度</w:t>
+      </w:r>
+      <w:r>
+        <w:t xml:space="preserve"> 0.75</w:t>
+      </w:r>
+      <w:r>
+        <w:t>、距離</w:t>
+      </w:r>
+      <w:r>
+        <w:t xml:space="preserve"> 4.0 m</w:t>
+      </w:r>
+      <w:r>
+        <w:t>）。停止して位置・時刻・信頼度を</w:t>
+      </w:r>
+      <w:r>
+        <w:lastRenderedPageBreak/>
+        <w:t>記録し、安全地点への退避を試みた。次に</w:t>
+      </w:r>
+      <w:r>
+        <w:t xml:space="preserve"> P4 </w:t>
+      </w:r>
+      <w:r>
+        <w:t>へ向かう途中で</w:t>
+      </w:r>
+      <w:r>
+        <w:t xml:space="preserve"> 2 </w:t>
+      </w:r>
+      <w:r>
+        <w:t>頭目を検知し（信頼度</w:t>
+      </w:r>
+      <w:r>
+        <w:t xml:space="preserve"> 0.82</w:t>
+      </w:r>
+      <w:r>
+        <w:t>、距離</w:t>
+      </w:r>
+      <w:r>
+        <w:t xml:space="preserve"> 3.9 m</w:t>
+      </w:r>
+      <w:r>
+        <w:t>）、停止・記録のあと安全地点へ退避した。その後</w:t>
+      </w:r>
+      <w:r>
+        <w:t xml:space="preserve"> P3 </w:t>
+      </w:r>
+      <w:r>
+        <w:t>に到着して熊がいないことを確認し、詰所に帰還した。</w:t>
+      </w:r>
+      <w:r>
+        <w:t xml:space="preserve">3 </w:t>
+      </w:r>
+      <w:r>
+        <w:t>地点すべてを確認し、熊は</w:t>
+      </w:r>
+      <w:r>
+        <w:t xml:space="preserve"> 2 </w:t>
+      </w:r>
+      <w:r>
+        <w:t>頭、移動距離は</w:t>
+      </w:r>
+      <w:r>
+        <w:t xml:space="preserve"> 31.4 m</w:t>
+      </w:r>
+      <w:r>
+        <w:t>、所要時間は</w:t>
+      </w:r>
+      <w:r>
+        <w:t xml:space="preserve"> 173 </w:t>
+      </w:r>
+      <w:r>
+        <w:t>秒（シミュレーション時間）だった。なお</w:t>
+      </w:r>
+      <w:r>
+        <w:t xml:space="preserve"> Happy Mini </w:t>
+      </w:r>
+      <w:r>
+        <w:t>のカメラ画像には車体の一部（黄色い帯とロゴの裏側）が映り込んでいたが、熊は検知できた。</w:t>
       </w:r>
     </w:p>
     <w:p>
@@ -4376,7 +4657,6 @@
         <w:rPr>
           <w:noProof/>
         </w:rPr>
-        <w:lastRenderedPageBreak/>
         <w:drawing>
           <wp:inline distT="0" distB="0" distL="0" distR="0" wp14:anchorId="0B3A02AE" wp14:editId="4B858CD3">
             <wp:extent cx="3425190" cy="1926669"/>
@@ -4423,22 +4703,188 @@
       </w:pPr>
       <w:r>
         <w:rPr>
-          <w:rFonts w:ascii="Arial" w:eastAsia="游ゴシック" w:hAnsi="Arial"/>
+          <w:rFonts w:ascii="Arial" w:eastAsia="Yu Gothic" w:hAnsi="Arial"/>
           <w:b/>
           <w:bCs/>
           <w:sz w:val="16"/>
           <w:szCs w:val="16"/>
         </w:rPr>
-        <w:t xml:space="preserve">図3　Gazebo での実行の様子（提出動画より）。　</w:t>
-      </w:r>
-      <w:r>
-        <w:rPr>
-          <w:rFonts w:ascii="Arial" w:eastAsia="游ゴシック" w:hAnsi="Arial"/>
-          <w:color w:val="5B6570"/>
-          <w:sz w:val="16"/>
-          <w:szCs w:val="16"/>
-        </w:rPr>
-        <w:t>左：ロボットのカメラ映像と YOLOv8 の検出枠（P2 の熊。停止距離 4 m に入る前の 5.0 m で信頼度 0.87）、右：走行記録から描いた地図。上の帯は巡回の状態（Mission 1/3・AI リスク）。</w:t>
+        <w:t>図</w:t>
+      </w:r>
+      <w:r>
+        <w:rPr>
+          <w:rFonts w:ascii="Arial" w:eastAsia="Yu Gothic" w:hAnsi="Arial"/>
+          <w:b/>
+          <w:bCs/>
+          <w:sz w:val="16"/>
+          <w:szCs w:val="16"/>
+        </w:rPr>
+        <w:t>3</w:t>
+      </w:r>
+      <w:r>
+        <w:rPr>
+          <w:rFonts w:ascii="Arial" w:eastAsia="Yu Gothic" w:hAnsi="Arial"/>
+          <w:b/>
+          <w:bCs/>
+          <w:sz w:val="16"/>
+          <w:szCs w:val="16"/>
+        </w:rPr>
+        <w:t xml:space="preserve">　</w:t>
+      </w:r>
+      <w:r>
+        <w:rPr>
+          <w:rFonts w:ascii="Arial" w:eastAsia="Yu Gothic" w:hAnsi="Arial"/>
+          <w:b/>
+          <w:bCs/>
+          <w:sz w:val="16"/>
+          <w:szCs w:val="16"/>
+        </w:rPr>
+        <w:t xml:space="preserve">Gazebo </w:t>
+      </w:r>
+      <w:r>
+        <w:rPr>
+          <w:rFonts w:ascii="Arial" w:eastAsia="Yu Gothic" w:hAnsi="Arial"/>
+          <w:b/>
+          <w:bCs/>
+          <w:sz w:val="16"/>
+          <w:szCs w:val="16"/>
+        </w:rPr>
+        <w:t xml:space="preserve">での実行の様子（提出動画より）。　</w:t>
+      </w:r>
+      <w:r>
+        <w:rPr>
+          <w:rFonts w:ascii="Arial" w:eastAsia="Yu Gothic" w:hAnsi="Arial"/>
+          <w:color w:val="5B6570"/>
+          <w:sz w:val="16"/>
+          <w:szCs w:val="16"/>
+        </w:rPr>
+        <w:t>左：ロボットのカメラ映像と</w:t>
+      </w:r>
+      <w:r>
+        <w:rPr>
+          <w:rFonts w:ascii="Arial" w:eastAsia="Yu Gothic" w:hAnsi="Arial"/>
+          <w:color w:val="5B6570"/>
+          <w:sz w:val="16"/>
+          <w:szCs w:val="16"/>
+        </w:rPr>
+        <w:t xml:space="preserve"> YOLOv8 </w:t>
+      </w:r>
+      <w:r>
+        <w:rPr>
+          <w:rFonts w:ascii="Arial" w:eastAsia="Yu Gothic" w:hAnsi="Arial"/>
+          <w:color w:val="5B6570"/>
+          <w:sz w:val="16"/>
+          <w:szCs w:val="16"/>
+        </w:rPr>
+        <w:t>の検出枠（</w:t>
+      </w:r>
+      <w:r>
+        <w:rPr>
+          <w:rFonts w:ascii="Arial" w:eastAsia="Yu Gothic" w:hAnsi="Arial"/>
+          <w:color w:val="5B6570"/>
+          <w:sz w:val="16"/>
+          <w:szCs w:val="16"/>
+        </w:rPr>
+        <w:t xml:space="preserve">P2 </w:t>
+      </w:r>
+      <w:r>
+        <w:rPr>
+          <w:rFonts w:ascii="Arial" w:eastAsia="Yu Gothic" w:hAnsi="Arial"/>
+          <w:color w:val="5B6570"/>
+          <w:sz w:val="16"/>
+          <w:szCs w:val="16"/>
+        </w:rPr>
+        <w:t>の熊。停止距離</w:t>
+      </w:r>
+      <w:r>
+        <w:rPr>
+          <w:rFonts w:ascii="Arial" w:eastAsia="Yu Gothic" w:hAnsi="Arial"/>
+          <w:color w:val="5B6570"/>
+          <w:sz w:val="16"/>
+          <w:szCs w:val="16"/>
+        </w:rPr>
+        <w:t xml:space="preserve"> 4 m </w:t>
+      </w:r>
+      <w:r>
+        <w:rPr>
+          <w:rFonts w:ascii="Arial" w:eastAsia="Yu Gothic" w:hAnsi="Arial"/>
+          <w:color w:val="5B6570"/>
+          <w:sz w:val="16"/>
+          <w:szCs w:val="16"/>
+        </w:rPr>
+        <w:t>に入る前の</w:t>
+      </w:r>
+      <w:r>
+        <w:rPr>
+          <w:rFonts w:ascii="Arial" w:eastAsia="Yu Gothic" w:hAnsi="Arial"/>
+          <w:color w:val="5B6570"/>
+          <w:sz w:val="16"/>
+          <w:szCs w:val="16"/>
+        </w:rPr>
+        <w:t xml:space="preserve"> 5.0 m </w:t>
+      </w:r>
+      <w:r>
+        <w:rPr>
+          <w:rFonts w:ascii="Arial" w:eastAsia="Yu Gothic" w:hAnsi="Arial"/>
+          <w:color w:val="5B6570"/>
+          <w:sz w:val="16"/>
+          <w:szCs w:val="16"/>
+        </w:rPr>
+        <w:t>で信頼度</w:t>
+      </w:r>
+      <w:r>
+        <w:rPr>
+          <w:rFonts w:ascii="Arial" w:eastAsia="Yu Gothic" w:hAnsi="Arial"/>
+          <w:color w:val="5B6570"/>
+          <w:sz w:val="16"/>
+          <w:szCs w:val="16"/>
+        </w:rPr>
+        <w:t xml:space="preserve"> 0.87</w:t>
+      </w:r>
+      <w:r>
+        <w:rPr>
+          <w:rFonts w:ascii="Arial" w:eastAsia="Yu Gothic" w:hAnsi="Arial"/>
+          <w:color w:val="5B6570"/>
+          <w:sz w:val="16"/>
+          <w:szCs w:val="16"/>
+        </w:rPr>
+        <w:t>）、右：走行記録から描いた地図。上の帯は巡回の状態（</w:t>
+      </w:r>
+      <w:r>
+        <w:rPr>
+          <w:rFonts w:ascii="Arial" w:eastAsia="Yu Gothic" w:hAnsi="Arial"/>
+          <w:color w:val="5B6570"/>
+          <w:sz w:val="16"/>
+          <w:szCs w:val="16"/>
+        </w:rPr>
+        <w:t>Mission 1/3</w:t>
+      </w:r>
+      <w:r>
+        <w:rPr>
+          <w:rFonts w:ascii="Arial" w:eastAsia="Yu Gothic" w:hAnsi="Arial"/>
+          <w:color w:val="5B6570"/>
+          <w:sz w:val="16"/>
+          <w:szCs w:val="16"/>
+        </w:rPr>
+        <w:t>・</w:t>
+      </w:r>
+      <w:r>
+        <w:rPr>
+          <w:rFonts w:ascii="Arial" w:eastAsia="Yu Gothic" w:hAnsi="Arial"/>
+          <w:color w:val="5B6570"/>
+          <w:sz w:val="16"/>
+          <w:szCs w:val="16"/>
+        </w:rPr>
+        <w:t xml:space="preserve">AI </w:t>
+      </w:r>
+      <w:r>
+        <w:rPr>
+          <w:rFonts w:ascii="Arial" w:eastAsia="Yu Gothic" w:hAnsi="Arial"/>
+          <w:color w:val="5B6570"/>
+          <w:sz w:val="16"/>
+          <w:szCs w:val="16"/>
+        </w:rPr>
+        <w:t>リスク）。</w:t>
       </w:r>
     </w:p>
     <w:p>
@@ -4450,10 +4896,28 @@
         <w:rPr>
           <w:b/>
         </w:rPr>
-        <w:t>P2 では、安全地点への経路生成が障害物配置のため失敗した。</w:t>
-      </w:r>
-      <w:r>
-        <w:t>退避先 (−2.7, −2.2) が建物のそばにあり、Nav2 が経路を作れなかった。本試作では巡回継続に遷移したが、実運用では安全停止、代替退避地点の再探索、管理者への通知を優先する必要がある。これは今後修正すべき安全制御上の課題である。</w:t>
+        <w:t xml:space="preserve">P2 </w:t>
+      </w:r>
+      <w:r>
+        <w:rPr>
+          <w:b/>
+        </w:rPr>
+        <w:t>では、安全地点への経路生成が障害物配置のため失敗した。</w:t>
+      </w:r>
+      <w:r>
+        <w:t>退避先</w:t>
+      </w:r>
+      <w:r>
+        <w:t xml:space="preserve"> (−2.7, −2.2) </w:t>
+      </w:r>
+      <w:r>
+        <w:t>が建物のそばにあり、</w:t>
+      </w:r>
+      <w:r>
+        <w:t xml:space="preserve">Nav2 </w:t>
+      </w:r>
+      <w:r>
+        <w:t>が経路を作れなかった。本試作では巡回継続に遷移したが、実運用では安全停止、代替退避地点の再探索、管理者への通知を優先する必要がある。これは今後修正すべき安全制御上の課題である。</w:t>
       </w:r>
     </w:p>
     <w:p>
@@ -4468,7 +4932,13 @@
         <w:rPr>
           <w:color w:val="1F5F8B"/>
         </w:rPr>
-        <w:t>6　固定ルートとの比較</w:t>
+        <w:t>6</w:t>
+      </w:r>
+      <w:r>
+        <w:rPr>
+          <w:color w:val="1F5F8B"/>
+        </w:rPr>
+        <w:t xml:space="preserve">　固定ルートとの比較</w:t>
       </w:r>
     </w:p>
     <w:p>
@@ -4499,7 +4969,7 @@
                     </pic:cNvPicPr>
                   </pic:nvPicPr>
                   <pic:blipFill>
-                    <a:blip r:embed="rId9"/>
+                    <a:blip r:embed="rId11"/>
                     <a:srcRect/>
                     <a:stretch>
                       <a:fillRect/>
@@ -4527,22 +4997,168 @@
       </w:pPr>
       <w:r>
         <w:rPr>
-          <w:rFonts w:ascii="Arial" w:eastAsia="游ゴシック" w:hAnsi="Arial"/>
+          <w:rFonts w:ascii="Arial" w:eastAsia="Yu Gothic" w:hAnsi="Arial"/>
           <w:b/>
           <w:bCs/>
           <w:sz w:val="16"/>
           <w:szCs w:val="16"/>
         </w:rPr>
-        <w:t xml:space="preserve">図4　走行軌跡の比較。　</w:t>
-      </w:r>
-      <w:r>
-        <w:rPr>
-          <w:rFonts w:ascii="Arial" w:eastAsia="游ゴシック" w:hAnsi="Arial"/>
-          <w:color w:val="5B6570"/>
-          <w:sz w:val="16"/>
-          <w:szCs w:val="16"/>
-        </w:rPr>
-        <w:t>講義の Docker 環境（Gazebo・Navigation2・YOLOv8）での実走行の記録から描いた。左：固定巡回（P1→P2→P3）、右：AI 巡回（P2→P4→P3）。青線は走行軌跡、赤丸は熊の発見位置、下の距離は実行ログの値。</w:t>
+        <w:t>図</w:t>
+      </w:r>
+      <w:r>
+        <w:rPr>
+          <w:rFonts w:ascii="Arial" w:eastAsia="Yu Gothic" w:hAnsi="Arial"/>
+          <w:b/>
+          <w:bCs/>
+          <w:sz w:val="16"/>
+          <w:szCs w:val="16"/>
+        </w:rPr>
+        <w:t>4</w:t>
+      </w:r>
+      <w:r>
+        <w:rPr>
+          <w:rFonts w:ascii="Arial" w:eastAsia="Yu Gothic" w:hAnsi="Arial"/>
+          <w:b/>
+          <w:bCs/>
+          <w:sz w:val="16"/>
+          <w:szCs w:val="16"/>
+        </w:rPr>
+        <w:t xml:space="preserve">　走行軌跡の比較。　</w:t>
+      </w:r>
+      <w:r>
+        <w:rPr>
+          <w:rFonts w:ascii="Arial" w:eastAsia="Yu Gothic" w:hAnsi="Arial"/>
+          <w:color w:val="5B6570"/>
+          <w:sz w:val="16"/>
+          <w:szCs w:val="16"/>
+        </w:rPr>
+        <w:t>講義の</w:t>
+      </w:r>
+      <w:r>
+        <w:rPr>
+          <w:rFonts w:ascii="Arial" w:eastAsia="Yu Gothic" w:hAnsi="Arial"/>
+          <w:color w:val="5B6570"/>
+          <w:sz w:val="16"/>
+          <w:szCs w:val="16"/>
+        </w:rPr>
+        <w:t xml:space="preserve"> Docker </w:t>
+      </w:r>
+      <w:r>
+        <w:rPr>
+          <w:rFonts w:ascii="Arial" w:eastAsia="Yu Gothic" w:hAnsi="Arial"/>
+          <w:color w:val="5B6570"/>
+          <w:sz w:val="16"/>
+          <w:szCs w:val="16"/>
+        </w:rPr>
+        <w:t>環境（</w:t>
+      </w:r>
+      <w:r>
+        <w:rPr>
+          <w:rFonts w:ascii="Arial" w:eastAsia="Yu Gothic" w:hAnsi="Arial"/>
+          <w:color w:val="5B6570"/>
+          <w:sz w:val="16"/>
+          <w:szCs w:val="16"/>
+        </w:rPr>
+        <w:t>Gazebo</w:t>
+      </w:r>
+      <w:r>
+        <w:rPr>
+          <w:rFonts w:ascii="Arial" w:eastAsia="Yu Gothic" w:hAnsi="Arial"/>
+          <w:color w:val="5B6570"/>
+          <w:sz w:val="16"/>
+          <w:szCs w:val="16"/>
+        </w:rPr>
+        <w:t>・</w:t>
+      </w:r>
+      <w:r>
+        <w:rPr>
+          <w:rFonts w:ascii="Arial" w:eastAsia="Yu Gothic" w:hAnsi="Arial"/>
+          <w:color w:val="5B6570"/>
+          <w:sz w:val="16"/>
+          <w:szCs w:val="16"/>
+        </w:rPr>
+        <w:t>Navigation2</w:t>
+      </w:r>
+      <w:r>
+        <w:rPr>
+          <w:rFonts w:ascii="Arial" w:eastAsia="Yu Gothic" w:hAnsi="Arial"/>
+          <w:color w:val="5B6570"/>
+          <w:sz w:val="16"/>
+          <w:szCs w:val="16"/>
+        </w:rPr>
+        <w:t>・</w:t>
+      </w:r>
+      <w:r>
+        <w:rPr>
+          <w:rFonts w:ascii="Arial" w:eastAsia="Yu Gothic" w:hAnsi="Arial"/>
+          <w:color w:val="5B6570"/>
+          <w:sz w:val="16"/>
+          <w:szCs w:val="16"/>
+        </w:rPr>
+        <w:t>YOLOv8</w:t>
+      </w:r>
+      <w:r>
+        <w:rPr>
+          <w:rFonts w:ascii="Arial" w:eastAsia="Yu Gothic" w:hAnsi="Arial"/>
+          <w:color w:val="5B6570"/>
+          <w:sz w:val="16"/>
+          <w:szCs w:val="16"/>
+        </w:rPr>
+        <w:t>）での実走行の記録から描いた。左：固定巡回（</w:t>
+      </w:r>
+      <w:r>
+        <w:rPr>
+          <w:rFonts w:ascii="Arial" w:eastAsia="Yu Gothic" w:hAnsi="Arial"/>
+          <w:color w:val="5B6570"/>
+          <w:sz w:val="16"/>
+          <w:szCs w:val="16"/>
+        </w:rPr>
+        <w:t>P1→P2→P3</w:t>
+      </w:r>
+      <w:r>
+        <w:rPr>
+          <w:rFonts w:ascii="Arial" w:eastAsia="Yu Gothic" w:hAnsi="Arial"/>
+          <w:color w:val="5B6570"/>
+          <w:sz w:val="16"/>
+          <w:szCs w:val="16"/>
+        </w:rPr>
+        <w:t>）、右：</w:t>
+      </w:r>
+      <w:r>
+        <w:rPr>
+          <w:rFonts w:ascii="Arial" w:eastAsia="Yu Gothic" w:hAnsi="Arial"/>
+          <w:color w:val="5B6570"/>
+          <w:sz w:val="16"/>
+          <w:szCs w:val="16"/>
+        </w:rPr>
+        <w:t xml:space="preserve">AI </w:t>
+      </w:r>
+      <w:r>
+        <w:rPr>
+          <w:rFonts w:ascii="Arial" w:eastAsia="Yu Gothic" w:hAnsi="Arial"/>
+          <w:color w:val="5B6570"/>
+          <w:sz w:val="16"/>
+          <w:szCs w:val="16"/>
+        </w:rPr>
+        <w:t>巡回（</w:t>
+      </w:r>
+      <w:r>
+        <w:rPr>
+          <w:rFonts w:ascii="Arial" w:eastAsia="Yu Gothic" w:hAnsi="Arial"/>
+          <w:color w:val="5B6570"/>
+          <w:sz w:val="16"/>
+          <w:szCs w:val="16"/>
+        </w:rPr>
+        <w:t>P2→P4→P3</w:t>
+      </w:r>
+      <w:r>
+        <w:rPr>
+          <w:rFonts w:ascii="Arial" w:eastAsia="Yu Gothic" w:hAnsi="Arial"/>
+          <w:color w:val="5B6570"/>
+          <w:sz w:val="16"/>
+          <w:szCs w:val="16"/>
+        </w:rPr>
+        <w:t>）。青線は走行軌跡、赤丸は熊の発見位置、下の距離は実行ログの値。</w:t>
       </w:r>
     </w:p>
     <w:tbl>
@@ -4594,7 +5210,7 @@
             </w:pPr>
             <w:r>
               <w:rPr>
-                <w:rFonts w:ascii="Arial" w:eastAsia="游ゴシック" w:hAnsi="Arial"/>
+                <w:rFonts w:ascii="Arial" w:eastAsia="Yu Gothic" w:hAnsi="Arial"/>
                 <w:b/>
                 <w:bCs/>
                 <w:sz w:val="16"/>
@@ -4627,13 +5243,33 @@
             </w:pPr>
             <w:r>
               <w:rPr>
-                <w:rFonts w:ascii="Arial" w:eastAsia="游ゴシック" w:hAnsi="Arial"/>
+                <w:rFonts w:ascii="Arial" w:eastAsia="Yu Gothic" w:hAnsi="Arial"/>
                 <w:b/>
                 <w:bCs/>
                 <w:sz w:val="16"/>
                 <w:szCs w:val="16"/>
               </w:rPr>
-              <w:t>固定巡回（P1→P2→P3）</w:t>
+              <w:t>固定巡回（</w:t>
+            </w:r>
+            <w:r>
+              <w:rPr>
+                <w:rFonts w:ascii="Arial" w:eastAsia="Yu Gothic" w:hAnsi="Arial"/>
+                <w:b/>
+                <w:bCs/>
+                <w:sz w:val="16"/>
+                <w:szCs w:val="16"/>
+              </w:rPr>
+              <w:t>P1→P2→P3</w:t>
+            </w:r>
+            <w:r>
+              <w:rPr>
+                <w:rFonts w:ascii="Arial" w:eastAsia="Yu Gothic" w:hAnsi="Arial"/>
+                <w:b/>
+                <w:bCs/>
+                <w:sz w:val="16"/>
+                <w:szCs w:val="16"/>
+              </w:rPr>
+              <w:t>）</w:t>
             </w:r>
           </w:p>
         </w:tc>
@@ -4660,13 +5296,43 @@
             </w:pPr>
             <w:r>
               <w:rPr>
-                <w:rFonts w:ascii="Arial" w:eastAsia="游ゴシック" w:hAnsi="Arial"/>
+                <w:rFonts w:ascii="Arial" w:eastAsia="Yu Gothic" w:hAnsi="Arial"/>
                 <w:b/>
                 <w:bCs/>
                 <w:sz w:val="16"/>
                 <w:szCs w:val="16"/>
               </w:rPr>
-              <w:t>AI 巡回（P2→P4→P3）</w:t>
+              <w:t xml:space="preserve">AI </w:t>
+            </w:r>
+            <w:r>
+              <w:rPr>
+                <w:rFonts w:ascii="Arial" w:eastAsia="Yu Gothic" w:hAnsi="Arial"/>
+                <w:b/>
+                <w:bCs/>
+                <w:sz w:val="16"/>
+                <w:szCs w:val="16"/>
+              </w:rPr>
+              <w:t>巡回（</w:t>
+            </w:r>
+            <w:r>
+              <w:rPr>
+                <w:rFonts w:ascii="Arial" w:eastAsia="Yu Gothic" w:hAnsi="Arial"/>
+                <w:b/>
+                <w:bCs/>
+                <w:sz w:val="16"/>
+                <w:szCs w:val="16"/>
+              </w:rPr>
+              <w:t>P2→P4→P3</w:t>
+            </w:r>
+            <w:r>
+              <w:rPr>
+                <w:rFonts w:ascii="Arial" w:eastAsia="Yu Gothic" w:hAnsi="Arial"/>
+                <w:b/>
+                <w:bCs/>
+                <w:sz w:val="16"/>
+                <w:szCs w:val="16"/>
+              </w:rPr>
+              <w:t>）</w:t>
             </w:r>
           </w:p>
         </w:tc>
@@ -4684,13 +5350,13 @@
               <w:bottom w:val="single" w:sz="4" w:space="0" w:color="CFD6DD"/>
               <w:right w:val="none" w:sz="0" w:space="0" w:color="FFFFFF"/>
             </w:tcBorders>
+            <w:shd w:val="clear" w:color="auto" w:fill="FBEEE6"/>
             <w:tcMar>
               <w:top w:w="50" w:type="dxa"/>
               <w:left w:w="90" w:type="dxa"/>
               <w:bottom w:w="50" w:type="dxa"/>
               <w:right w:w="90" w:type="dxa"/>
             </w:tcMar>
-            <w:shd w:val="clear" w:color="auto" w:fill="FBEEE6"/>
           </w:tcPr>
           <w:p>
             <w:pPr>
@@ -4698,11 +5364,27 @@
             </w:pPr>
             <w:r>
               <w:rPr>
-                <w:rFonts w:ascii="Arial" w:eastAsia="游ゴシック" w:hAnsi="Arial"/>
-                <w:sz w:val="16"/>
-                <w:szCs w:val="16"/>
-              </w:rPr>
-              <w:t>巡回地点の AI リスク合計</w:t>
+                <w:rFonts w:ascii="Arial" w:eastAsia="Yu Gothic" w:hAnsi="Arial"/>
+                <w:sz w:val="16"/>
+                <w:szCs w:val="16"/>
+              </w:rPr>
+              <w:t>巡回地点の</w:t>
+            </w:r>
+            <w:r>
+              <w:rPr>
+                <w:rFonts w:ascii="Arial" w:eastAsia="Yu Gothic" w:hAnsi="Arial"/>
+                <w:sz w:val="16"/>
+                <w:szCs w:val="16"/>
+              </w:rPr>
+              <w:t xml:space="preserve"> AI </w:t>
+            </w:r>
+            <w:r>
+              <w:rPr>
+                <w:rFonts w:ascii="Arial" w:eastAsia="Yu Gothic" w:hAnsi="Arial"/>
+                <w:sz w:val="16"/>
+                <w:szCs w:val="16"/>
+              </w:rPr>
+              <w:t>リスク合計</w:t>
             </w:r>
           </w:p>
         </w:tc>
@@ -4715,13 +5397,13 @@
               <w:bottom w:val="single" w:sz="4" w:space="0" w:color="CFD6DD"/>
               <w:right w:val="none" w:sz="0" w:space="0" w:color="FFFFFF"/>
             </w:tcBorders>
+            <w:shd w:val="clear" w:color="auto" w:fill="FBEEE6"/>
             <w:tcMar>
               <w:top w:w="50" w:type="dxa"/>
               <w:left w:w="90" w:type="dxa"/>
               <w:bottom w:w="50" w:type="dxa"/>
               <w:right w:w="90" w:type="dxa"/>
             </w:tcMar>
-            <w:shd w:val="clear" w:color="auto" w:fill="FBEEE6"/>
           </w:tcPr>
           <w:p>
             <w:pPr>
@@ -4730,7 +5412,7 @@
             </w:pPr>
             <w:r>
               <w:rPr>
-                <w:rFonts w:ascii="Arial" w:eastAsia="游ゴシック" w:hAnsi="Arial"/>
+                <w:rFonts w:ascii="Arial" w:eastAsia="Yu Gothic" w:hAnsi="Arial"/>
                 <w:sz w:val="16"/>
                 <w:szCs w:val="16"/>
               </w:rPr>
@@ -4747,13 +5429,13 @@
               <w:bottom w:val="single" w:sz="4" w:space="0" w:color="CFD6DD"/>
               <w:right w:val="none" w:sz="0" w:space="0" w:color="FFFFFF"/>
             </w:tcBorders>
+            <w:shd w:val="clear" w:color="auto" w:fill="FBEEE6"/>
             <w:tcMar>
               <w:top w:w="50" w:type="dxa"/>
               <w:left w:w="90" w:type="dxa"/>
               <w:bottom w:w="50" w:type="dxa"/>
               <w:right w:w="90" w:type="dxa"/>
             </w:tcMar>
-            <w:shd w:val="clear" w:color="auto" w:fill="FBEEE6"/>
           </w:tcPr>
           <w:p>
             <w:pPr>
@@ -4762,7 +5444,7 @@
             </w:pPr>
             <w:r>
               <w:rPr>
-                <w:rFonts w:ascii="Arial" w:eastAsia="游ゴシック" w:hAnsi="Arial"/>
+                <w:rFonts w:ascii="Arial" w:eastAsia="Yu Gothic" w:hAnsi="Arial"/>
                 <w:sz w:val="16"/>
                 <w:szCs w:val="16"/>
               </w:rPr>
@@ -4797,7 +5479,7 @@
             </w:pPr>
             <w:r>
               <w:rPr>
-                <w:rFonts w:ascii="Arial" w:eastAsia="游ゴシック" w:hAnsi="Arial"/>
+                <w:rFonts w:ascii="Arial" w:eastAsia="Yu Gothic" w:hAnsi="Arial"/>
                 <w:sz w:val="16"/>
                 <w:szCs w:val="16"/>
               </w:rPr>
@@ -4828,7 +5510,7 @@
             </w:pPr>
             <w:r>
               <w:rPr>
-                <w:rFonts w:ascii="Arial" w:eastAsia="游ゴシック" w:hAnsi="Arial"/>
+                <w:rFonts w:ascii="Arial" w:eastAsia="Yu Gothic" w:hAnsi="Arial"/>
                 <w:sz w:val="16"/>
                 <w:szCs w:val="16"/>
               </w:rPr>
@@ -4859,7 +5541,7 @@
             </w:pPr>
             <w:r>
               <w:rPr>
-                <w:rFonts w:ascii="Arial" w:eastAsia="游ゴシック" w:hAnsi="Arial"/>
+                <w:rFonts w:ascii="Arial" w:eastAsia="Yu Gothic" w:hAnsi="Arial"/>
                 <w:sz w:val="16"/>
                 <w:szCs w:val="16"/>
               </w:rPr>
@@ -4894,7 +5576,7 @@
             </w:pPr>
             <w:r>
               <w:rPr>
-                <w:rFonts w:ascii="Arial" w:eastAsia="游ゴシック" w:hAnsi="Arial"/>
+                <w:rFonts w:ascii="Arial" w:eastAsia="Yu Gothic" w:hAnsi="Arial"/>
                 <w:sz w:val="16"/>
                 <w:szCs w:val="16"/>
               </w:rPr>
@@ -4925,11 +5607,67 @@
             </w:pPr>
             <w:r>
               <w:rPr>
-                <w:rFonts w:ascii="Arial" w:eastAsia="游ゴシック" w:hAnsi="Arial"/>
-                <w:sz w:val="16"/>
-                <w:szCs w:val="16"/>
-              </w:rPr>
-              <w:t>2（うち 1 頭は P3 から P4 付近の熊を偶然視認）</w:t>
+                <w:rFonts w:ascii="Arial" w:eastAsia="Yu Gothic" w:hAnsi="Arial"/>
+                <w:sz w:val="16"/>
+                <w:szCs w:val="16"/>
+              </w:rPr>
+              <w:t>2</w:t>
+            </w:r>
+            <w:r>
+              <w:rPr>
+                <w:rFonts w:ascii="Arial" w:eastAsia="Yu Gothic" w:hAnsi="Arial"/>
+                <w:sz w:val="16"/>
+                <w:szCs w:val="16"/>
+              </w:rPr>
+              <w:t>（うち</w:t>
+            </w:r>
+            <w:r>
+              <w:rPr>
+                <w:rFonts w:ascii="Arial" w:eastAsia="Yu Gothic" w:hAnsi="Arial"/>
+                <w:sz w:val="16"/>
+                <w:szCs w:val="16"/>
+              </w:rPr>
+              <w:t xml:space="preserve"> 1 </w:t>
+            </w:r>
+            <w:r>
+              <w:rPr>
+                <w:rFonts w:ascii="Arial" w:eastAsia="Yu Gothic" w:hAnsi="Arial"/>
+                <w:sz w:val="16"/>
+                <w:szCs w:val="16"/>
+              </w:rPr>
+              <w:t>頭は</w:t>
+            </w:r>
+            <w:r>
+              <w:rPr>
+                <w:rFonts w:ascii="Arial" w:eastAsia="Yu Gothic" w:hAnsi="Arial"/>
+                <w:sz w:val="16"/>
+                <w:szCs w:val="16"/>
+              </w:rPr>
+              <w:t xml:space="preserve"> P3 </w:t>
+            </w:r>
+            <w:r>
+              <w:rPr>
+                <w:rFonts w:ascii="Arial" w:eastAsia="Yu Gothic" w:hAnsi="Arial"/>
+                <w:sz w:val="16"/>
+                <w:szCs w:val="16"/>
+              </w:rPr>
+              <w:t>から</w:t>
+            </w:r>
+            <w:r>
+              <w:rPr>
+                <w:rFonts w:ascii="Arial" w:eastAsia="Yu Gothic" w:hAnsi="Arial"/>
+                <w:sz w:val="16"/>
+                <w:szCs w:val="16"/>
+              </w:rPr>
+              <w:t xml:space="preserve"> P4 </w:t>
+            </w:r>
+            <w:r>
+              <w:rPr>
+                <w:rFonts w:ascii="Arial" w:eastAsia="Yu Gothic" w:hAnsi="Arial"/>
+                <w:sz w:val="16"/>
+                <w:szCs w:val="16"/>
+              </w:rPr>
+              <w:t>付近の熊を偶然視認）</w:t>
             </w:r>
           </w:p>
         </w:tc>
@@ -4956,11 +5694,51 @@
             </w:pPr>
             <w:r>
               <w:rPr>
-                <w:rFonts w:ascii="Arial" w:eastAsia="游ゴシック" w:hAnsi="Arial"/>
-                <w:sz w:val="16"/>
-                <w:szCs w:val="16"/>
-              </w:rPr>
-              <w:t>2（P2・P4 の確認中）</w:t>
+                <w:rFonts w:ascii="Arial" w:eastAsia="Yu Gothic" w:hAnsi="Arial"/>
+                <w:sz w:val="16"/>
+                <w:szCs w:val="16"/>
+              </w:rPr>
+              <w:t>2</w:t>
+            </w:r>
+            <w:r>
+              <w:rPr>
+                <w:rFonts w:ascii="Arial" w:eastAsia="Yu Gothic" w:hAnsi="Arial"/>
+                <w:sz w:val="16"/>
+                <w:szCs w:val="16"/>
+              </w:rPr>
+              <w:t>（</w:t>
+            </w:r>
+            <w:r>
+              <w:rPr>
+                <w:rFonts w:ascii="Arial" w:eastAsia="Yu Gothic" w:hAnsi="Arial"/>
+                <w:sz w:val="16"/>
+                <w:szCs w:val="16"/>
+              </w:rPr>
+              <w:t>P2</w:t>
+            </w:r>
+            <w:r>
+              <w:rPr>
+                <w:rFonts w:ascii="Arial" w:eastAsia="Yu Gothic" w:hAnsi="Arial"/>
+                <w:sz w:val="16"/>
+                <w:szCs w:val="16"/>
+              </w:rPr>
+              <w:t>・</w:t>
+            </w:r>
+            <w:r>
+              <w:rPr>
+                <w:rFonts w:ascii="Arial" w:eastAsia="Yu Gothic" w:hAnsi="Arial"/>
+                <w:sz w:val="16"/>
+                <w:szCs w:val="16"/>
+              </w:rPr>
+              <w:t xml:space="preserve">P4 </w:t>
+            </w:r>
+            <w:r>
+              <w:rPr>
+                <w:rFonts w:ascii="Arial" w:eastAsia="Yu Gothic" w:hAnsi="Arial"/>
+                <w:sz w:val="16"/>
+                <w:szCs w:val="16"/>
+              </w:rPr>
+              <w:t>の確認中）</w:t>
             </w:r>
           </w:p>
         </w:tc>
@@ -4991,11 +5769,19 @@
             </w:pPr>
             <w:r>
               <w:rPr>
-                <w:rFonts w:ascii="Arial" w:eastAsia="游ゴシック" w:hAnsi="Arial"/>
-                <w:sz w:val="16"/>
-                <w:szCs w:val="16"/>
-              </w:rPr>
-              <w:t>YOLOv8 の信頼度（検知時）</w:t>
+                <w:rFonts w:ascii="Arial" w:eastAsia="Yu Gothic" w:hAnsi="Arial"/>
+                <w:sz w:val="16"/>
+                <w:szCs w:val="16"/>
+              </w:rPr>
+              <w:t xml:space="preserve">YOLOv8 </w:t>
+            </w:r>
+            <w:r>
+              <w:rPr>
+                <w:rFonts w:ascii="Arial" w:eastAsia="Yu Gothic" w:hAnsi="Arial"/>
+                <w:sz w:val="16"/>
+                <w:szCs w:val="16"/>
+              </w:rPr>
+              <w:t>の信頼度（検知時）</w:t>
             </w:r>
           </w:p>
         </w:tc>
@@ -5022,11 +5808,27 @@
             </w:pPr>
             <w:r>
               <w:rPr>
-                <w:rFonts w:ascii="Arial" w:eastAsia="游ゴシック" w:hAnsi="Arial"/>
-                <w:sz w:val="16"/>
-                <w:szCs w:val="16"/>
-              </w:rPr>
-              <w:t>0.73・0.86</w:t>
+                <w:rFonts w:ascii="Arial" w:eastAsia="Yu Gothic" w:hAnsi="Arial"/>
+                <w:sz w:val="16"/>
+                <w:szCs w:val="16"/>
+              </w:rPr>
+              <w:t>0.73</w:t>
+            </w:r>
+            <w:r>
+              <w:rPr>
+                <w:rFonts w:ascii="Arial" w:eastAsia="Yu Gothic" w:hAnsi="Arial"/>
+                <w:sz w:val="16"/>
+                <w:szCs w:val="16"/>
+              </w:rPr>
+              <w:t>・</w:t>
+            </w:r>
+            <w:r>
+              <w:rPr>
+                <w:rFonts w:ascii="Arial" w:eastAsia="Yu Gothic" w:hAnsi="Arial"/>
+                <w:sz w:val="16"/>
+                <w:szCs w:val="16"/>
+              </w:rPr>
+              <w:t>0.86</w:t>
             </w:r>
           </w:p>
         </w:tc>
@@ -5053,11 +5855,27 @@
             </w:pPr>
             <w:r>
               <w:rPr>
-                <w:rFonts w:ascii="Arial" w:eastAsia="游ゴシック" w:hAnsi="Arial"/>
-                <w:sz w:val="16"/>
-                <w:szCs w:val="16"/>
-              </w:rPr>
-              <w:t>0.75・0.82</w:t>
+                <w:rFonts w:ascii="Arial" w:eastAsia="Yu Gothic" w:hAnsi="Arial"/>
+                <w:sz w:val="16"/>
+                <w:szCs w:val="16"/>
+              </w:rPr>
+              <w:t>0.75</w:t>
+            </w:r>
+            <w:r>
+              <w:rPr>
+                <w:rFonts w:ascii="Arial" w:eastAsia="Yu Gothic" w:hAnsi="Arial"/>
+                <w:sz w:val="16"/>
+                <w:szCs w:val="16"/>
+              </w:rPr>
+              <w:t>・</w:t>
+            </w:r>
+            <w:r>
+              <w:rPr>
+                <w:rFonts w:ascii="Arial" w:eastAsia="Yu Gothic" w:hAnsi="Arial"/>
+                <w:sz w:val="16"/>
+                <w:szCs w:val="16"/>
+              </w:rPr>
+              <w:t>0.82</w:t>
             </w:r>
           </w:p>
         </w:tc>
@@ -5088,7 +5906,7 @@
             </w:pPr>
             <w:r>
               <w:rPr>
-                <w:rFonts w:ascii="Arial" w:eastAsia="游ゴシック" w:hAnsi="Arial"/>
+                <w:rFonts w:ascii="Arial" w:eastAsia="Yu Gothic" w:hAnsi="Arial"/>
                 <w:sz w:val="16"/>
                 <w:szCs w:val="16"/>
               </w:rPr>
@@ -5119,11 +5937,19 @@
             </w:pPr>
             <w:r>
               <w:rPr>
-                <w:rFonts w:ascii="Arial" w:eastAsia="游ゴシック" w:hAnsi="Arial"/>
-                <w:sz w:val="16"/>
-                <w:szCs w:val="16"/>
-              </w:rPr>
-              <w:t>2 回とも成功</w:t>
+                <w:rFonts w:ascii="Arial" w:eastAsia="Yu Gothic" w:hAnsi="Arial"/>
+                <w:sz w:val="16"/>
+                <w:szCs w:val="16"/>
+              </w:rPr>
+              <w:t xml:space="preserve">2 </w:t>
+            </w:r>
+            <w:r>
+              <w:rPr>
+                <w:rFonts w:ascii="Arial" w:eastAsia="Yu Gothic" w:hAnsi="Arial"/>
+                <w:sz w:val="16"/>
+                <w:szCs w:val="16"/>
+              </w:rPr>
+              <w:t>回とも成功</w:t>
             </w:r>
           </w:p>
         </w:tc>
@@ -5150,11 +5976,35 @@
             </w:pPr>
             <w:r>
               <w:rPr>
-                <w:rFonts w:ascii="Arial" w:eastAsia="游ゴシック" w:hAnsi="Arial"/>
-                <w:sz w:val="16"/>
-                <w:szCs w:val="16"/>
-              </w:rPr>
-              <w:t>P4 は成功、P2 は経路がなく失敗</w:t>
+                <w:rFonts w:ascii="Arial" w:eastAsia="Yu Gothic" w:hAnsi="Arial"/>
+                <w:sz w:val="16"/>
+                <w:szCs w:val="16"/>
+              </w:rPr>
+              <w:t xml:space="preserve">P4 </w:t>
+            </w:r>
+            <w:r>
+              <w:rPr>
+                <w:rFonts w:ascii="Arial" w:eastAsia="Yu Gothic" w:hAnsi="Arial"/>
+                <w:sz w:val="16"/>
+                <w:szCs w:val="16"/>
+              </w:rPr>
+              <w:t>は成功、</w:t>
+            </w:r>
+            <w:r>
+              <w:rPr>
+                <w:rFonts w:ascii="Arial" w:eastAsia="Yu Gothic" w:hAnsi="Arial"/>
+                <w:sz w:val="16"/>
+                <w:szCs w:val="16"/>
+              </w:rPr>
+              <w:t xml:space="preserve">P2 </w:t>
+            </w:r>
+            <w:r>
+              <w:rPr>
+                <w:rFonts w:ascii="Arial" w:eastAsia="Yu Gothic" w:hAnsi="Arial"/>
+                <w:sz w:val="16"/>
+                <w:szCs w:val="16"/>
+              </w:rPr>
+              <w:t>は経路がなく失敗</w:t>
             </w:r>
           </w:p>
         </w:tc>
@@ -5185,7 +6035,7 @@
             </w:pPr>
             <w:r>
               <w:rPr>
-                <w:rFonts w:ascii="Arial" w:eastAsia="游ゴシック" w:hAnsi="Arial"/>
+                <w:rFonts w:ascii="Arial" w:eastAsia="Yu Gothic" w:hAnsi="Arial"/>
                 <w:sz w:val="16"/>
                 <w:szCs w:val="16"/>
               </w:rPr>
@@ -5216,7 +6066,7 @@
             </w:pPr>
             <w:r>
               <w:rPr>
-                <w:rFonts w:ascii="Arial" w:eastAsia="游ゴシック" w:hAnsi="Arial"/>
+                <w:rFonts w:ascii="Arial" w:eastAsia="Yu Gothic" w:hAnsi="Arial"/>
                 <w:sz w:val="16"/>
                 <w:szCs w:val="16"/>
               </w:rPr>
@@ -5247,7 +6097,7 @@
             </w:pPr>
             <w:r>
               <w:rPr>
-                <w:rFonts w:ascii="Arial" w:eastAsia="游ゴシック" w:hAnsi="Arial"/>
+                <w:rFonts w:ascii="Arial" w:eastAsia="Yu Gothic" w:hAnsi="Arial"/>
                 <w:sz w:val="16"/>
                 <w:szCs w:val="16"/>
               </w:rPr>
@@ -5282,10 +6132,11 @@
             </w:pPr>
             <w:r>
               <w:rPr>
-                <w:rFonts w:ascii="Arial" w:eastAsia="游ゴシック" w:hAnsi="Arial"/>
-                <w:sz w:val="16"/>
-                <w:szCs w:val="16"/>
-              </w:rPr>
+                <w:rFonts w:ascii="Arial" w:eastAsia="Yu Gothic" w:hAnsi="Arial"/>
+                <w:sz w:val="16"/>
+                <w:szCs w:val="16"/>
+              </w:rPr>
+              <w:lastRenderedPageBreak/>
               <w:t>所要時間（シミュレーション時間）</w:t>
             </w:r>
           </w:p>
@@ -5313,7 +6164,7 @@
             </w:pPr>
             <w:r>
               <w:rPr>
-                <w:rFonts w:ascii="Arial" w:eastAsia="游ゴシック" w:hAnsi="Arial"/>
+                <w:rFonts w:ascii="Arial" w:eastAsia="Yu Gothic" w:hAnsi="Arial"/>
                 <w:sz w:val="16"/>
                 <w:szCs w:val="16"/>
               </w:rPr>
@@ -5344,7 +6195,7 @@
             </w:pPr>
             <w:r>
               <w:rPr>
-                <w:rFonts w:ascii="Arial" w:eastAsia="游ゴシック" w:hAnsi="Arial"/>
+                <w:rFonts w:ascii="Arial" w:eastAsia="Yu Gothic" w:hAnsi="Arial"/>
                 <w:sz w:val="16"/>
                 <w:szCs w:val="16"/>
               </w:rPr>
@@ -5358,26 +6209,170 @@
       <w:pPr>
         <w:spacing w:before="40" w:after="160" w:line="280" w:lineRule="auto"/>
       </w:pPr>
-      <w:proofErr w:type="spellStart"/>
-      <w:proofErr w:type="spellEnd"/>
-      <w:r>
-        <w:rPr>
-          <w:rFonts w:ascii="Arial" w:eastAsia="游ゴシック" w:hAnsi="Arial"/>
+      <w:r>
+        <w:rPr>
+          <w:rFonts w:ascii="Arial" w:eastAsia="Yu Gothic" w:hAnsi="Arial"/>
           <w:b/>
           <w:bCs/>
           <w:sz w:val="16"/>
           <w:szCs w:val="16"/>
         </w:rPr>
-        <w:t xml:space="preserve">表4　</w:t>
-      </w:r>
-      <w:r>
-        <w:rPr>
-          <w:rFonts w:ascii="Arial" w:eastAsia="游ゴシック" w:hAnsi="Arial"/>
-          <w:color w:val="5B6570"/>
-          <w:sz w:val="16"/>
-          <w:szCs w:val="16"/>
-        </w:rPr>
-        <w:t>同じ 5 候補地点・同じ熊の配置での比較（各 1 回、詰所への帰還を含む）。講義の Docker 環境で、Gazebo・Navigation2 と、YOLOv8 によるカメラ映像での熊の検知を使った実走行の値。移動距離と所要時間は実行ログ（patrol_summary.json）の値で、動画の比較画面も同じ値である。</w:t>
+        <w:t>表</w:t>
+      </w:r>
+      <w:r>
+        <w:rPr>
+          <w:rFonts w:ascii="Arial" w:eastAsia="Yu Gothic" w:hAnsi="Arial"/>
+          <w:b/>
+          <w:bCs/>
+          <w:sz w:val="16"/>
+          <w:szCs w:val="16"/>
+        </w:rPr>
+        <w:t>4</w:t>
+      </w:r>
+      <w:r>
+        <w:rPr>
+          <w:rFonts w:ascii="Arial" w:eastAsia="Yu Gothic" w:hAnsi="Arial"/>
+          <w:b/>
+          <w:bCs/>
+          <w:sz w:val="16"/>
+          <w:szCs w:val="16"/>
+        </w:rPr>
+        <w:t xml:space="preserve">　</w:t>
+      </w:r>
+      <w:r>
+        <w:rPr>
+          <w:rFonts w:ascii="Arial" w:eastAsia="Yu Gothic" w:hAnsi="Arial"/>
+          <w:color w:val="5B6570"/>
+          <w:sz w:val="16"/>
+          <w:szCs w:val="16"/>
+        </w:rPr>
+        <w:t>同じ</w:t>
+      </w:r>
+      <w:r>
+        <w:rPr>
+          <w:rFonts w:ascii="Arial" w:eastAsia="Yu Gothic" w:hAnsi="Arial"/>
+          <w:color w:val="5B6570"/>
+          <w:sz w:val="16"/>
+          <w:szCs w:val="16"/>
+        </w:rPr>
+        <w:t xml:space="preserve"> 5 </w:t>
+      </w:r>
+      <w:r>
+        <w:rPr>
+          <w:rFonts w:ascii="Arial" w:eastAsia="Yu Gothic" w:hAnsi="Arial"/>
+          <w:color w:val="5B6570"/>
+          <w:sz w:val="16"/>
+          <w:szCs w:val="16"/>
+        </w:rPr>
+        <w:t>候補地点・同じ熊の配置での比較（各</w:t>
+      </w:r>
+      <w:r>
+        <w:rPr>
+          <w:rFonts w:ascii="Arial" w:eastAsia="Yu Gothic" w:hAnsi="Arial"/>
+          <w:color w:val="5B6570"/>
+          <w:sz w:val="16"/>
+          <w:szCs w:val="16"/>
+        </w:rPr>
+        <w:t xml:space="preserve"> 1 </w:t>
+      </w:r>
+      <w:r>
+        <w:rPr>
+          <w:rFonts w:ascii="Arial" w:eastAsia="Yu Gothic" w:hAnsi="Arial"/>
+          <w:color w:val="5B6570"/>
+          <w:sz w:val="16"/>
+          <w:szCs w:val="16"/>
+        </w:rPr>
+        <w:t>回、詰所への帰還を含む）。講義の</w:t>
+      </w:r>
+      <w:r>
+        <w:rPr>
+          <w:rFonts w:ascii="Arial" w:eastAsia="Yu Gothic" w:hAnsi="Arial"/>
+          <w:color w:val="5B6570"/>
+          <w:sz w:val="16"/>
+          <w:szCs w:val="16"/>
+        </w:rPr>
+        <w:t xml:space="preserve"> Docker </w:t>
+      </w:r>
+      <w:r>
+        <w:rPr>
+          <w:rFonts w:ascii="Arial" w:eastAsia="Yu Gothic" w:hAnsi="Arial"/>
+          <w:color w:val="5B6570"/>
+          <w:sz w:val="16"/>
+          <w:szCs w:val="16"/>
+        </w:rPr>
+        <w:t>環境で、</w:t>
+      </w:r>
+      <w:r>
+        <w:rPr>
+          <w:rFonts w:ascii="Arial" w:eastAsia="Yu Gothic" w:hAnsi="Arial"/>
+          <w:color w:val="5B6570"/>
+          <w:sz w:val="16"/>
+          <w:szCs w:val="16"/>
+        </w:rPr>
+        <w:t>Gazebo</w:t>
+      </w:r>
+      <w:r>
+        <w:rPr>
+          <w:rFonts w:ascii="Arial" w:eastAsia="Yu Gothic" w:hAnsi="Arial"/>
+          <w:color w:val="5B6570"/>
+          <w:sz w:val="16"/>
+          <w:szCs w:val="16"/>
+        </w:rPr>
+        <w:t>・</w:t>
+      </w:r>
+      <w:r>
+        <w:rPr>
+          <w:rFonts w:ascii="Arial" w:eastAsia="Yu Gothic" w:hAnsi="Arial"/>
+          <w:color w:val="5B6570"/>
+          <w:sz w:val="16"/>
+          <w:szCs w:val="16"/>
+        </w:rPr>
+        <w:t xml:space="preserve">Navigation2 </w:t>
+      </w:r>
+      <w:r>
+        <w:rPr>
+          <w:rFonts w:ascii="Arial" w:eastAsia="Yu Gothic" w:hAnsi="Arial"/>
+          <w:color w:val="5B6570"/>
+          <w:sz w:val="16"/>
+          <w:szCs w:val="16"/>
+        </w:rPr>
+        <w:t>と、</w:t>
+      </w:r>
+      <w:r>
+        <w:rPr>
+          <w:rFonts w:ascii="Arial" w:eastAsia="Yu Gothic" w:hAnsi="Arial"/>
+          <w:color w:val="5B6570"/>
+          <w:sz w:val="16"/>
+          <w:szCs w:val="16"/>
+        </w:rPr>
+        <w:t xml:space="preserve">YOLOv8 </w:t>
+      </w:r>
+      <w:r>
+        <w:rPr>
+          <w:rFonts w:ascii="Arial" w:eastAsia="Yu Gothic" w:hAnsi="Arial"/>
+          <w:color w:val="5B6570"/>
+          <w:sz w:val="16"/>
+          <w:szCs w:val="16"/>
+        </w:rPr>
+        <w:t>によるカメラ映像での熊の検知を使った実走行の値。移動距離と所要時間は実行ログ（</w:t>
+      </w:r>
+      <w:r>
+        <w:rPr>
+          <w:rFonts w:ascii="Arial" w:eastAsia="Yu Gothic" w:hAnsi="Arial"/>
+          <w:color w:val="5B6570"/>
+          <w:sz w:val="16"/>
+          <w:szCs w:val="16"/>
+        </w:rPr>
+        <w:t>patrol_summary.json</w:t>
+      </w:r>
+      <w:r>
+        <w:rPr>
+          <w:rFonts w:ascii="Arial" w:eastAsia="Yu Gothic" w:hAnsi="Arial"/>
+          <w:color w:val="5B6570"/>
+          <w:sz w:val="16"/>
+          <w:szCs w:val="16"/>
+        </w:rPr>
+        <w:t>）の値で、動画の比較画面も同じ値である。</w:t>
       </w:r>
     </w:p>
     <w:p>
@@ -5395,10 +6390,60 @@
           <w:b/>
           <w:bCs/>
         </w:rPr>
-        <w:t>比較は各条件 1 回のシミュレーションである。</w:t>
-      </w:r>
-      <w:r>
-        <w:t>一般的な優位性を証明するものではなく、Physical AI の一連の動作（予測 → 地点選択 → 自律巡回 → 検知 → 停止・退避 → 帰還）を示すデモである。今後は熊の配置と初期条件を変えて複数回評価する。</w:t>
+        <w:t>比較は各条件</w:t>
+      </w:r>
+      <w:r>
+        <w:rPr>
+          <w:b/>
+          <w:bCs/>
+        </w:rPr>
+        <w:t xml:space="preserve"> 1 </w:t>
+      </w:r>
+      <w:r>
+        <w:rPr>
+          <w:b/>
+          <w:bCs/>
+        </w:rPr>
+        <w:t>回のシミュレーションである。</w:t>
+      </w:r>
+      <w:r>
+        <w:t>一般的な優位性を証明するものではなく、</w:t>
+      </w:r>
+      <w:r>
+        <w:t xml:space="preserve">Physical AI </w:t>
+      </w:r>
+      <w:r>
+        <w:t>の一連の動作（予測</w:t>
+      </w:r>
+      <w:r>
+        <w:t xml:space="preserve"> → </w:t>
+      </w:r>
+      <w:r>
+        <w:t>地点選択</w:t>
+      </w:r>
+      <w:r>
+        <w:t xml:space="preserve"> → </w:t>
+      </w:r>
+      <w:r>
+        <w:t>自律巡回</w:t>
+      </w:r>
+      <w:r>
+        <w:t xml:space="preserve"> → </w:t>
+      </w:r>
+      <w:r>
+        <w:t>検知</w:t>
+      </w:r>
+      <w:r>
+        <w:t xml:space="preserve"> → </w:t>
+      </w:r>
+      <w:r>
+        <w:t>停止・退避</w:t>
+      </w:r>
+      <w:r>
+        <w:t xml:space="preserve"> → </w:t>
+      </w:r>
+      <w:r>
+        <w:t>帰還）を示すデモである。今後は熊の配置と初期条件を変えて複数回評価する。</w:t>
       </w:r>
     </w:p>
     <w:p>
@@ -5416,10 +6461,70 @@
           <w:b/>
           <w:bCs/>
         </w:rPr>
-        <w:t>固定ルートの 2 頭目は、P3 から P4 付近の熊を偶然検知したものである。</w:t>
-      </w:r>
-      <w:r>
-        <w:t>固定ルートは P4 を巡回対象にしていない。AI ルートは P4 を明示的な巡回対象として確認した。</w:t>
+        <w:t>固定ルートの</w:t>
+      </w:r>
+      <w:r>
+        <w:rPr>
+          <w:b/>
+          <w:bCs/>
+        </w:rPr>
+        <w:t xml:space="preserve"> 2 </w:t>
+      </w:r>
+      <w:r>
+        <w:rPr>
+          <w:b/>
+          <w:bCs/>
+        </w:rPr>
+        <w:t>頭目は、</w:t>
+      </w:r>
+      <w:r>
+        <w:rPr>
+          <w:b/>
+          <w:bCs/>
+        </w:rPr>
+        <w:t xml:space="preserve">P3 </w:t>
+      </w:r>
+      <w:r>
+        <w:rPr>
+          <w:b/>
+          <w:bCs/>
+        </w:rPr>
+        <w:t>から</w:t>
+      </w:r>
+      <w:r>
+        <w:rPr>
+          <w:b/>
+          <w:bCs/>
+        </w:rPr>
+        <w:t xml:space="preserve"> P4 </w:t>
+      </w:r>
+      <w:r>
+        <w:rPr>
+          <w:b/>
+          <w:bCs/>
+        </w:rPr>
+        <w:t>付近の熊を偶然検知したものである。</w:t>
+      </w:r>
+      <w:r>
+        <w:t>固定ルートは</w:t>
+      </w:r>
+      <w:r>
+        <w:t xml:space="preserve"> P4 </w:t>
+      </w:r>
+      <w:r>
+        <w:t>を巡回対象にしていない。</w:t>
+      </w:r>
+      <w:r>
+        <w:t xml:space="preserve">AI </w:t>
+      </w:r>
+      <w:r>
+        <w:t>ルートは</w:t>
+      </w:r>
+      <w:r>
+        <w:t xml:space="preserve"> P4 </w:t>
+      </w:r>
+      <w:r>
+        <w:t>を明示的な巡回対象として確認した。</w:t>
       </w:r>
     </w:p>
     <w:p>
@@ -5440,7 +6545,25 @@
         <w:t>退避経路の生成に失敗した場合、実運用では安全停止と管理者への通知を優先する。</w:t>
       </w:r>
       <w:r>
-        <w:t>本試作は P2 で巡回継続に遷移したが、これは今後修正すべき安全制御上の課題である（5・8 章）。</w:t>
+        <w:t>本試作は</w:t>
+      </w:r>
+      <w:r>
+        <w:t xml:space="preserve"> P2 </w:t>
+      </w:r>
+      <w:r>
+        <w:t>で巡回継続に遷移したが、これは今後修正すべき安全制御上の課題である（</w:t>
+      </w:r>
+      <w:r>
+        <w:t>5</w:t>
+      </w:r>
+      <w:r>
+        <w:t>・</w:t>
+      </w:r>
+      <w:r>
+        <w:t xml:space="preserve">8 </w:t>
+      </w:r>
+      <w:r>
+        <w:t>章）。</w:t>
       </w:r>
     </w:p>
     <w:p>
@@ -5449,7 +6572,97 @@
         <w:jc w:val="both"/>
       </w:pPr>
       <w:r>
-        <w:t>熊の発見数はどちらも 2 頭だが、その意味は異なる。AI 巡回は出没リスクが最も高い P4（ごみ集積所）を選び、P2・P4 の確認中に熊を検知した。固定巡回の 2 頭目は、P3（通学路）に着いたときに P4 付近の熊が偶然カメラの視野に入ったもので（3.2 m 先と判定、推定位置 (4.4, 1.8)）、AI 巡回の失敗を意味しない。AI 巡回が選んだ地点のリスク合計は 2.97 で、低リスクの P1 を含む固定巡回（2.33）より高い。移動距離と所要時間は同程度だった。</w:t>
+        <w:t>熊の発見数はどちらも</w:t>
+      </w:r>
+      <w:r>
+        <w:t xml:space="preserve"> 2 </w:t>
+      </w:r>
+      <w:r>
+        <w:t>頭だが、その意味は異なる。</w:t>
+      </w:r>
+      <w:r>
+        <w:t xml:space="preserve">AI </w:t>
+      </w:r>
+      <w:r>
+        <w:t>巡回は出没リスクが最も高い</w:t>
+      </w:r>
+      <w:r>
+        <w:t xml:space="preserve"> P4</w:t>
+      </w:r>
+      <w:r>
+        <w:t>（ごみ集積所）を選び、</w:t>
+      </w:r>
+      <w:r>
+        <w:t>P2</w:t>
+      </w:r>
+      <w:r>
+        <w:t>・</w:t>
+      </w:r>
+      <w:r>
+        <w:t xml:space="preserve">P4 </w:t>
+      </w:r>
+      <w:r>
+        <w:t>の確認中に熊を検知した。固定巡回の</w:t>
+      </w:r>
+      <w:r>
+        <w:t xml:space="preserve"> 2 </w:t>
+      </w:r>
+      <w:r>
+        <w:t>頭目は、</w:t>
+      </w:r>
+      <w:r>
+        <w:t>P3</w:t>
+      </w:r>
+      <w:r>
+        <w:t>（通学路）に着いたときに</w:t>
+      </w:r>
+      <w:r>
+        <w:t xml:space="preserve"> P4 </w:t>
+      </w:r>
+      <w:r>
+        <w:t>付近の熊が偶然カメラの視野に入ったもので（</w:t>
+      </w:r>
+      <w:r>
+        <w:t xml:space="preserve">3.2 m </w:t>
+      </w:r>
+      <w:r>
+        <w:t>先と判定、推定位置</w:t>
+      </w:r>
+      <w:r>
+        <w:t xml:space="preserve"> (4.4, 1.8)</w:t>
+      </w:r>
+      <w:r>
+        <w:t>）、</w:t>
+      </w:r>
+      <w:r>
+        <w:t xml:space="preserve">AI </w:t>
+      </w:r>
+      <w:r>
+        <w:t>巡回の失敗を意味しない。</w:t>
+      </w:r>
+      <w:r>
+        <w:t xml:space="preserve">AI </w:t>
+      </w:r>
+      <w:r>
+        <w:t>巡回が選んだ地点のリスク合計は</w:t>
+      </w:r>
+      <w:r>
+        <w:t xml:space="preserve"> 2.97 </w:t>
+      </w:r>
+      <w:r>
+        <w:t>で、低リスクの</w:t>
+      </w:r>
+      <w:r>
+        <w:t xml:space="preserve"> P1 </w:t>
+      </w:r>
+      <w:r>
+        <w:t>を含む固定巡回（</w:t>
+      </w:r>
+      <w:r>
+        <w:t>2.33</w:t>
+      </w:r>
+      <w:r>
+        <w:t>）より高い。移動距離と所要時間は同程度だった。</w:t>
       </w:r>
     </w:p>
     <w:p>
@@ -5458,7 +6671,43 @@
         <w:jc w:val="both"/>
       </w:pPr>
       <w:r>
-        <w:t>固定巡回の 1 回目は P2 で退避したあと経路計画が行き詰まり、帰還できなかった（熊 1 頭）。表は最後まで走行できた 2 回目の値である。距離は実行ログの値で、動画の比較画面も同じ値に統一した。なお 1 年を通した評価では、山形県で TTM は静的予測（過去の平均）に有意に劣る。</w:t>
+        <w:t>固定巡回の</w:t>
+      </w:r>
+      <w:r>
+        <w:t xml:space="preserve"> 1 </w:t>
+      </w:r>
+      <w:r>
+        <w:t>回目は</w:t>
+      </w:r>
+      <w:r>
+        <w:t xml:space="preserve"> P2 </w:t>
+      </w:r>
+      <w:r>
+        <w:t>で退避したあと経路計画が行き詰まり、帰還できなかった（熊</w:t>
+      </w:r>
+      <w:r>
+        <w:t xml:space="preserve"> 1 </w:t>
+      </w:r>
+      <w:r>
+        <w:t>頭）。表は最後まで走行できた</w:t>
+      </w:r>
+      <w:r>
+        <w:t xml:space="preserve"> 2 </w:t>
+      </w:r>
+      <w:r>
+        <w:t>回目の値である。距離は実行ログの値で、動画の比較画面も同じ値に統一した。なお</w:t>
+      </w:r>
+      <w:r>
+        <w:t xml:space="preserve"> 1 </w:t>
+      </w:r>
+      <w:r>
+        <w:t>年を通した評価では、山形県で</w:t>
+      </w:r>
+      <w:r>
+        <w:t xml:space="preserve"> TTM </w:t>
+      </w:r>
+      <w:r>
+        <w:t>は静的予測（過去の平均）に有意に劣る。</w:t>
       </w:r>
     </w:p>
     <w:p>
@@ -5473,7 +6722,13 @@
         <w:rPr>
           <w:color w:val="1F5F8B"/>
         </w:rPr>
-        <w:t>7　工夫した点</w:t>
+        <w:t>7</w:t>
+      </w:r>
+      <w:r>
+        <w:rPr>
+          <w:color w:val="1F5F8B"/>
+        </w:rPr>
+        <w:t xml:space="preserve">　工夫した点</w:t>
       </w:r>
     </w:p>
     <w:p>
@@ -5486,8 +6741,6 @@
         <w:spacing w:after="50" w:line="320" w:lineRule="auto"/>
         <w:jc w:val="both"/>
       </w:pPr>
-      <w:proofErr w:type="spellStart"/>
-      <w:proofErr w:type="spellEnd"/>
       <w:r>
         <w:rPr>
           <w:b/>
@@ -5496,7 +6749,28 @@
         <w:t>研究の予測をそのまま使う。</w:t>
       </w:r>
       <w:r>
-        <w:t>KumaWatch の TTM の実際の予測値を使い、実際に出没があったセルに熊を置いた。AI の空振り（P3）もあえて含めた。</w:t>
+        <w:t xml:space="preserve">KumaWatch </w:t>
+      </w:r>
+      <w:r>
+        <w:t>の</w:t>
+      </w:r>
+      <w:r>
+        <w:t xml:space="preserve"> TTM </w:t>
+      </w:r>
+      <w:r>
+        <w:t>の実際の予測値を使い、実際に出没があったセルに熊を置いた。</w:t>
+      </w:r>
+      <w:r>
+        <w:t xml:space="preserve">AI </w:t>
+      </w:r>
+      <w:r>
+        <w:t>の空振り（</w:t>
+      </w:r>
+      <w:r>
+        <w:t>P3</w:t>
+      </w:r>
+      <w:r>
+        <w:t>）もあえて含めた。</w:t>
       </w:r>
     </w:p>
     <w:p>
@@ -5538,7 +6812,19 @@
         <w:t>ラベル付けを自動化した追加学習。</w:t>
       </w:r>
       <w:r>
-        <w:t>熊の 3D 位置を画像へ投影して正解の枠を自動で作り、手作業なしで 700 枚を用意した。</w:t>
+        <w:t>熊の</w:t>
+      </w:r>
+      <w:r>
+        <w:t xml:space="preserve"> 3D </w:t>
+      </w:r>
+      <w:r>
+        <w:t>位置を画像へ投影して正解の枠を自動で作り、手作業なしで</w:t>
+      </w:r>
+      <w:r>
+        <w:t xml:space="preserve"> 700 </w:t>
+      </w:r>
+      <w:r>
+        <w:t>枚を用意した。</w:t>
       </w:r>
     </w:p>
     <w:p>
@@ -5559,7 +6845,19 @@
         <w:t>安全側の行動。</w:t>
       </w:r>
       <w:r>
-        <w:t>熊に近づかず 4 m 以内で停止・記録し、安全地点へ退避する。3 フレーム連続の検出で、誤検出による停止を防ぐ。</w:t>
+        <w:t>熊に近づかず</w:t>
+      </w:r>
+      <w:r>
+        <w:t xml:space="preserve"> 4 m </w:t>
+      </w:r>
+      <w:r>
+        <w:t>以内で停止・記録し、安全地点へ退避する。</w:t>
+      </w:r>
+      <w:r>
+        <w:t xml:space="preserve">3 </w:t>
+      </w:r>
+      <w:r>
+        <w:t>フレーム連続の検出で、誤検出による停止を防ぐ。</w:t>
       </w:r>
     </w:p>
     <w:p>
@@ -5577,7 +6875,21 @@
           <w:b/>
           <w:bCs/>
         </w:rPr>
-        <w:t>ワールドと地図を 1 つの定義から生成。</w:t>
+        <w:t>ワールドと地図を</w:t>
+      </w:r>
+      <w:r>
+        <w:rPr>
+          <w:b/>
+          <w:bCs/>
+        </w:rPr>
+        <w:t xml:space="preserve"> 1 </w:t>
+      </w:r>
+      <w:r>
+        <w:rPr>
+          <w:b/>
+          <w:bCs/>
+        </w:rPr>
+        <w:t>つの定義から生成。</w:t>
       </w:r>
       <w:r>
         <w:t>配置を変えても地図が一致する。自己位置推定のずれには、電柱やベンチを目印に加えて対処した。</w:t>
@@ -5595,7 +6907,13 @@
         <w:rPr>
           <w:color w:val="1F5F8B"/>
         </w:rPr>
-        <w:t>8　制約と今後の課題</w:t>
+        <w:t>8</w:t>
+      </w:r>
+      <w:r>
+        <w:rPr>
+          <w:color w:val="1F5F8B"/>
+        </w:rPr>
+        <w:t xml:space="preserve">　制約と今後の課題</w:t>
       </w:r>
     </w:p>
     <w:p>
@@ -5616,7 +6934,10 @@
         <w:t>シミュレーションの範囲。</w:t>
       </w:r>
       <w:r>
-        <w:t>Gazebo 内の模擬環境であり、実環境での自己位置推定・通信・天候は検証していない。</w:t>
+        <w:t xml:space="preserve">Gazebo </w:t>
+      </w:r>
+      <w:r>
+        <w:t>内の模擬環境であり、実環境での自己位置推定・通信・天候は検証していない。</w:t>
       </w:r>
     </w:p>
     <w:p>
@@ -5634,7 +6955,22 @@
           <w:b/>
           <w:bCs/>
         </w:rPr>
-        <w:t>熊判定は Gazebo の熊でのみ学習・評価した。</w:t>
+        <w:lastRenderedPageBreak/>
+        <w:t>熊判定は</w:t>
+      </w:r>
+      <w:r>
+        <w:rPr>
+          <w:b/>
+          <w:bCs/>
+        </w:rPr>
+        <w:t xml:space="preserve"> Gazebo </w:t>
+      </w:r>
+      <w:r>
+        <w:rPr>
+          <w:b/>
+          <w:bCs/>
+        </w:rPr>
+        <w:t>の熊でのみ学習・評価した。</w:t>
       </w:r>
       <w:r>
         <w:t>実物の熊の画像での精度は不明で、実運用には実画像での学習と評価が必要である。</w:t>
@@ -5658,7 +6994,28 @@
         <w:t>予測と地点の対応は説明用。</w:t>
       </w:r>
       <w:r>
-        <w:t>TTM の予測は 10 km セル単位で、町の中の 1 地点と同じ意味ではない。日付もシナリオのために選んだ 1 日である。</w:t>
+        <w:t xml:space="preserve">TTM </w:t>
+      </w:r>
+      <w:r>
+        <w:t>の予測は</w:t>
+      </w:r>
+      <w:r>
+        <w:t xml:space="preserve"> 10 km </w:t>
+      </w:r>
+      <w:r>
+        <w:t>セル単位で、町の中の</w:t>
+      </w:r>
+      <w:r>
+        <w:t xml:space="preserve"> 1 </w:t>
+      </w:r>
+      <w:r>
+        <w:t>地点と同じ意味ではない。日付もシナリオのために選んだ</w:t>
+      </w:r>
+      <w:r>
+        <w:t xml:space="preserve"> 1 </w:t>
+      </w:r>
+      <w:r>
+        <w:t>日である。</w:t>
       </w:r>
     </w:p>
     <w:p>
@@ -5700,7 +7057,13 @@
         <w:t>今後。</w:t>
       </w:r>
       <w:r>
-        <w:t>上記の安全制御の改修、カメラへの車体の映り込みの修正、GLM-Logit や静的予測との巡回結果の比較、熊の配置と初期条件を変えた複数回の評価を行う。</w:t>
+        <w:t>上記の安全制御の改修、カメラへの車体の映り込みの修正、</w:t>
+      </w:r>
+      <w:r>
+        <w:t xml:space="preserve">GLM-Logit </w:t>
+      </w:r>
+      <w:r>
+        <w:t>や静的予測との巡回結果の比較、熊の配置と初期条件を変えた複数回の評価を行う。</w:t>
       </w:r>
     </w:p>
     <w:p>
@@ -5715,7 +7078,13 @@
         <w:rPr>
           <w:color w:val="1F5F8B"/>
         </w:rPr>
-        <w:t>9　使用ソフトウェア・参考文献</w:t>
+        <w:t>9</w:t>
+      </w:r>
+      <w:r>
+        <w:rPr>
+          <w:color w:val="1F5F8B"/>
+        </w:rPr>
+        <w:t xml:space="preserve">　使用ソフトウェア・参考文献</w:t>
       </w:r>
     </w:p>
     <w:p>
@@ -5723,12 +7092,6 @@
         <w:spacing w:after="100"/>
         <w:jc w:val="both"/>
       </w:pPr>
-      <w:proofErr w:type="spellStart"/>
-      <w:proofErr w:type="spellEnd"/>
-      <w:proofErr w:type="spellStart"/>
-      <w:proofErr w:type="spellEnd"/>
-      <w:proofErr w:type="spellStart"/>
-      <w:proofErr w:type="spellEnd"/>
       <w:r>
         <w:rPr>
           <w:b/>
@@ -5742,7 +7105,126 @@
           <w:sz w:val="17"/>
           <w:szCs w:val="17"/>
         </w:rPr>
-        <w:t>Ubuntu 22.04、ROS 2 Humble、Gazebo Classic 11、Navigation2、TurtleBot3 / Happy Mini、Ultralytics YOLOv8。講義の Docker 環境で動作する。起動手順・使用データ・学習プログラムはリポジトリの README.md と training/ を参照。</w:t>
+        <w:t>Ubuntu 22.04</w:t>
+      </w:r>
+      <w:r>
+        <w:rPr>
+          <w:sz w:val="17"/>
+          <w:szCs w:val="17"/>
+        </w:rPr>
+        <w:t>、</w:t>
+      </w:r>
+      <w:r>
+        <w:rPr>
+          <w:sz w:val="17"/>
+          <w:szCs w:val="17"/>
+        </w:rPr>
+        <w:t>ROS 2 Humble</w:t>
+      </w:r>
+      <w:r>
+        <w:rPr>
+          <w:sz w:val="17"/>
+          <w:szCs w:val="17"/>
+        </w:rPr>
+        <w:t>、</w:t>
+      </w:r>
+      <w:r>
+        <w:rPr>
+          <w:sz w:val="17"/>
+          <w:szCs w:val="17"/>
+        </w:rPr>
+        <w:t>Gazebo Classic 11</w:t>
+      </w:r>
+      <w:r>
+        <w:rPr>
+          <w:sz w:val="17"/>
+          <w:szCs w:val="17"/>
+        </w:rPr>
+        <w:t>、</w:t>
+      </w:r>
+      <w:r>
+        <w:rPr>
+          <w:sz w:val="17"/>
+          <w:szCs w:val="17"/>
+        </w:rPr>
+        <w:t>Navigation2</w:t>
+      </w:r>
+      <w:r>
+        <w:rPr>
+          <w:sz w:val="17"/>
+          <w:szCs w:val="17"/>
+        </w:rPr>
+        <w:t>、</w:t>
+      </w:r>
+      <w:r>
+        <w:rPr>
+          <w:sz w:val="17"/>
+          <w:szCs w:val="17"/>
+        </w:rPr>
+        <w:t>TurtleBot3 / Happy Mini</w:t>
+      </w:r>
+      <w:r>
+        <w:rPr>
+          <w:sz w:val="17"/>
+          <w:szCs w:val="17"/>
+        </w:rPr>
+        <w:t>、</w:t>
+      </w:r>
+      <w:r>
+        <w:rPr>
+          <w:sz w:val="17"/>
+          <w:szCs w:val="17"/>
+        </w:rPr>
+        <w:t>Ultralytics YOLOv8</w:t>
+      </w:r>
+      <w:r>
+        <w:rPr>
+          <w:sz w:val="17"/>
+          <w:szCs w:val="17"/>
+        </w:rPr>
+        <w:t>。講義の</w:t>
+      </w:r>
+      <w:r>
+        <w:rPr>
+          <w:sz w:val="17"/>
+          <w:szCs w:val="17"/>
+        </w:rPr>
+        <w:t xml:space="preserve"> Docker </w:t>
+      </w:r>
+      <w:r>
+        <w:rPr>
+          <w:sz w:val="17"/>
+          <w:szCs w:val="17"/>
+        </w:rPr>
+        <w:t>環境で動作する。起動手順・使用データ・学習プログラムはリポジトリの</w:t>
+      </w:r>
+      <w:r>
+        <w:rPr>
+          <w:sz w:val="17"/>
+          <w:szCs w:val="17"/>
+        </w:rPr>
+        <w:t xml:space="preserve"> README.md </w:t>
+      </w:r>
+      <w:r>
+        <w:rPr>
+          <w:sz w:val="17"/>
+          <w:szCs w:val="17"/>
+        </w:rPr>
+        <w:t>と</w:t>
+      </w:r>
+      <w:r>
+        <w:rPr>
+          <w:sz w:val="17"/>
+          <w:szCs w:val="17"/>
+        </w:rPr>
+        <w:t xml:space="preserve"> training/ </w:t>
+      </w:r>
+      <w:r>
+        <w:rPr>
+          <w:sz w:val="17"/>
+          <w:szCs w:val="17"/>
+        </w:rPr>
+        <w:t>を参照。</w:t>
       </w:r>
     </w:p>
     <w:p>
@@ -5750,12 +7232,6 @@
         <w:spacing w:after="100"/>
         <w:jc w:val="both"/>
       </w:pPr>
-      <w:proofErr w:type="spellStart"/>
-      <w:proofErr w:type="spellEnd"/>
-      <w:proofErr w:type="spellStart"/>
-      <w:proofErr w:type="spellEnd"/>
-      <w:proofErr w:type="spellStart"/>
-      <w:proofErr w:type="spellEnd"/>
       <w:r>
         <w:rPr>
           <w:b/>
@@ -5769,7 +7245,224 @@
           <w:sz w:val="17"/>
           <w:szCs w:val="17"/>
         </w:rPr>
-        <w:t>KumaWatch [7]（事前計算済みの 5 地点のスコアのみ収録。元データ：山形県の公開出没データ、CC BY 4.0）、IBM Granite TinyTimeMixer（Apache-2.0）、Ultralytics YOLOv8（AGPL-3.0。追加学習した重みも同ライセンス）、ROS 2・Navigation2・Gazebo（Apache-2.0）、TurtleBot3 シミュレーション（ROBOTIS、Apache-2.0）、Happy Mini（AI ロボット入門）。熊・シカ・建物・樹木は基本図形で自作。</w:t>
+        <w:t>KumaWatch [7]</w:t>
+      </w:r>
+      <w:r>
+        <w:rPr>
+          <w:sz w:val="17"/>
+          <w:szCs w:val="17"/>
+        </w:rPr>
+        <w:t>（事前計算済みの</w:t>
+      </w:r>
+      <w:r>
+        <w:rPr>
+          <w:sz w:val="17"/>
+          <w:szCs w:val="17"/>
+        </w:rPr>
+        <w:t xml:space="preserve"> 5 </w:t>
+      </w:r>
+      <w:r>
+        <w:rPr>
+          <w:sz w:val="17"/>
+          <w:szCs w:val="17"/>
+        </w:rPr>
+        <w:t>地点のスコアのみ収録。元データ：山形県の公開出没データ、</w:t>
+      </w:r>
+      <w:r>
+        <w:rPr>
+          <w:sz w:val="17"/>
+          <w:szCs w:val="17"/>
+        </w:rPr>
+        <w:t>CC BY 4.0</w:t>
+      </w:r>
+      <w:r>
+        <w:rPr>
+          <w:sz w:val="17"/>
+          <w:szCs w:val="17"/>
+        </w:rPr>
+        <w:t>）、</w:t>
+      </w:r>
+      <w:r>
+        <w:rPr>
+          <w:sz w:val="17"/>
+          <w:szCs w:val="17"/>
+        </w:rPr>
+        <w:t>IBM Granite TinyTimeMixer</w:t>
+      </w:r>
+      <w:r>
+        <w:rPr>
+          <w:sz w:val="17"/>
+          <w:szCs w:val="17"/>
+        </w:rPr>
+        <w:t>（</w:t>
+      </w:r>
+      <w:r>
+        <w:rPr>
+          <w:sz w:val="17"/>
+          <w:szCs w:val="17"/>
+        </w:rPr>
+        <w:t>Apache-2.0</w:t>
+      </w:r>
+      <w:r>
+        <w:rPr>
+          <w:sz w:val="17"/>
+          <w:szCs w:val="17"/>
+        </w:rPr>
+        <w:t>）、</w:t>
+      </w:r>
+      <w:r>
+        <w:rPr>
+          <w:sz w:val="17"/>
+          <w:szCs w:val="17"/>
+        </w:rPr>
+        <w:t>Ultralytics YOLOv8</w:t>
+      </w:r>
+      <w:r>
+        <w:rPr>
+          <w:sz w:val="17"/>
+          <w:szCs w:val="17"/>
+        </w:rPr>
+        <w:t>（</w:t>
+      </w:r>
+      <w:r>
+        <w:rPr>
+          <w:sz w:val="17"/>
+          <w:szCs w:val="17"/>
+        </w:rPr>
+        <w:t>AGPL-3.0</w:t>
+      </w:r>
+      <w:r>
+        <w:rPr>
+          <w:sz w:val="17"/>
+          <w:szCs w:val="17"/>
+        </w:rPr>
+        <w:t>。追加学習した重みも同ライセンス）、</w:t>
+      </w:r>
+      <w:r>
+        <w:rPr>
+          <w:sz w:val="17"/>
+          <w:szCs w:val="17"/>
+        </w:rPr>
+        <w:t>ROS 2</w:t>
+      </w:r>
+      <w:r>
+        <w:rPr>
+          <w:sz w:val="17"/>
+          <w:szCs w:val="17"/>
+        </w:rPr>
+        <w:t>・</w:t>
+      </w:r>
+      <w:r>
+        <w:rPr>
+          <w:sz w:val="17"/>
+          <w:szCs w:val="17"/>
+        </w:rPr>
+        <w:t>Navigation2</w:t>
+      </w:r>
+      <w:r>
+        <w:rPr>
+          <w:sz w:val="17"/>
+          <w:szCs w:val="17"/>
+        </w:rPr>
+        <w:t>・</w:t>
+      </w:r>
+      <w:r>
+        <w:rPr>
+          <w:sz w:val="17"/>
+          <w:szCs w:val="17"/>
+        </w:rPr>
+        <w:t>Gazebo</w:t>
+      </w:r>
+      <w:r>
+        <w:rPr>
+          <w:sz w:val="17"/>
+          <w:szCs w:val="17"/>
+        </w:rPr>
+        <w:t>（</w:t>
+      </w:r>
+      <w:r>
+        <w:rPr>
+          <w:sz w:val="17"/>
+          <w:szCs w:val="17"/>
+        </w:rPr>
+        <w:t>Apache-2.0</w:t>
+      </w:r>
+      <w:r>
+        <w:rPr>
+          <w:sz w:val="17"/>
+          <w:szCs w:val="17"/>
+        </w:rPr>
+        <w:t>）、</w:t>
+      </w:r>
+      <w:r>
+        <w:rPr>
+          <w:sz w:val="17"/>
+          <w:szCs w:val="17"/>
+        </w:rPr>
+        <w:t xml:space="preserve">TurtleBot3 </w:t>
+      </w:r>
+      <w:r>
+        <w:rPr>
+          <w:sz w:val="17"/>
+          <w:szCs w:val="17"/>
+        </w:rPr>
+        <w:t>シミュレーション（</w:t>
+      </w:r>
+      <w:r>
+        <w:rPr>
+          <w:sz w:val="17"/>
+          <w:szCs w:val="17"/>
+        </w:rPr>
+        <w:t>ROBOTIS</w:t>
+      </w:r>
+      <w:r>
+        <w:rPr>
+          <w:sz w:val="17"/>
+          <w:szCs w:val="17"/>
+        </w:rPr>
+        <w:t>、</w:t>
+      </w:r>
+      <w:r>
+        <w:rPr>
+          <w:sz w:val="17"/>
+          <w:szCs w:val="17"/>
+        </w:rPr>
+        <w:t>Apache-2.0</w:t>
+      </w:r>
+      <w:r>
+        <w:rPr>
+          <w:sz w:val="17"/>
+          <w:szCs w:val="17"/>
+        </w:rPr>
+        <w:t>）、</w:t>
+      </w:r>
+      <w:r>
+        <w:rPr>
+          <w:sz w:val="17"/>
+          <w:szCs w:val="17"/>
+        </w:rPr>
+        <w:t>Happy Mini</w:t>
+      </w:r>
+      <w:r>
+        <w:rPr>
+          <w:sz w:val="17"/>
+          <w:szCs w:val="17"/>
+        </w:rPr>
+        <w:t>（</w:t>
+      </w:r>
+      <w:r>
+        <w:rPr>
+          <w:sz w:val="17"/>
+          <w:szCs w:val="17"/>
+        </w:rPr>
+        <w:t xml:space="preserve">AI </w:t>
+      </w:r>
+      <w:r>
+        <w:rPr>
+          <w:sz w:val="17"/>
+          <w:szCs w:val="17"/>
+        </w:rPr>
+        <w:t>ロボット入門）。熊・シカ・建物・樹木は基本図形で自作。</w:t>
       </w:r>
     </w:p>
     <w:p>
@@ -5777,8 +7470,6 @@
         <w:spacing w:after="100"/>
         <w:jc w:val="both"/>
       </w:pPr>
-      <w:proofErr w:type="spellStart"/>
-      <w:proofErr w:type="spellEnd"/>
       <w:r>
         <w:rPr>
           <w:b/>
@@ -5791,12 +7482,6 @@
         <w:spacing w:after="100"/>
         <w:jc w:val="both"/>
       </w:pPr>
-      <w:proofErr w:type="spellStart"/>
-      <w:proofErr w:type="spellEnd"/>
-      <w:proofErr w:type="spellStart"/>
-      <w:proofErr w:type="spellEnd"/>
-      <w:proofErr w:type="spellStart"/>
-      <w:proofErr w:type="spellEnd"/>
       <w:r>
         <w:rPr>
           <w:sz w:val="17"/>
@@ -5810,12 +7495,6 @@
         <w:spacing w:after="100"/>
         <w:jc w:val="both"/>
       </w:pPr>
-      <w:proofErr w:type="spellStart"/>
-      <w:proofErr w:type="spellEnd"/>
-      <w:proofErr w:type="spellStart"/>
-      <w:proofErr w:type="spellEnd"/>
-      <w:proofErr w:type="spellStart"/>
-      <w:proofErr w:type="spellEnd"/>
       <w:r>
         <w:rPr>
           <w:sz w:val="17"/>
@@ -5829,12 +7508,6 @@
         <w:spacing w:after="100"/>
         <w:jc w:val="both"/>
       </w:pPr>
-      <w:proofErr w:type="spellStart"/>
-      <w:proofErr w:type="spellEnd"/>
-      <w:proofErr w:type="spellStart"/>
-      <w:proofErr w:type="spellEnd"/>
-      <w:proofErr w:type="spellStart"/>
-      <w:proofErr w:type="spellEnd"/>
       <w:r>
         <w:rPr>
           <w:sz w:val="17"/>
@@ -5848,12 +7521,6 @@
         <w:spacing w:after="100"/>
         <w:jc w:val="both"/>
       </w:pPr>
-      <w:proofErr w:type="spellStart"/>
-      <w:proofErr w:type="spellEnd"/>
-      <w:proofErr w:type="spellStart"/>
-      <w:proofErr w:type="spellEnd"/>
-      <w:proofErr w:type="spellStart"/>
-      <w:proofErr w:type="spellEnd"/>
       <w:r>
         <w:rPr>
           <w:sz w:val="17"/>
@@ -5867,12 +7534,6 @@
         <w:spacing w:after="100"/>
         <w:jc w:val="both"/>
       </w:pPr>
-      <w:proofErr w:type="spellStart"/>
-      <w:proofErr w:type="spellEnd"/>
-      <w:proofErr w:type="spellStart"/>
-      <w:proofErr w:type="spellEnd"/>
-      <w:proofErr w:type="spellStart"/>
-      <w:proofErr w:type="spellEnd"/>
       <w:r>
         <w:rPr>
           <w:sz w:val="17"/>
@@ -5886,12 +7547,6 @@
         <w:spacing w:after="100"/>
         <w:jc w:val="both"/>
       </w:pPr>
-      <w:proofErr w:type="spellStart"/>
-      <w:proofErr w:type="spellEnd"/>
-      <w:proofErr w:type="spellStart"/>
-      <w:proofErr w:type="spellEnd"/>
-      <w:proofErr w:type="spellStart"/>
-      <w:proofErr w:type="spellEnd"/>
       <w:r>
         <w:rPr>
           <w:sz w:val="17"/>
@@ -5905,22 +7560,76 @@
         <w:spacing w:after="100"/>
         <w:jc w:val="both"/>
       </w:pPr>
-      <w:proofErr w:type="spellStart"/>
-      <w:proofErr w:type="spellEnd"/>
-      <w:proofErr w:type="spellStart"/>
-      <w:proofErr w:type="spellEnd"/>
-      <w:proofErr w:type="spellStart"/>
-      <w:proofErr w:type="spellEnd"/>
       <w:r>
         <w:rPr>
           <w:sz w:val="17"/>
           <w:szCs w:val="17"/>
         </w:rPr>
-        <w:t>[7] KumaWatch（熊出没リスク予測の研究。非公開の研究リポジトリ）.</w:t>
+        <w:t xml:space="preserve">[7] </w:t>
+      </w:r>
+      <w:proofErr w:type="spellStart"/>
+      <w:r>
+        <w:rPr>
+          <w:sz w:val="17"/>
+          <w:szCs w:val="17"/>
+        </w:rPr>
+        <w:t>KumaWatch</w:t>
+      </w:r>
+      <w:proofErr w:type="spellEnd"/>
+      <w:r>
+        <w:rPr>
+          <w:rFonts w:hint="eastAsia"/>
+          <w:sz w:val="17"/>
+          <w:szCs w:val="17"/>
+        </w:rPr>
+        <w:t xml:space="preserve">　“</w:t>
+      </w:r>
+      <w:r>
+        <w:rPr>
+          <w:sz w:val="17"/>
+          <w:szCs w:val="17"/>
+        </w:rPr>
+        <w:t>Benchmarking Wildlife Encounter Prediction for Municipal Decision Support in Northern Japan</w:t>
+      </w:r>
+      <w:r>
+        <w:rPr>
+          <w:rFonts w:hint="eastAsia"/>
+          <w:sz w:val="17"/>
+          <w:szCs w:val="17"/>
+        </w:rPr>
+        <w:t>,</w:t>
+      </w:r>
+      <w:r>
+        <w:rPr>
+          <w:rFonts w:hint="eastAsia"/>
+          <w:sz w:val="17"/>
+          <w:szCs w:val="17"/>
+        </w:rPr>
+        <w:t>”</w:t>
+      </w:r>
+      <w:r>
+        <w:t xml:space="preserve"> </w:t>
+      </w:r>
+      <w:r>
+        <w:rPr>
+          <w:sz w:val="17"/>
+          <w:szCs w:val="17"/>
+        </w:rPr>
+        <w:t>ACM SIGSPATIAL 2026, 2026.</w:t>
+      </w:r>
+      <w:r>
+        <w:t xml:space="preserve"> </w:t>
+      </w:r>
+      <w:r>
+        <w:rPr>
+          <w:sz w:val="17"/>
+          <w:szCs w:val="17"/>
+        </w:rPr>
+        <w:t>本作品では事前計算済み予測値を使用。</w:t>
       </w:r>
     </w:p>
     <w:sectPr>
-      <w:footerReference w:type="default" r:id="rId11"/>
+      <w:footerReference w:type="default" r:id="rId12"/>
       <w:pgSz w:w="11906" w:h="16838"/>
       <w:pgMar w:top="964" w:right="964" w:bottom="907" w:left="964" w:header="708" w:footer="454" w:gutter="0"/>
       <w:cols w:space="720"/>
@@ -5963,7 +7672,7 @@
     </w:pPr>
     <w:r>
       <w:rPr>
-        <w:rFonts w:ascii="Arial" w:eastAsia="游ゴシック" w:hAnsi="Arial"/>
+        <w:rFonts w:ascii="Arial" w:eastAsia="Yu Gothic" w:hAnsi="Arial"/>
         <w:color w:val="5B6570"/>
         <w:sz w:val="16"/>
         <w:szCs w:val="16"/>
@@ -5972,7 +7681,7 @@
     </w:r>
     <w:r>
       <w:rPr>
-        <w:rFonts w:ascii="Arial" w:eastAsia="游ゴシック" w:hAnsi="Arial"/>
+        <w:rFonts w:ascii="Arial" w:eastAsia="Yu Gothic" w:hAnsi="Arial"/>
         <w:color w:val="5B6570"/>
         <w:sz w:val="16"/>
         <w:szCs w:val="16"/>
@@ -5981,7 +7690,7 @@
     </w:r>
     <w:r>
       <w:rPr>
-        <w:rFonts w:ascii="Arial" w:eastAsia="游ゴシック" w:hAnsi="Arial"/>
+        <w:rFonts w:ascii="Arial" w:eastAsia="Yu Gothic" w:hAnsi="Arial"/>
         <w:color w:val="5B6570"/>
         <w:sz w:val="16"/>
         <w:szCs w:val="16"/>
@@ -5990,7 +7699,7 @@
     </w:r>
     <w:r>
       <w:rPr>
-        <w:rFonts w:ascii="Arial" w:eastAsia="游ゴシック" w:hAnsi="Arial"/>
+        <w:rFonts w:ascii="Arial" w:eastAsia="Yu Gothic" w:hAnsi="Arial"/>
         <w:noProof/>
         <w:color w:val="5B6570"/>
         <w:sz w:val="16"/>
@@ -6000,7 +7709,7 @@
     </w:r>
     <w:r>
       <w:rPr>
-        <w:rFonts w:ascii="Arial" w:eastAsia="游ゴシック" w:hAnsi="Arial"/>
+        <w:rFonts w:ascii="Arial" w:eastAsia="Yu Gothic" w:hAnsi="Arial"/>
         <w:color w:val="5B6570"/>
         <w:sz w:val="16"/>
         <w:szCs w:val="16"/>
@@ -6663,7 +8372,7 @@
       <w:outlineLvl w:val="0"/>
     </w:pPr>
     <w:rPr>
-      <w:rFonts w:ascii="Arial" w:eastAsia="游ゴシック" w:hAnsi="Arial"/>
+      <w:rFonts w:ascii="Arial" w:eastAsia="Yu Gothic" w:hAnsi="Arial"/>
       <w:b/>
       <w:bCs/>
       <w:color w:val="1D232A"/>
@@ -6683,7 +8392,7 @@
       <w:outlineLvl w:val="1"/>
     </w:pPr>
     <w:rPr>
-      <w:rFonts w:ascii="Arial" w:eastAsia="游ゴシック" w:hAnsi="Arial"/>
+      <w:rFonts w:ascii="Arial" w:eastAsia="Yu Gothic" w:hAnsi="Arial"/>
       <w:b/>
       <w:bCs/>
       <w:color w:val="1D232A"/>
@@ -6758,7 +8467,6 @@
   <w:style w:type="character" w:default="1" w:styleId="a0">
     <w:name w:val="Default Paragraph Font"/>
     <w:uiPriority w:val="1"/>
-    <w:semiHidden/>
     <w:unhideWhenUsed/>
   </w:style>
   <w:style w:type="table" w:default="1" w:styleId="a1">
@@ -6883,7 +8591,7 @@
     <w:uiPriority w:val="10"/>
     <w:qFormat/>
     <w:rPr>
-      <w:rFonts w:ascii="Arial" w:eastAsia="游ゴシック" w:hAnsi="Arial"/>
+      <w:rFonts w:ascii="Arial" w:eastAsia="Yu Gothic" w:hAnsi="Arial"/>
       <w:b/>
       <w:bCs/>
       <w:color w:val="1D232A"/>
@@ -7226,4 +8934,16 @@
   <a:objectDefaults/>
   <a:extraClrSchemeLst/>
 </a:theme>
+</file>
+
+<file path=customXml/item1.xml><?xml version="1.0" encoding="utf-8"?>
+<b:Sources xmlns:b="http://schemas.openxmlformats.org/officeDocument/2006/bibliography" xmlns="http://schemas.openxmlformats.org/officeDocument/2006/bibliography" SelectedStyle="\APASixthEditionOfficeOnline.xsl" StyleName="APA" Version="6"/>
+</file>
+
+<file path=customXml/itemProps1.xml><?xml version="1.0" encoding="utf-8"?>
+<ds:datastoreItem xmlns:ds="http://schemas.openxmlformats.org/officeDocument/2006/customXml" ds:itemID="{8FF2D16E-1FB5-430E-91C1-EE4130DAC6E8}">
+  <ds:schemaRefs>
+    <ds:schemaRef ds:uri="http://schemas.openxmlformats.org/officeDocument/2006/bibliography"/>
+  </ds:schemaRefs>
+</ds:datastoreItem>
 </file>
</xml_diff>

<commit_message>
Docs and report: SAFE_HOLD, KumaWatch wording, generative AI disclosure
- README (en/ja): state machine with SAFE_HOLD, operator topics, limitations and future work
- Reports (ja/en): neutral wording for KumaWatch, precomputed scores, note on SAFE_HOLD
  implemented after the recorded run, generative AI disclosure; English report URL fixed

Co-Authored-By: Claude Opus 5.5 <noreply@anthropic.com>
Claude-Session: https://claude.ai/code/session_01YJogxFoeR7kjEzVjnrNpLe
</commit_message>
<xml_diff>
--- a/docs/report/KumaWatch_Patrol_final_report.docx
+++ b/docs/report/KumaWatch_Patrol_final_report.docx
@@ -221,7 +221,7 @@
         <w:jc w:val="both"/>
       </w:pPr>
       <w:r>
-        <w:t>近年、熊の人里への出没が増え、自治体は通学路やごみ集積所などの見回りに追われている。しかし人員には限りがあり、「明日はどこを見に行くべきか」を限られた数だけ選ぶ必要がある。筆者らの研究</w:t>
+        <w:t>近年、熊の人里への出没が増え、自治体は通学路やごみ集積所などの見回りに追われている。しかし人員には限りがあり、「明日はどこを見に行くべきか」を限られた数だけ選ぶ必要がある。研究プロジェクト</w:t>
       </w:r>
       <w:r>
         <w:t xml:space="preserve"> </w:t>
@@ -1143,7 +1143,7 @@
         <w:t xml:space="preserve"> </w:t>
       </w:r>
       <w:r>
-        <w:t>が公開している</w:t>
+        <w:t>で事前計算された</w:t>
       </w:r>
       <w:r>
         <w:t xml:space="preserve"> </w:t>
@@ -1199,7 +1199,7 @@
         <w:t>）</w:t>
       </w:r>
       <w:r>
-        <w:t>の予測を使った。</w:t>
+        <w:t>の予測（5 地点分の値のみ同梱）を使った。</w:t>
       </w:r>
       <w:r>
         <w:t xml:space="preserve">TTM </w:t>
@@ -7036,7 +7036,7 @@
         <w:t>退避できない場合の安全制御。</w:t>
       </w:r>
       <w:r>
-        <w:t>熊の近くで通常の巡回に戻る現在の遷移は、安全設計として弱い。安全停止、代替退避地点の再探索、管理者への通知、人による判断までの待機に改める。</w:t>
+        <w:t>熊の近くで通常の巡回に戻る現在の遷移は、安全設計として弱い。安全停止、代替退避地点の再探索、管理者への通知、人による判断までの待機に改める。走行後、代替退避地点の再探索と安全停止（SAFE_HOLD：停止・通知・管理者の指示待ち）をリポジトリに実装した（簡易シミュレータで確認済み。Gazebo での再走行は今後）。</w:t>
       </w:r>
     </w:p>
     <w:p>
@@ -7057,7 +7057,7 @@
         <w:t>今後。</w:t>
       </w:r>
       <w:r>
-        <w:t>上記の安全制御の改修、カメラへの車体の映り込みの修正、</w:t>
+        <w:t>SAFE_HOLD を入れた状態での Gazebo の再走行、カメラへの車体の映り込みの修正、</w:t>
       </w:r>
       <w:r>
         <w:t xml:space="preserve">GLM-Logit </w:t>
@@ -7462,7 +7462,7 @@
           <w:sz w:val="17"/>
           <w:szCs w:val="17"/>
         </w:rPr>
-        <w:t>ロボット入門）。熊・シカ・建物・樹木は基本図形で自作。</w:t>
+        <w:t>ロボット入門）。熊・シカ・建物・樹木は基本図形で自作。コード・文書の作成には生成 AI（Anthropic の Claude）の支援を受け、課題の設計、講義の環境での走行、結果の確認は提出者が行った。</w:t>
       </w:r>
     </w:p>
     <w:p>

</xml_diff>

<commit_message>
Report and README: detection values as shown in the submission video
P2 bear: confidence 0.74, 3.4 m; P4 bear: confidence 0.81, 3.2 m
(the BEAR DETECTED panel while the robot is stopped).

Co-Authored-By: Claude Opus 5.5 <noreply@anthropic.com>
Claude-Session: https://claude.ai/code/session_01YJogxFoeR7kjEzVjnrNpLe
</commit_message>
<xml_diff>
--- a/docs/report/KumaWatch_Patrol_final_report.docx
+++ b/docs/report/KumaWatch_Patrol_final_report.docx
@@ -4571,13 +4571,13 @@
         <w:t>がカメラ画像から熊を検知した（信頼度</w:t>
       </w:r>
       <w:r>
-        <w:t xml:space="preserve"> 0.75</w:t>
+        <w:t xml:space="preserve"> 0.74</w:t>
       </w:r>
       <w:r>
         <w:t>、距離</w:t>
       </w:r>
       <w:r>
-        <w:t xml:space="preserve"> 4.0 m</w:t>
+        <w:t xml:space="preserve"> 3.4 m</w:t>
       </w:r>
       <w:r>
         <w:t>）。停止して位置・時刻・信頼度を</w:t>
@@ -4599,13 +4599,13 @@
         <w:t>頭目を検知し（信頼度</w:t>
       </w:r>
       <w:r>
-        <w:t xml:space="preserve"> 0.82</w:t>
+        <w:t xml:space="preserve"> 0.81</w:t>
       </w:r>
       <w:r>
         <w:t>、距離</w:t>
       </w:r>
       <w:r>
-        <w:t xml:space="preserve"> 3.9 m</w:t>
+        <w:t xml:space="preserve"> 3.2 m</w:t>
       </w:r>
       <w:r>
         <w:t>）、停止・記録のあと安全地点へ退避した。その後</w:t>
@@ -5859,7 +5859,7 @@
                 <w:sz w:val="16"/>
                 <w:szCs w:val="16"/>
               </w:rPr>
-              <w:t>0.75</w:t>
+              <w:t>0.74</w:t>
             </w:r>
             <w:r>
               <w:rPr>
@@ -5875,7 +5875,7 @@
                 <w:sz w:val="16"/>
                 <w:szCs w:val="16"/>
               </w:rPr>
-              <w:t>0.82</w:t>
+              <w:t>0.81</w:t>
             </w:r>
           </w:p>
         </w:tc>

</xml_diff>

<commit_message>
Revert "Report and README: detection values as shown in the submission video"
This reverts commit 9fce6c486199f013404be7f7c2a0563d6c6504ed.
</commit_message>
<xml_diff>
--- a/docs/report/KumaWatch_Patrol_final_report.docx
+++ b/docs/report/KumaWatch_Patrol_final_report.docx
@@ -4571,13 +4571,13 @@
         <w:t>がカメラ画像から熊を検知した（信頼度</w:t>
       </w:r>
       <w:r>
-        <w:t xml:space="preserve"> 0.74</w:t>
+        <w:t xml:space="preserve"> 0.75</w:t>
       </w:r>
       <w:r>
         <w:t>、距離</w:t>
       </w:r>
       <w:r>
-        <w:t xml:space="preserve"> 3.4 m</w:t>
+        <w:t xml:space="preserve"> 4.0 m</w:t>
       </w:r>
       <w:r>
         <w:t>）。停止して位置・時刻・信頼度を</w:t>
@@ -4599,13 +4599,13 @@
         <w:t>頭目を検知し（信頼度</w:t>
       </w:r>
       <w:r>
-        <w:t xml:space="preserve"> 0.81</w:t>
+        <w:t xml:space="preserve"> 0.82</w:t>
       </w:r>
       <w:r>
         <w:t>、距離</w:t>
       </w:r>
       <w:r>
-        <w:t xml:space="preserve"> 3.2 m</w:t>
+        <w:t xml:space="preserve"> 3.9 m</w:t>
       </w:r>
       <w:r>
         <w:t>）、停止・記録のあと安全地点へ退避した。その後</w:t>
@@ -5859,7 +5859,7 @@
                 <w:sz w:val="16"/>
                 <w:szCs w:val="16"/>
               </w:rPr>
-              <w:t>0.74</w:t>
+              <w:t>0.75</w:t>
             </w:r>
             <w:r>
               <w:rPr>
@@ -5875,7 +5875,7 @@
                 <w:sz w:val="16"/>
                 <w:szCs w:val="16"/>
               </w:rPr>
-              <w:t>0.81</w:t>
+              <w:t>0.82</w:t>
             </w:r>
           </w:p>
         </w:tc>

</xml_diff>